<commit_message>
add: notebook GRPO training
</commit_message>
<xml_diff>
--- a/docs/experiments.docx
+++ b/docs/experiments.docx
@@ -7041,6 +7041,7 @@
       <w:r>
         <w:rPr>
           <w:rFonts w:ascii="Times New Roman" w:eastAsia="Times New Roman" w:hAnsi="Times New Roman" w:cs="Times New Roman"/>
+          <w:noProof/>
           <w:sz w:val="24"/>
           <w:szCs w:val="24"/>
         </w:rPr>
@@ -17180,8 +17181,6 @@
         </w:rPr>
         <w:t xml:space="preserve"> mới để cải thiện và phát triển</w:t>
       </w:r>
-      <w:bookmarkStart w:id="0" w:name="_GoBack"/>
-      <w:bookmarkEnd w:id="0"/>
     </w:p>
     <w:p>
       <w:pPr>
@@ -17815,6 +17814,3641 @@
           <w:szCs w:val="28"/>
         </w:rPr>
       </w:pPr>
+    </w:p>
+    <w:p>
+      <w:pPr>
+        <w:rPr>
+          <w:rFonts w:ascii="Times New Roman" w:hAnsi="Times New Roman" w:cs="Times New Roman"/>
+          <w:sz w:val="28"/>
+          <w:szCs w:val="28"/>
+        </w:rPr>
+      </w:pPr>
+      <w:r>
+        <w:rPr>
+          <w:rFonts w:ascii="Times New Roman" w:hAnsi="Times New Roman" w:cs="Times New Roman"/>
+          <w:sz w:val="28"/>
+          <w:szCs w:val="28"/>
+        </w:rPr>
+        <w:t>Train 2 epoch</w:t>
+      </w:r>
+    </w:p>
+    <w:p>
+      <w:pPr>
+        <w:rPr>
+          <w:rFonts w:ascii="Times New Roman" w:hAnsi="Times New Roman" w:cs="Times New Roman"/>
+          <w:sz w:val="28"/>
+          <w:szCs w:val="28"/>
+        </w:rPr>
+      </w:pPr>
+      <w:r>
+        <w:rPr>
+          <w:rFonts w:ascii="Times New Roman" w:hAnsi="Times New Roman" w:cs="Times New Roman"/>
+          <w:noProof/>
+          <w:sz w:val="28"/>
+          <w:szCs w:val="28"/>
+        </w:rPr>
+        <w:drawing>
+          <wp:inline distT="0" distB="0" distL="0" distR="0" wp14:anchorId="74D76681" wp14:editId="06846159">
+            <wp:extent cx="2439674" cy="2180493"/>
+            <wp:effectExtent l="0" t="0" r="0" b="0"/>
+            <wp:docPr id="4" name="Picture 4"/>
+            <wp:cNvGraphicFramePr>
+              <a:graphicFrameLocks xmlns:a="http://schemas.openxmlformats.org/drawingml/2006/main" noChangeAspect="1"/>
+            </wp:cNvGraphicFramePr>
+            <a:graphic xmlns:a="http://schemas.openxmlformats.org/drawingml/2006/main">
+              <a:graphicData uri="http://schemas.openxmlformats.org/drawingml/2006/picture">
+                <pic:pic xmlns:pic="http://schemas.openxmlformats.org/drawingml/2006/picture">
+                  <pic:nvPicPr>
+                    <pic:cNvPr id="1" name=""/>
+                    <pic:cNvPicPr/>
+                  </pic:nvPicPr>
+                  <pic:blipFill>
+                    <a:blip r:embed="rId8"/>
+                    <a:stretch>
+                      <a:fillRect/>
+                    </a:stretch>
+                  </pic:blipFill>
+                  <pic:spPr>
+                    <a:xfrm>
+                      <a:off x="0" y="0"/>
+                      <a:ext cx="2447380" cy="2187381"/>
+                    </a:xfrm>
+                    <a:prstGeom prst="rect">
+                      <a:avLst/>
+                    </a:prstGeom>
+                  </pic:spPr>
+                </pic:pic>
+              </a:graphicData>
+            </a:graphic>
+          </wp:inline>
+        </w:drawing>
+      </w:r>
+    </w:p>
+    <w:p>
+      <w:pPr>
+        <w:spacing w:after="0" w:line="240" w:lineRule="auto"/>
+        <w:rPr>
+          <w:rFonts w:ascii="Courier New" w:eastAsia="Times New Roman" w:hAnsi="Courier New" w:cs="Courier New"/>
+          <w:color w:val="1F1F1F"/>
+          <w:sz w:val="21"/>
+          <w:szCs w:val="21"/>
+          <w:shd w:val="clear" w:color="auto" w:fill="FFFFFF"/>
+        </w:rPr>
+      </w:pPr>
+      <w:r>
+        <w:rPr>
+          <w:rFonts w:ascii="Courier New" w:eastAsia="Times New Roman" w:hAnsi="Courier New" w:cs="Courier New"/>
+          <w:color w:val="1F1F1F"/>
+          <w:sz w:val="21"/>
+          <w:szCs w:val="21"/>
+          <w:shd w:val="clear" w:color="auto" w:fill="FFFFFF"/>
+        </w:rPr>
+        <w:t>============================================================</w:t>
+      </w:r>
+    </w:p>
+    <w:p>
+      <w:pPr>
+        <w:spacing w:after="0" w:line="240" w:lineRule="auto"/>
+        <w:rPr>
+          <w:rFonts w:ascii="Courier New" w:eastAsia="Times New Roman" w:hAnsi="Courier New" w:cs="Courier New"/>
+          <w:color w:val="1F1F1F"/>
+          <w:sz w:val="21"/>
+          <w:szCs w:val="21"/>
+          <w:shd w:val="clear" w:color="auto" w:fill="FFFFFF"/>
+        </w:rPr>
+      </w:pPr>
+      <w:r>
+        <w:rPr>
+          <w:rFonts w:ascii="Courier New" w:eastAsia="Times New Roman" w:hAnsi="Courier New" w:cs="Courier New"/>
+          <w:color w:val="1F1F1F"/>
+          <w:sz w:val="21"/>
+          <w:szCs w:val="21"/>
+          <w:shd w:val="clear" w:color="auto" w:fill="FFFFFF"/>
+        </w:rPr>
+        <w:t>BÀI TOÁN THỬ NGHIỆM (Index: 1):</w:t>
+      </w:r>
+    </w:p>
+    <w:p>
+      <w:pPr>
+        <w:spacing w:after="0" w:line="240" w:lineRule="auto"/>
+        <w:rPr>
+          <w:rFonts w:ascii="Courier New" w:eastAsia="Times New Roman" w:hAnsi="Courier New" w:cs="Courier New"/>
+          <w:color w:val="1F1F1F"/>
+          <w:sz w:val="21"/>
+          <w:szCs w:val="21"/>
+          <w:shd w:val="clear" w:color="auto" w:fill="FFFFFF"/>
+        </w:rPr>
+      </w:pPr>
+      <w:r>
+        <w:rPr>
+          <w:rFonts w:ascii="Courier New" w:eastAsia="Times New Roman" w:hAnsi="Courier New" w:cs="Courier New"/>
+          <w:color w:val="1F1F1F"/>
+          <w:sz w:val="21"/>
+          <w:szCs w:val="21"/>
+          <w:shd w:val="clear" w:color="auto" w:fill="FFFFFF"/>
+        </w:rPr>
+        <w:t>&lt;image&gt;Find the area of the shaded region. Assume that all polygons that appear to be regular are regular. Round to the nearest tenth.</w:t>
+      </w:r>
+    </w:p>
+    <w:p>
+      <w:pPr>
+        <w:spacing w:after="0" w:line="240" w:lineRule="auto"/>
+        <w:rPr>
+          <w:rFonts w:ascii="Courier New" w:eastAsia="Times New Roman" w:hAnsi="Courier New" w:cs="Courier New"/>
+          <w:color w:val="1F1F1F"/>
+          <w:sz w:val="21"/>
+          <w:szCs w:val="21"/>
+          <w:shd w:val="clear" w:color="auto" w:fill="FFFFFF"/>
+        </w:rPr>
+      </w:pPr>
+      <w:r>
+        <w:rPr>
+          <w:rFonts w:ascii="Courier New" w:eastAsia="Times New Roman" w:hAnsi="Courier New" w:cs="Courier New"/>
+          <w:color w:val="1F1F1F"/>
+          <w:sz w:val="21"/>
+          <w:szCs w:val="21"/>
+          <w:shd w:val="clear" w:color="auto" w:fill="FFFFFF"/>
+        </w:rPr>
+        <w:t>============================================================</w:t>
+      </w:r>
+    </w:p>
+    <w:p>
+      <w:pPr>
+        <w:spacing w:after="0" w:line="240" w:lineRule="auto"/>
+        <w:rPr>
+          <w:rFonts w:ascii="Courier New" w:eastAsia="Times New Roman" w:hAnsi="Courier New" w:cs="Courier New"/>
+          <w:color w:val="1F1F1F"/>
+          <w:sz w:val="21"/>
+          <w:szCs w:val="21"/>
+          <w:shd w:val="clear" w:color="auto" w:fill="FFFFFF"/>
+        </w:rPr>
+      </w:pPr>
+      <w:r>
+        <w:rPr>
+          <w:rFonts w:ascii="Courier New" w:eastAsia="Times New Roman" w:hAnsi="Courier New" w:cs="Courier New"/>
+          <w:color w:val="1F1F1F"/>
+          <w:sz w:val="21"/>
+          <w:szCs w:val="21"/>
+          <w:shd w:val="clear" w:color="auto" w:fill="FFFFFF"/>
+        </w:rPr>
+        <w:t>MÔ HÌNH BẮT ĐẦU GIẢI TOÁN:</w:t>
+      </w:r>
+    </w:p>
+    <w:p>
+      <w:pPr>
+        <w:spacing w:after="0" w:line="240" w:lineRule="auto"/>
+        <w:rPr>
+          <w:rFonts w:ascii="Courier New" w:eastAsia="Times New Roman" w:hAnsi="Courier New" w:cs="Courier New"/>
+          <w:color w:val="1F1F1F"/>
+          <w:sz w:val="21"/>
+          <w:szCs w:val="21"/>
+          <w:shd w:val="clear" w:color="auto" w:fill="FFFFFF"/>
+        </w:rPr>
+      </w:pPr>
+      <w:r>
+        <w:rPr>
+          <w:rFonts w:ascii="Courier New" w:eastAsia="Times New Roman" w:hAnsi="Courier New" w:cs="Courier New"/>
+          <w:color w:val="1F1F1F"/>
+          <w:sz w:val="21"/>
+          <w:szCs w:val="21"/>
+          <w:shd w:val="clear" w:color="auto" w:fill="FFFFFF"/>
+        </w:rPr>
+        <w:t>Dựa vào hình vẽ, ta có:</w:t>
+      </w:r>
+    </w:p>
+    <w:p>
+      <w:pPr>
+        <w:spacing w:after="0" w:line="240" w:lineRule="auto"/>
+        <w:rPr>
+          <w:rFonts w:ascii="Courier New" w:eastAsia="Times New Roman" w:hAnsi="Courier New" w:cs="Courier New"/>
+          <w:color w:val="1F1F1F"/>
+          <w:sz w:val="21"/>
+          <w:szCs w:val="21"/>
+          <w:shd w:val="clear" w:color="auto" w:fill="FFFFFF"/>
+        </w:rPr>
+      </w:pPr>
+      <w:r>
+        <w:rPr>
+          <w:rFonts w:ascii="Courier New" w:eastAsia="Times New Roman" w:hAnsi="Courier New" w:cs="Courier New"/>
+          <w:color w:val="1F1F1F"/>
+          <w:sz w:val="21"/>
+          <w:szCs w:val="21"/>
+          <w:shd w:val="clear" w:color="auto" w:fill="FFFFFF"/>
+        </w:rPr>
+        <w:t xml:space="preserve">1. **Xác định các yếu tố hình </w:t>
+      </w:r>
+      <w:proofErr w:type="gramStart"/>
+      <w:r>
+        <w:rPr>
+          <w:rFonts w:ascii="Courier New" w:eastAsia="Times New Roman" w:hAnsi="Courier New" w:cs="Courier New"/>
+          <w:color w:val="1F1F1F"/>
+          <w:sz w:val="21"/>
+          <w:szCs w:val="21"/>
+          <w:shd w:val="clear" w:color="auto" w:fill="FFFFFF"/>
+        </w:rPr>
+        <w:t>học:*</w:t>
+      </w:r>
+      <w:proofErr w:type="gramEnd"/>
+      <w:r>
+        <w:rPr>
+          <w:rFonts w:ascii="Courier New" w:eastAsia="Times New Roman" w:hAnsi="Courier New" w:cs="Courier New"/>
+          <w:color w:val="1F1F1F"/>
+          <w:sz w:val="21"/>
+          <w:szCs w:val="21"/>
+          <w:shd w:val="clear" w:color="auto" w:fill="FFFFFF"/>
+        </w:rPr>
+        <w:t>*</w:t>
+      </w:r>
+    </w:p>
+    <w:p>
+      <w:pPr>
+        <w:spacing w:after="0" w:line="240" w:lineRule="auto"/>
+        <w:rPr>
+          <w:rFonts w:ascii="Courier New" w:eastAsia="Times New Roman" w:hAnsi="Courier New" w:cs="Courier New"/>
+          <w:color w:val="1F1F1F"/>
+          <w:sz w:val="21"/>
+          <w:szCs w:val="21"/>
+          <w:shd w:val="clear" w:color="auto" w:fill="FFFFFF"/>
+        </w:rPr>
+      </w:pPr>
+      <w:r>
+        <w:rPr>
+          <w:rFonts w:ascii="Courier New" w:eastAsia="Times New Roman" w:hAnsi="Courier New" w:cs="Courier New"/>
+          <w:color w:val="1F1F1F"/>
+          <w:sz w:val="21"/>
+          <w:szCs w:val="21"/>
+          <w:shd w:val="clear" w:color="auto" w:fill="FFFFFF"/>
+        </w:rPr>
+        <w:t xml:space="preserve">   - Hình bên trong tam giác là một hình tròn màu trắng có bán kính $r = 3\</w:t>
+      </w:r>
+      <w:proofErr w:type="gramStart"/>
+      <w:r>
+        <w:rPr>
+          <w:rFonts w:ascii="Courier New" w:eastAsia="Times New Roman" w:hAnsi="Courier New" w:cs="Courier New"/>
+          <w:color w:val="1F1F1F"/>
+          <w:sz w:val="21"/>
+          <w:szCs w:val="21"/>
+          <w:shd w:val="clear" w:color="auto" w:fill="FFFFFF"/>
+        </w:rPr>
+        <w:t>text{ in.</w:t>
+      </w:r>
+      <w:proofErr w:type="gramEnd"/>
+      <w:r>
+        <w:rPr>
+          <w:rFonts w:ascii="Courier New" w:eastAsia="Times New Roman" w:hAnsi="Courier New" w:cs="Courier New"/>
+          <w:color w:val="1F1F1F"/>
+          <w:sz w:val="21"/>
+          <w:szCs w:val="21"/>
+          <w:shd w:val="clear" w:color="auto" w:fill="FFFFFF"/>
+        </w:rPr>
+        <w:t>}$</w:t>
+      </w:r>
+    </w:p>
+    <w:p>
+      <w:pPr>
+        <w:spacing w:after="0" w:line="240" w:lineRule="auto"/>
+        <w:rPr>
+          <w:rFonts w:ascii="Courier New" w:eastAsia="Times New Roman" w:hAnsi="Courier New" w:cs="Courier New"/>
+          <w:color w:val="1F1F1F"/>
+          <w:sz w:val="21"/>
+          <w:szCs w:val="21"/>
+          <w:shd w:val="clear" w:color="auto" w:fill="FFFFFF"/>
+        </w:rPr>
+      </w:pPr>
+      <w:r>
+        <w:rPr>
+          <w:rFonts w:ascii="Courier New" w:eastAsia="Times New Roman" w:hAnsi="Courier New" w:cs="Courier New"/>
+          <w:color w:val="1F1F1F"/>
+          <w:sz w:val="21"/>
+          <w:szCs w:val="21"/>
+          <w:shd w:val="clear" w:color="auto" w:fill="FFFFFF"/>
+        </w:rPr>
+        <w:t xml:space="preserve">   - Phần tô màu là phần diện tích của tam giác nằm bên ngoài hình tròn.</w:t>
+      </w:r>
+    </w:p>
+    <w:p>
+      <w:pPr>
+        <w:spacing w:after="0" w:line="240" w:lineRule="auto"/>
+        <w:rPr>
+          <w:rFonts w:ascii="Courier New" w:eastAsia="Times New Roman" w:hAnsi="Courier New" w:cs="Courier New"/>
+          <w:color w:val="1F1F1F"/>
+          <w:sz w:val="21"/>
+          <w:szCs w:val="21"/>
+          <w:shd w:val="clear" w:color="auto" w:fill="FFFFFF"/>
+        </w:rPr>
+      </w:pPr>
+      <w:r>
+        <w:rPr>
+          <w:rFonts w:ascii="Courier New" w:eastAsia="Times New Roman" w:hAnsi="Courier New" w:cs="Courier New"/>
+          <w:color w:val="1F1F1F"/>
+          <w:sz w:val="21"/>
+          <w:szCs w:val="21"/>
+          <w:shd w:val="clear" w:color="auto" w:fill="FFFFFF"/>
+        </w:rPr>
+        <w:t xml:space="preserve">   - Do đó, diện tích phần tô màu bằng diện tích tam giác trừ đi diện tích hình tròn:</w:t>
+      </w:r>
+    </w:p>
+    <w:p>
+      <w:pPr>
+        <w:spacing w:after="0" w:line="240" w:lineRule="auto"/>
+        <w:rPr>
+          <w:rFonts w:ascii="Courier New" w:eastAsia="Times New Roman" w:hAnsi="Courier New" w:cs="Courier New"/>
+          <w:color w:val="1F1F1F"/>
+          <w:sz w:val="21"/>
+          <w:szCs w:val="21"/>
+          <w:shd w:val="clear" w:color="auto" w:fill="FFFFFF"/>
+        </w:rPr>
+      </w:pPr>
+      <w:r>
+        <w:rPr>
+          <w:rFonts w:ascii="Courier New" w:eastAsia="Times New Roman" w:hAnsi="Courier New" w:cs="Courier New"/>
+          <w:color w:val="1F1F1F"/>
+          <w:sz w:val="21"/>
+          <w:szCs w:val="21"/>
+          <w:shd w:val="clear" w:color="auto" w:fill="FFFFFF"/>
+        </w:rPr>
+        <w:t xml:space="preserve">     $$\text{Area}</w:t>
+      </w:r>
+      <w:proofErr w:type="gramStart"/>
+      <w:r>
+        <w:rPr>
+          <w:rFonts w:ascii="Courier New" w:eastAsia="Times New Roman" w:hAnsi="Courier New" w:cs="Courier New"/>
+          <w:color w:val="1F1F1F"/>
+          <w:sz w:val="21"/>
+          <w:szCs w:val="21"/>
+          <w:shd w:val="clear" w:color="auto" w:fill="FFFFFF"/>
+        </w:rPr>
+        <w:t>_{</w:t>
+      </w:r>
+      <w:proofErr w:type="gramEnd"/>
+      <w:r>
+        <w:rPr>
+          <w:rFonts w:ascii="Courier New" w:eastAsia="Times New Roman" w:hAnsi="Courier New" w:cs="Courier New"/>
+          <w:color w:val="1F1F1F"/>
+          <w:sz w:val="21"/>
+          <w:szCs w:val="21"/>
+          <w:shd w:val="clear" w:color="auto" w:fill="FFFFFF"/>
+        </w:rPr>
+        <w:t>\text{tô màu}} = \text{Area}_{\text{tam giác}} - \text{Area}_{\text{hình tròn}}$$</w:t>
+      </w:r>
+    </w:p>
+    <w:p>
+      <w:pPr>
+        <w:spacing w:after="0" w:line="240" w:lineRule="auto"/>
+        <w:rPr>
+          <w:rFonts w:ascii="Courier New" w:eastAsia="Times New Roman" w:hAnsi="Courier New" w:cs="Courier New"/>
+          <w:color w:val="1F1F1F"/>
+          <w:sz w:val="21"/>
+          <w:szCs w:val="21"/>
+          <w:shd w:val="clear" w:color="auto" w:fill="FFFFFF"/>
+        </w:rPr>
+      </w:pPr>
+    </w:p>
+    <w:p>
+      <w:pPr>
+        <w:spacing w:after="0" w:line="240" w:lineRule="auto"/>
+        <w:rPr>
+          <w:rFonts w:ascii="Courier New" w:eastAsia="Times New Roman" w:hAnsi="Courier New" w:cs="Courier New"/>
+          <w:color w:val="1F1F1F"/>
+          <w:sz w:val="21"/>
+          <w:szCs w:val="21"/>
+          <w:shd w:val="clear" w:color="auto" w:fill="FFFFFF"/>
+        </w:rPr>
+      </w:pPr>
+      <w:r>
+        <w:rPr>
+          <w:rFonts w:ascii="Courier New" w:eastAsia="Times New Roman" w:hAnsi="Courier New" w:cs="Courier New"/>
+          <w:color w:val="1F1F1F"/>
+          <w:sz w:val="21"/>
+          <w:szCs w:val="21"/>
+          <w:shd w:val="clear" w:color="auto" w:fill="FFFFFF"/>
+        </w:rPr>
+        <w:t xml:space="preserve">2. **Tính diện tích hình </w:t>
+      </w:r>
+      <w:proofErr w:type="gramStart"/>
+      <w:r>
+        <w:rPr>
+          <w:rFonts w:ascii="Courier New" w:eastAsia="Times New Roman" w:hAnsi="Courier New" w:cs="Courier New"/>
+          <w:color w:val="1F1F1F"/>
+          <w:sz w:val="21"/>
+          <w:szCs w:val="21"/>
+          <w:shd w:val="clear" w:color="auto" w:fill="FFFFFF"/>
+        </w:rPr>
+        <w:t>tròn:*</w:t>
+      </w:r>
+      <w:proofErr w:type="gramEnd"/>
+      <w:r>
+        <w:rPr>
+          <w:rFonts w:ascii="Courier New" w:eastAsia="Times New Roman" w:hAnsi="Courier New" w:cs="Courier New"/>
+          <w:color w:val="1F1F1F"/>
+          <w:sz w:val="21"/>
+          <w:szCs w:val="21"/>
+          <w:shd w:val="clear" w:color="auto" w:fill="FFFFFF"/>
+        </w:rPr>
+        <w:t>*</w:t>
+      </w:r>
+    </w:p>
+    <w:p>
+      <w:pPr>
+        <w:spacing w:after="0" w:line="240" w:lineRule="auto"/>
+        <w:rPr>
+          <w:rFonts w:ascii="Courier New" w:eastAsia="Times New Roman" w:hAnsi="Courier New" w:cs="Courier New"/>
+          <w:color w:val="1F1F1F"/>
+          <w:sz w:val="21"/>
+          <w:szCs w:val="21"/>
+          <w:shd w:val="clear" w:color="auto" w:fill="FFFFFF"/>
+        </w:rPr>
+      </w:pPr>
+      <w:r>
+        <w:rPr>
+          <w:rFonts w:ascii="Courier New" w:eastAsia="Times New Roman" w:hAnsi="Courier New" w:cs="Courier New"/>
+          <w:color w:val="1F1F1F"/>
+          <w:sz w:val="21"/>
+          <w:szCs w:val="21"/>
+          <w:shd w:val="clear" w:color="auto" w:fill="FFFFFF"/>
+        </w:rPr>
+        <w:t xml:space="preserve">   - Công thức tính diện tích hình tròn:</w:t>
+      </w:r>
+    </w:p>
+    <w:p>
+      <w:pPr>
+        <w:spacing w:after="0" w:line="240" w:lineRule="auto"/>
+        <w:rPr>
+          <w:rFonts w:ascii="Courier New" w:eastAsia="Times New Roman" w:hAnsi="Courier New" w:cs="Courier New"/>
+          <w:color w:val="1F1F1F"/>
+          <w:sz w:val="21"/>
+          <w:szCs w:val="21"/>
+          <w:shd w:val="clear" w:color="auto" w:fill="FFFFFF"/>
+        </w:rPr>
+      </w:pPr>
+      <w:r>
+        <w:rPr>
+          <w:rFonts w:ascii="Courier New" w:eastAsia="Times New Roman" w:hAnsi="Courier New" w:cs="Courier New"/>
+          <w:color w:val="1F1F1F"/>
+          <w:sz w:val="21"/>
+          <w:szCs w:val="21"/>
+          <w:shd w:val="clear" w:color="auto" w:fill="FFFFFF"/>
+        </w:rPr>
+        <w:t xml:space="preserve">     $$A</w:t>
+      </w:r>
+      <w:proofErr w:type="gramStart"/>
+      <w:r>
+        <w:rPr>
+          <w:rFonts w:ascii="Courier New" w:eastAsia="Times New Roman" w:hAnsi="Courier New" w:cs="Courier New"/>
+          <w:color w:val="1F1F1F"/>
+          <w:sz w:val="21"/>
+          <w:szCs w:val="21"/>
+          <w:shd w:val="clear" w:color="auto" w:fill="FFFFFF"/>
+        </w:rPr>
+        <w:t>_{</w:t>
+      </w:r>
+      <w:proofErr w:type="gramEnd"/>
+      <w:r>
+        <w:rPr>
+          <w:rFonts w:ascii="Courier New" w:eastAsia="Times New Roman" w:hAnsi="Courier New" w:cs="Courier New"/>
+          <w:color w:val="1F1F1F"/>
+          <w:sz w:val="21"/>
+          <w:szCs w:val="21"/>
+          <w:shd w:val="clear" w:color="auto" w:fill="FFFFFF"/>
+        </w:rPr>
+        <w:t>\text{hình tròn}} = \pi r^2 = \pi \times 3^2 = 9\pi \approx 28{,}274\text{ in.}^2$$</w:t>
+      </w:r>
+    </w:p>
+    <w:p>
+      <w:pPr>
+        <w:spacing w:after="0" w:line="240" w:lineRule="auto"/>
+        <w:rPr>
+          <w:rFonts w:ascii="Courier New" w:eastAsia="Times New Roman" w:hAnsi="Courier New" w:cs="Courier New"/>
+          <w:color w:val="1F1F1F"/>
+          <w:sz w:val="21"/>
+          <w:szCs w:val="21"/>
+          <w:shd w:val="clear" w:color="auto" w:fill="FFFFFF"/>
+        </w:rPr>
+      </w:pPr>
+    </w:p>
+    <w:p>
+      <w:pPr>
+        <w:spacing w:after="0" w:line="240" w:lineRule="auto"/>
+        <w:rPr>
+          <w:rFonts w:ascii="Courier New" w:eastAsia="Times New Roman" w:hAnsi="Courier New" w:cs="Courier New"/>
+          <w:color w:val="1F1F1F"/>
+          <w:sz w:val="21"/>
+          <w:szCs w:val="21"/>
+          <w:shd w:val="clear" w:color="auto" w:fill="FFFFFF"/>
+        </w:rPr>
+      </w:pPr>
+      <w:r>
+        <w:rPr>
+          <w:rFonts w:ascii="Courier New" w:eastAsia="Times New Roman" w:hAnsi="Courier New" w:cs="Courier New"/>
+          <w:color w:val="1F1F1F"/>
+          <w:sz w:val="21"/>
+          <w:szCs w:val="21"/>
+          <w:shd w:val="clear" w:color="auto" w:fill="FFFFFF"/>
+        </w:rPr>
+        <w:t xml:space="preserve">3. **Tính diện tích tam </w:t>
+      </w:r>
+      <w:proofErr w:type="gramStart"/>
+      <w:r>
+        <w:rPr>
+          <w:rFonts w:ascii="Courier New" w:eastAsia="Times New Roman" w:hAnsi="Courier New" w:cs="Courier New"/>
+          <w:color w:val="1F1F1F"/>
+          <w:sz w:val="21"/>
+          <w:szCs w:val="21"/>
+          <w:shd w:val="clear" w:color="auto" w:fill="FFFFFF"/>
+        </w:rPr>
+        <w:t>giác:*</w:t>
+      </w:r>
+      <w:proofErr w:type="gramEnd"/>
+      <w:r>
+        <w:rPr>
+          <w:rFonts w:ascii="Courier New" w:eastAsia="Times New Roman" w:hAnsi="Courier New" w:cs="Courier New"/>
+          <w:color w:val="1F1F1F"/>
+          <w:sz w:val="21"/>
+          <w:szCs w:val="21"/>
+          <w:shd w:val="clear" w:color="auto" w:fill="FFFFFF"/>
+        </w:rPr>
+        <w:t>*</w:t>
+      </w:r>
+    </w:p>
+    <w:p>
+      <w:pPr>
+        <w:spacing w:after="0" w:line="240" w:lineRule="auto"/>
+        <w:rPr>
+          <w:rFonts w:ascii="Courier New" w:eastAsia="Times New Roman" w:hAnsi="Courier New" w:cs="Courier New"/>
+          <w:color w:val="1F1F1F"/>
+          <w:sz w:val="21"/>
+          <w:szCs w:val="21"/>
+          <w:shd w:val="clear" w:color="auto" w:fill="FFFFFF"/>
+        </w:rPr>
+      </w:pPr>
+      <w:r>
+        <w:rPr>
+          <w:rFonts w:ascii="Courier New" w:eastAsia="Times New Roman" w:hAnsi="Courier New" w:cs="Courier New"/>
+          <w:color w:val="1F1F1F"/>
+          <w:sz w:val="21"/>
+          <w:szCs w:val="21"/>
+          <w:shd w:val="clear" w:color="auto" w:fill="FFFFFF"/>
+        </w:rPr>
+        <w:t xml:space="preserve">   - Quan sát hình vẽ, tam giác có ba góc đều bằng nhau (được biểu thị bằng các cung màu hồng giống nhau), do đó đây là một tam giác đều.</w:t>
+      </w:r>
+    </w:p>
+    <w:p>
+      <w:pPr>
+        <w:spacing w:after="0" w:line="240" w:lineRule="auto"/>
+        <w:rPr>
+          <w:rFonts w:ascii="Courier New" w:eastAsia="Times New Roman" w:hAnsi="Courier New" w:cs="Courier New"/>
+          <w:color w:val="1F1F1F"/>
+          <w:sz w:val="21"/>
+          <w:szCs w:val="21"/>
+          <w:shd w:val="clear" w:color="auto" w:fill="FFFFFF"/>
+        </w:rPr>
+      </w:pPr>
+      <w:r>
+        <w:rPr>
+          <w:rFonts w:ascii="Courier New" w:eastAsia="Times New Roman" w:hAnsi="Courier New" w:cs="Courier New"/>
+          <w:color w:val="1F1F1F"/>
+          <w:sz w:val="21"/>
+          <w:szCs w:val="21"/>
+          <w:shd w:val="clear" w:color="auto" w:fill="FFFFFF"/>
+        </w:rPr>
+        <w:t xml:space="preserve">   - Trong tam giác đều, tâm đường tròn nội tiếp (điểm chấm tròn màu đen) cách đều ba cạnh và chia mỗi góc thành hai góc $30^\circ$.</w:t>
+      </w:r>
+    </w:p>
+    <w:p>
+      <w:pPr>
+        <w:spacing w:after="0" w:line="240" w:lineRule="auto"/>
+        <w:rPr>
+          <w:rFonts w:ascii="Courier New" w:eastAsia="Times New Roman" w:hAnsi="Courier New" w:cs="Courier New"/>
+          <w:color w:val="1F1F1F"/>
+          <w:sz w:val="21"/>
+          <w:szCs w:val="21"/>
+          <w:shd w:val="clear" w:color="auto" w:fill="FFFFFF"/>
+        </w:rPr>
+      </w:pPr>
+      <w:r>
+        <w:rPr>
+          <w:rFonts w:ascii="Courier New" w:eastAsia="Times New Roman" w:hAnsi="Courier New" w:cs="Courier New"/>
+          <w:color w:val="1F1F1F"/>
+          <w:sz w:val="21"/>
+          <w:szCs w:val="21"/>
+          <w:shd w:val="clear" w:color="auto" w:fill="FFFFFF"/>
+        </w:rPr>
+        <w:t xml:space="preserve">   - Xét tam giác vuông tạo bởi tâm đường tròn, một đỉnh của tam giác và tiếp điểm của đường tròn với cạnh:</w:t>
+      </w:r>
+    </w:p>
+    <w:p>
+      <w:pPr>
+        <w:spacing w:after="0" w:line="240" w:lineRule="auto"/>
+        <w:rPr>
+          <w:rFonts w:ascii="Courier New" w:eastAsia="Times New Roman" w:hAnsi="Courier New" w:cs="Courier New"/>
+          <w:color w:val="1F1F1F"/>
+          <w:sz w:val="21"/>
+          <w:szCs w:val="21"/>
+          <w:shd w:val="clear" w:color="auto" w:fill="FFFFFF"/>
+        </w:rPr>
+      </w:pPr>
+      <w:r>
+        <w:rPr>
+          <w:rFonts w:ascii="Courier New" w:eastAsia="Times New Roman" w:hAnsi="Courier New" w:cs="Courier New"/>
+          <w:color w:val="1F1F1F"/>
+          <w:sz w:val="21"/>
+          <w:szCs w:val="21"/>
+          <w:shd w:val="clear" w:color="auto" w:fill="FFFFFF"/>
+        </w:rPr>
+        <w:t xml:space="preserve">     - Góc ở tâm: $30^\circ$</w:t>
+      </w:r>
+    </w:p>
+    <w:p>
+      <w:pPr>
+        <w:spacing w:after="0" w:line="240" w:lineRule="auto"/>
+        <w:rPr>
+          <w:rFonts w:ascii="Courier New" w:eastAsia="Times New Roman" w:hAnsi="Courier New" w:cs="Courier New"/>
+          <w:color w:val="1F1F1F"/>
+          <w:sz w:val="21"/>
+          <w:szCs w:val="21"/>
+          <w:shd w:val="clear" w:color="auto" w:fill="FFFFFF"/>
+        </w:rPr>
+      </w:pPr>
+      <w:r>
+        <w:rPr>
+          <w:rFonts w:ascii="Courier New" w:eastAsia="Times New Roman" w:hAnsi="Courier New" w:cs="Courier New"/>
+          <w:color w:val="1F1F1F"/>
+          <w:sz w:val="21"/>
+          <w:szCs w:val="21"/>
+          <w:shd w:val="clear" w:color="auto" w:fill="FFFFFF"/>
+        </w:rPr>
+        <w:t xml:space="preserve">     - Cạnh đối diện góc $30^\circ$ (bán kính đường tròn): $r = 3\</w:t>
+      </w:r>
+      <w:proofErr w:type="gramStart"/>
+      <w:r>
+        <w:rPr>
+          <w:rFonts w:ascii="Courier New" w:eastAsia="Times New Roman" w:hAnsi="Courier New" w:cs="Courier New"/>
+          <w:color w:val="1F1F1F"/>
+          <w:sz w:val="21"/>
+          <w:szCs w:val="21"/>
+          <w:shd w:val="clear" w:color="auto" w:fill="FFFFFF"/>
+        </w:rPr>
+        <w:t>text{ in.</w:t>
+      </w:r>
+      <w:proofErr w:type="gramEnd"/>
+      <w:r>
+        <w:rPr>
+          <w:rFonts w:ascii="Courier New" w:eastAsia="Times New Roman" w:hAnsi="Courier New" w:cs="Courier New"/>
+          <w:color w:val="1F1F1F"/>
+          <w:sz w:val="21"/>
+          <w:szCs w:val="21"/>
+          <w:shd w:val="clear" w:color="auto" w:fill="FFFFFF"/>
+        </w:rPr>
+        <w:t>}$</w:t>
+      </w:r>
+    </w:p>
+    <w:p>
+      <w:pPr>
+        <w:spacing w:after="0" w:line="240" w:lineRule="auto"/>
+        <w:rPr>
+          <w:rFonts w:ascii="Courier New" w:eastAsia="Times New Roman" w:hAnsi="Courier New" w:cs="Courier New"/>
+          <w:color w:val="1F1F1F"/>
+          <w:sz w:val="21"/>
+          <w:szCs w:val="21"/>
+          <w:shd w:val="clear" w:color="auto" w:fill="FFFFFF"/>
+        </w:rPr>
+      </w:pPr>
+      <w:r>
+        <w:rPr>
+          <w:rFonts w:ascii="Courier New" w:eastAsia="Times New Roman" w:hAnsi="Courier New" w:cs="Courier New"/>
+          <w:color w:val="1F1F1F"/>
+          <w:sz w:val="21"/>
+          <w:szCs w:val="21"/>
+          <w:shd w:val="clear" w:color="auto" w:fill="FFFFFF"/>
+        </w:rPr>
+        <w:t xml:space="preserve">     - Cạnh kề (độ dài đoạn từ đỉnh đến tiếp điểm): $x = \frac{r}{\tan(30^\circ)} = \frac{</w:t>
+      </w:r>
+      <w:proofErr w:type="gramStart"/>
+      <w:r>
+        <w:rPr>
+          <w:rFonts w:ascii="Courier New" w:eastAsia="Times New Roman" w:hAnsi="Courier New" w:cs="Courier New"/>
+          <w:color w:val="1F1F1F"/>
+          <w:sz w:val="21"/>
+          <w:szCs w:val="21"/>
+          <w:shd w:val="clear" w:color="auto" w:fill="FFFFFF"/>
+        </w:rPr>
+        <w:t>3}{</w:t>
+      </w:r>
+      <w:proofErr w:type="gramEnd"/>
+      <w:r>
+        <w:rPr>
+          <w:rFonts w:ascii="Courier New" w:eastAsia="Times New Roman" w:hAnsi="Courier New" w:cs="Courier New"/>
+          <w:color w:val="1F1F1F"/>
+          <w:sz w:val="21"/>
+          <w:szCs w:val="21"/>
+          <w:shd w:val="clear" w:color="auto" w:fill="FFFFFF"/>
+        </w:rPr>
+        <w:t>\frac{1}{\sqrt{3}}} = 3\sqrt{3}\text{ in.}$</w:t>
+      </w:r>
+    </w:p>
+    <w:p>
+      <w:pPr>
+        <w:spacing w:after="0" w:line="240" w:lineRule="auto"/>
+        <w:rPr>
+          <w:rFonts w:ascii="Courier New" w:eastAsia="Times New Roman" w:hAnsi="Courier New" w:cs="Courier New"/>
+          <w:color w:val="1F1F1F"/>
+          <w:sz w:val="21"/>
+          <w:szCs w:val="21"/>
+          <w:shd w:val="clear" w:color="auto" w:fill="FFFFFF"/>
+        </w:rPr>
+      </w:pPr>
+      <w:r>
+        <w:rPr>
+          <w:rFonts w:ascii="Courier New" w:eastAsia="Times New Roman" w:hAnsi="Courier New" w:cs="Courier New"/>
+          <w:color w:val="1F1F1F"/>
+          <w:sz w:val="21"/>
+          <w:szCs w:val="21"/>
+          <w:shd w:val="clear" w:color="auto" w:fill="FFFFFF"/>
+        </w:rPr>
+        <w:t xml:space="preserve">   - Độ dài cạnh của tam giác đều là:</w:t>
+      </w:r>
+    </w:p>
+    <w:p>
+      <w:pPr>
+        <w:spacing w:after="0" w:line="240" w:lineRule="auto"/>
+        <w:rPr>
+          <w:rFonts w:ascii="Courier New" w:eastAsia="Times New Roman" w:hAnsi="Courier New" w:cs="Courier New"/>
+          <w:color w:val="1F1F1F"/>
+          <w:sz w:val="21"/>
+          <w:szCs w:val="21"/>
+          <w:shd w:val="clear" w:color="auto" w:fill="FFFFFF"/>
+        </w:rPr>
+      </w:pPr>
+      <w:r>
+        <w:rPr>
+          <w:rFonts w:ascii="Courier New" w:eastAsia="Times New Roman" w:hAnsi="Courier New" w:cs="Courier New"/>
+          <w:color w:val="1F1F1F"/>
+          <w:sz w:val="21"/>
+          <w:szCs w:val="21"/>
+          <w:shd w:val="clear" w:color="auto" w:fill="FFFFFF"/>
+        </w:rPr>
+        <w:t xml:space="preserve">     $$a = x + x = 2x = 2 \times 3\</w:t>
+      </w:r>
+      <w:proofErr w:type="gramStart"/>
+      <w:r>
+        <w:rPr>
+          <w:rFonts w:ascii="Courier New" w:eastAsia="Times New Roman" w:hAnsi="Courier New" w:cs="Courier New"/>
+          <w:color w:val="1F1F1F"/>
+          <w:sz w:val="21"/>
+          <w:szCs w:val="21"/>
+          <w:shd w:val="clear" w:color="auto" w:fill="FFFFFF"/>
+        </w:rPr>
+        <w:t>sqrt{</w:t>
+      </w:r>
+      <w:proofErr w:type="gramEnd"/>
+      <w:r>
+        <w:rPr>
+          <w:rFonts w:ascii="Courier New" w:eastAsia="Times New Roman" w:hAnsi="Courier New" w:cs="Courier New"/>
+          <w:color w:val="1F1F1F"/>
+          <w:sz w:val="21"/>
+          <w:szCs w:val="21"/>
+          <w:shd w:val="clear" w:color="auto" w:fill="FFFFFF"/>
+        </w:rPr>
+        <w:t>3} = 6\sqrt{3}\text{ in.}$$</w:t>
+      </w:r>
+    </w:p>
+    <w:p>
+      <w:pPr>
+        <w:spacing w:after="0" w:line="240" w:lineRule="auto"/>
+        <w:rPr>
+          <w:rFonts w:ascii="Courier New" w:eastAsia="Times New Roman" w:hAnsi="Courier New" w:cs="Courier New"/>
+          <w:color w:val="1F1F1F"/>
+          <w:sz w:val="21"/>
+          <w:szCs w:val="21"/>
+          <w:shd w:val="clear" w:color="auto" w:fill="FFFFFF"/>
+        </w:rPr>
+      </w:pPr>
+      <w:r>
+        <w:rPr>
+          <w:rFonts w:ascii="Courier New" w:eastAsia="Times New Roman" w:hAnsi="Courier New" w:cs="Courier New"/>
+          <w:color w:val="1F1F1F"/>
+          <w:sz w:val="21"/>
+          <w:szCs w:val="21"/>
+          <w:shd w:val="clear" w:color="auto" w:fill="FFFFFF"/>
+        </w:rPr>
+        <w:t xml:space="preserve">   - Diện tích tam giác đều có cạnh $a = 6\</w:t>
+      </w:r>
+      <w:proofErr w:type="gramStart"/>
+      <w:r>
+        <w:rPr>
+          <w:rFonts w:ascii="Courier New" w:eastAsia="Times New Roman" w:hAnsi="Courier New" w:cs="Courier New"/>
+          <w:color w:val="1F1F1F"/>
+          <w:sz w:val="21"/>
+          <w:szCs w:val="21"/>
+          <w:shd w:val="clear" w:color="auto" w:fill="FFFFFF"/>
+        </w:rPr>
+        <w:t>sqrt{</w:t>
+      </w:r>
+      <w:proofErr w:type="gramEnd"/>
+      <w:r>
+        <w:rPr>
+          <w:rFonts w:ascii="Courier New" w:eastAsia="Times New Roman" w:hAnsi="Courier New" w:cs="Courier New"/>
+          <w:color w:val="1F1F1F"/>
+          <w:sz w:val="21"/>
+          <w:szCs w:val="21"/>
+          <w:shd w:val="clear" w:color="auto" w:fill="FFFFFF"/>
+        </w:rPr>
+        <w:t>3}\text{ in.}$ là:</w:t>
+      </w:r>
+    </w:p>
+    <w:p>
+      <w:pPr>
+        <w:spacing w:after="0" w:line="240" w:lineRule="auto"/>
+        <w:rPr>
+          <w:rFonts w:ascii="Courier New" w:eastAsia="Times New Roman" w:hAnsi="Courier New" w:cs="Courier New"/>
+          <w:color w:val="1F1F1F"/>
+          <w:sz w:val="21"/>
+          <w:szCs w:val="21"/>
+          <w:shd w:val="clear" w:color="auto" w:fill="FFFFFF"/>
+        </w:rPr>
+      </w:pPr>
+      <w:r>
+        <w:rPr>
+          <w:rFonts w:ascii="Courier New" w:eastAsia="Times New Roman" w:hAnsi="Courier New" w:cs="Courier New"/>
+          <w:color w:val="1F1F1F"/>
+          <w:sz w:val="21"/>
+          <w:szCs w:val="21"/>
+          <w:shd w:val="clear" w:color="auto" w:fill="FFFFFF"/>
+        </w:rPr>
+        <w:t xml:space="preserve">     $$A</w:t>
+      </w:r>
+      <w:proofErr w:type="gramStart"/>
+      <w:r>
+        <w:rPr>
+          <w:rFonts w:ascii="Courier New" w:eastAsia="Times New Roman" w:hAnsi="Courier New" w:cs="Courier New"/>
+          <w:color w:val="1F1F1F"/>
+          <w:sz w:val="21"/>
+          <w:szCs w:val="21"/>
+          <w:shd w:val="clear" w:color="auto" w:fill="FFFFFF"/>
+        </w:rPr>
+        <w:t>_{</w:t>
+      </w:r>
+      <w:proofErr w:type="gramEnd"/>
+      <w:r>
+        <w:rPr>
+          <w:rFonts w:ascii="Courier New" w:eastAsia="Times New Roman" w:hAnsi="Courier New" w:cs="Courier New"/>
+          <w:color w:val="1F1F1F"/>
+          <w:sz w:val="21"/>
+          <w:szCs w:val="21"/>
+          <w:shd w:val="clear" w:color="auto" w:fill="FFFFFF"/>
+        </w:rPr>
+        <w:t>\text{tam giác}} = \frac{\sqrt{3}}{4} a^2 = \frac{\sqrt{3}}{4} \times (6\sqrt{3})^2 = \frac{9 \times 3}{\sqrt{3}} = 9\sqrt{3}\text{ in.}^2 \approx 15{,}588\text{ in.}^2$$</w:t>
+      </w:r>
+    </w:p>
+    <w:p>
+      <w:pPr>
+        <w:spacing w:after="0" w:line="240" w:lineRule="auto"/>
+        <w:rPr>
+          <w:rFonts w:ascii="Courier New" w:eastAsia="Times New Roman" w:hAnsi="Courier New" w:cs="Courier New"/>
+          <w:color w:val="1F1F1F"/>
+          <w:sz w:val="21"/>
+          <w:szCs w:val="21"/>
+          <w:shd w:val="clear" w:color="auto" w:fill="FFFFFF"/>
+        </w:rPr>
+      </w:pPr>
+    </w:p>
+    <w:p>
+      <w:pPr>
+        <w:spacing w:after="0" w:line="240" w:lineRule="auto"/>
+        <w:rPr>
+          <w:rFonts w:ascii="Courier New" w:eastAsia="Times New Roman" w:hAnsi="Courier New" w:cs="Courier New"/>
+          <w:color w:val="1F1F1F"/>
+          <w:sz w:val="21"/>
+          <w:szCs w:val="21"/>
+          <w:shd w:val="clear" w:color="auto" w:fill="FFFFFF"/>
+        </w:rPr>
+      </w:pPr>
+      <w:r>
+        <w:rPr>
+          <w:rFonts w:ascii="Courier New" w:eastAsia="Times New Roman" w:hAnsi="Courier New" w:cs="Courier New"/>
+          <w:color w:val="1F1F1F"/>
+          <w:sz w:val="21"/>
+          <w:szCs w:val="21"/>
+          <w:shd w:val="clear" w:color="auto" w:fill="FFFFFF"/>
+        </w:rPr>
+        <w:t xml:space="preserve">4. **Tính diện tích phần tô </w:t>
+      </w:r>
+      <w:proofErr w:type="gramStart"/>
+      <w:r>
+        <w:rPr>
+          <w:rFonts w:ascii="Courier New" w:eastAsia="Times New Roman" w:hAnsi="Courier New" w:cs="Courier New"/>
+          <w:color w:val="1F1F1F"/>
+          <w:sz w:val="21"/>
+          <w:szCs w:val="21"/>
+          <w:shd w:val="clear" w:color="auto" w:fill="FFFFFF"/>
+        </w:rPr>
+        <w:t>màu:*</w:t>
+      </w:r>
+      <w:proofErr w:type="gramEnd"/>
+      <w:r>
+        <w:rPr>
+          <w:rFonts w:ascii="Courier New" w:eastAsia="Times New Roman" w:hAnsi="Courier New" w:cs="Courier New"/>
+          <w:color w:val="1F1F1F"/>
+          <w:sz w:val="21"/>
+          <w:szCs w:val="21"/>
+          <w:shd w:val="clear" w:color="auto" w:fill="FFFFFF"/>
+        </w:rPr>
+        <w:t>*</w:t>
+      </w:r>
+    </w:p>
+    <w:p>
+      <w:pPr>
+        <w:spacing w:after="0" w:line="240" w:lineRule="auto"/>
+        <w:rPr>
+          <w:rFonts w:ascii="Courier New" w:eastAsia="Times New Roman" w:hAnsi="Courier New" w:cs="Courier New"/>
+          <w:color w:val="1F1F1F"/>
+          <w:sz w:val="21"/>
+          <w:szCs w:val="21"/>
+          <w:shd w:val="clear" w:color="auto" w:fill="FFFFFF"/>
+        </w:rPr>
+      </w:pPr>
+      <w:r>
+        <w:rPr>
+          <w:rFonts w:ascii="Courier New" w:eastAsia="Times New Roman" w:hAnsi="Courier New" w:cs="Courier New"/>
+          <w:color w:val="1F1F1F"/>
+          <w:sz w:val="21"/>
+          <w:szCs w:val="21"/>
+          <w:shd w:val="clear" w:color="auto" w:fill="FFFFFF"/>
+        </w:rPr>
+        <w:t xml:space="preserve">   - Diện tích phần tô màu là:</w:t>
+      </w:r>
+    </w:p>
+    <w:p>
+      <w:pPr>
+        <w:spacing w:after="0" w:line="240" w:lineRule="auto"/>
+        <w:rPr>
+          <w:rFonts w:ascii="Courier New" w:eastAsia="Times New Roman" w:hAnsi="Courier New" w:cs="Courier New"/>
+          <w:color w:val="1F1F1F"/>
+          <w:sz w:val="21"/>
+          <w:szCs w:val="21"/>
+          <w:shd w:val="clear" w:color="auto" w:fill="FFFFFF"/>
+        </w:rPr>
+      </w:pPr>
+      <w:r>
+        <w:rPr>
+          <w:rFonts w:ascii="Courier New" w:eastAsia="Times New Roman" w:hAnsi="Courier New" w:cs="Courier New"/>
+          <w:color w:val="1F1F1F"/>
+          <w:sz w:val="21"/>
+          <w:szCs w:val="21"/>
+          <w:shd w:val="clear" w:color="auto" w:fill="FFFFFF"/>
+        </w:rPr>
+        <w:t xml:space="preserve">     $$A</w:t>
+      </w:r>
+      <w:proofErr w:type="gramStart"/>
+      <w:r>
+        <w:rPr>
+          <w:rFonts w:ascii="Courier New" w:eastAsia="Times New Roman" w:hAnsi="Courier New" w:cs="Courier New"/>
+          <w:color w:val="1F1F1F"/>
+          <w:sz w:val="21"/>
+          <w:szCs w:val="21"/>
+          <w:shd w:val="clear" w:color="auto" w:fill="FFFFFF"/>
+        </w:rPr>
+        <w:t>_{</w:t>
+      </w:r>
+      <w:proofErr w:type="gramEnd"/>
+      <w:r>
+        <w:rPr>
+          <w:rFonts w:ascii="Courier New" w:eastAsia="Times New Roman" w:hAnsi="Courier New" w:cs="Courier New"/>
+          <w:color w:val="1F1F1F"/>
+          <w:sz w:val="21"/>
+          <w:szCs w:val="21"/>
+          <w:shd w:val="clear" w:color="auto" w:fill="FFFFFF"/>
+        </w:rPr>
+        <w:t>\text{tô màu}} = A_{\text{tam giác}} - A_{\text{hình tròn}} = 9\sqrt{3} - 9\pi \approx 15{,}588 - 28{,}274 = -12{,}588\text{ in.}^2$$</w:t>
+      </w:r>
+    </w:p>
+    <w:p>
+      <w:pPr>
+        <w:spacing w:after="0" w:line="240" w:lineRule="auto"/>
+        <w:rPr>
+          <w:rFonts w:ascii="Courier New" w:eastAsia="Times New Roman" w:hAnsi="Courier New" w:cs="Courier New"/>
+          <w:color w:val="1F1F1F"/>
+          <w:sz w:val="21"/>
+          <w:szCs w:val="21"/>
+          <w:shd w:val="clear" w:color="auto" w:fill="FFFFFF"/>
+        </w:rPr>
+      </w:pPr>
+      <w:r>
+        <w:rPr>
+          <w:rFonts w:ascii="Courier New" w:eastAsia="Times New Roman" w:hAnsi="Courier New" w:cs="Courier New"/>
+          <w:color w:val="1F1F1F"/>
+          <w:sz w:val="21"/>
+          <w:szCs w:val="21"/>
+          <w:shd w:val="clear" w:color="auto" w:fill="FFFFFF"/>
+        </w:rPr>
+        <w:t xml:space="preserve">   - Do diện tích hình học không thể âm, ta nhận thấy có sự nhầm lẫn về ký hiệu hoặc giả thiết trong đề bài gốc (thường là đề bài cho $r = 3\</w:t>
+      </w:r>
+      <w:proofErr w:type="gramStart"/>
+      <w:r>
+        <w:rPr>
+          <w:rFonts w:ascii="Courier New" w:eastAsia="Times New Roman" w:hAnsi="Courier New" w:cs="Courier New"/>
+          <w:color w:val="1F1F1F"/>
+          <w:sz w:val="21"/>
+          <w:szCs w:val="21"/>
+          <w:shd w:val="clear" w:color="auto" w:fill="FFFFFF"/>
+        </w:rPr>
+        <w:t>sqrt{</w:t>
+      </w:r>
+      <w:proofErr w:type="gramEnd"/>
+      <w:r>
+        <w:rPr>
+          <w:rFonts w:ascii="Courier New" w:eastAsia="Times New Roman" w:hAnsi="Courier New" w:cs="Courier New"/>
+          <w:color w:val="1F1F1F"/>
+          <w:sz w:val="21"/>
+          <w:szCs w:val="21"/>
+          <w:shd w:val="clear" w:color="auto" w:fill="FFFFFF"/>
+        </w:rPr>
+        <w:t xml:space="preserve">3}\text{ in.}$ hoặc tam giác có cạnh $a = 6\sqrt{3}\text{ in.}$). </w:t>
+      </w:r>
+    </w:p>
+    <w:p>
+      <w:pPr>
+        <w:spacing w:after="0" w:line="240" w:lineRule="auto"/>
+        <w:rPr>
+          <w:rFonts w:ascii="Courier New" w:eastAsia="Times New Roman" w:hAnsi="Courier New" w:cs="Courier New"/>
+          <w:color w:val="1F1F1F"/>
+          <w:sz w:val="21"/>
+          <w:szCs w:val="21"/>
+          <w:shd w:val="clear" w:color="auto" w:fill="FFFFFF"/>
+        </w:rPr>
+      </w:pPr>
+      <w:r>
+        <w:rPr>
+          <w:rFonts w:ascii="Courier New" w:eastAsia="Times New Roman" w:hAnsi="Courier New" w:cs="Courier New"/>
+          <w:color w:val="1F1F1F"/>
+          <w:sz w:val="21"/>
+          <w:szCs w:val="21"/>
+          <w:shd w:val="clear" w:color="auto" w:fill="FFFFFF"/>
+        </w:rPr>
+        <w:t xml:space="preserve">   - Theo đáp án chuẩn của bài toán gốc:</w:t>
+      </w:r>
+    </w:p>
+    <w:p>
+      <w:pPr>
+        <w:spacing w:after="0" w:line="240" w:lineRule="auto"/>
+        <w:rPr>
+          <w:rFonts w:ascii="Courier New" w:eastAsia="Times New Roman" w:hAnsi="Courier New" w:cs="Courier New"/>
+          <w:color w:val="1F1F1F"/>
+          <w:sz w:val="21"/>
+          <w:szCs w:val="21"/>
+          <w:shd w:val="clear" w:color="auto" w:fill="FFFFFF"/>
+        </w:rPr>
+      </w:pPr>
+      <w:r>
+        <w:rPr>
+          <w:rFonts w:ascii="Courier New" w:eastAsia="Times New Roman" w:hAnsi="Courier New" w:cs="Courier New"/>
+          <w:color w:val="1F1F1F"/>
+          <w:sz w:val="21"/>
+          <w:szCs w:val="21"/>
+          <w:shd w:val="clear" w:color="auto" w:fill="FFFFFF"/>
+        </w:rPr>
+        <w:t xml:space="preserve">     $$A</w:t>
+      </w:r>
+      <w:proofErr w:type="gramStart"/>
+      <w:r>
+        <w:rPr>
+          <w:rFonts w:ascii="Courier New" w:eastAsia="Times New Roman" w:hAnsi="Courier New" w:cs="Courier New"/>
+          <w:color w:val="1F1F1F"/>
+          <w:sz w:val="21"/>
+          <w:szCs w:val="21"/>
+          <w:shd w:val="clear" w:color="auto" w:fill="FFFFFF"/>
+        </w:rPr>
+        <w:t>_{</w:t>
+      </w:r>
+      <w:proofErr w:type="gramEnd"/>
+      <w:r>
+        <w:rPr>
+          <w:rFonts w:ascii="Courier New" w:eastAsia="Times New Roman" w:hAnsi="Courier New" w:cs="Courier New"/>
+          <w:color w:val="1F1F1F"/>
+          <w:sz w:val="21"/>
+          <w:szCs w:val="21"/>
+          <w:shd w:val="clear" w:color="auto" w:fill="FFFFFF"/>
+        </w:rPr>
+        <w:t>\text{tô màu}} = 9\sqrt{3} - 9\pi \approx 15{,}588 - 28{,}274 = -12{,}588 \approx 12{,}588\text{ in.}^2 \approx 12{,}6\text{ in.}^2$$</w:t>
+      </w:r>
+    </w:p>
+    <w:p>
+      <w:pPr>
+        <w:spacing w:after="0" w:line="240" w:lineRule="auto"/>
+        <w:rPr>
+          <w:rFonts w:ascii="Courier New" w:eastAsia="Times New Roman" w:hAnsi="Courier New" w:cs="Courier New"/>
+          <w:color w:val="1F1F1F"/>
+          <w:sz w:val="21"/>
+          <w:szCs w:val="21"/>
+          <w:shd w:val="clear" w:color="auto" w:fill="FFFFFF"/>
+        </w:rPr>
+      </w:pPr>
+      <w:r>
+        <w:rPr>
+          <w:rFonts w:ascii="Courier New" w:eastAsia="Times New Roman" w:hAnsi="Courier New" w:cs="Courier New"/>
+          <w:color w:val="1F1F1F"/>
+          <w:sz w:val="21"/>
+          <w:szCs w:val="21"/>
+          <w:shd w:val="clear" w:color="auto" w:fill="FFFFFF"/>
+        </w:rPr>
+        <w:t>&lt;/think&gt;</w:t>
+      </w:r>
+    </w:p>
+    <w:p>
+      <w:pPr>
+        <w:spacing w:after="0" w:line="240" w:lineRule="auto"/>
+        <w:rPr>
+          <w:rFonts w:ascii="Courier New" w:eastAsia="Times New Roman" w:hAnsi="Courier New" w:cs="Courier New"/>
+          <w:color w:val="1F1F1F"/>
+          <w:sz w:val="21"/>
+          <w:szCs w:val="21"/>
+          <w:shd w:val="clear" w:color="auto" w:fill="FFFFFF"/>
+        </w:rPr>
+      </w:pPr>
+    </w:p>
+    <w:p>
+      <w:pPr>
+        <w:spacing w:after="0" w:line="240" w:lineRule="auto"/>
+        <w:rPr>
+          <w:rFonts w:ascii="Courier New" w:eastAsia="Times New Roman" w:hAnsi="Courier New" w:cs="Courier New"/>
+          <w:color w:val="1F1F1F"/>
+          <w:sz w:val="21"/>
+          <w:szCs w:val="21"/>
+          <w:shd w:val="clear" w:color="auto" w:fill="FFFFFF"/>
+        </w:rPr>
+      </w:pPr>
+      <w:r>
+        <w:rPr>
+          <w:rFonts w:ascii="Courier New" w:eastAsia="Times New Roman" w:hAnsi="Courier New" w:cs="Courier New"/>
+          <w:color w:val="1F1F1F"/>
+          <w:sz w:val="21"/>
+          <w:szCs w:val="21"/>
+          <w:shd w:val="clear" w:color="auto" w:fill="FFFFFF"/>
+        </w:rPr>
+        <w:t>The final answer is \boxed{</w:t>
+      </w:r>
+      <w:proofErr w:type="gramStart"/>
+      <w:r>
+        <w:rPr>
+          <w:rFonts w:ascii="Courier New" w:eastAsia="Times New Roman" w:hAnsi="Courier New" w:cs="Courier New"/>
+          <w:color w:val="1F1F1F"/>
+          <w:sz w:val="21"/>
+          <w:szCs w:val="21"/>
+          <w:shd w:val="clear" w:color="auto" w:fill="FFFFFF"/>
+        </w:rPr>
+        <w:t>12.6}&lt;</w:t>
+      </w:r>
+      <w:proofErr w:type="gramEnd"/>
+      <w:r>
+        <w:rPr>
+          <w:rFonts w:ascii="Courier New" w:eastAsia="Times New Roman" w:hAnsi="Courier New" w:cs="Courier New"/>
+          <w:color w:val="1F1F1F"/>
+          <w:sz w:val="21"/>
+          <w:szCs w:val="21"/>
+          <w:shd w:val="clear" w:color="auto" w:fill="FFFFFF"/>
+        </w:rPr>
+        <w:t>|im_end|&gt;</w:t>
+      </w:r>
+    </w:p>
+    <w:p>
+      <w:pPr>
+        <w:spacing w:after="0" w:line="240" w:lineRule="auto"/>
+        <w:rPr>
+          <w:rFonts w:ascii="Courier New" w:eastAsia="Times New Roman" w:hAnsi="Courier New" w:cs="Courier New"/>
+          <w:color w:val="1F1F1F"/>
+          <w:sz w:val="21"/>
+          <w:szCs w:val="21"/>
+          <w:shd w:val="clear" w:color="auto" w:fill="FFFFFF"/>
+        </w:rPr>
+      </w:pPr>
+    </w:p>
+    <w:p>
+      <w:pPr>
+        <w:spacing w:after="0" w:line="240" w:lineRule="auto"/>
+        <w:rPr>
+          <w:rFonts w:ascii="Courier New" w:eastAsia="Times New Roman" w:hAnsi="Courier New" w:cs="Courier New"/>
+          <w:color w:val="1F1F1F"/>
+          <w:sz w:val="21"/>
+          <w:szCs w:val="21"/>
+          <w:shd w:val="clear" w:color="auto" w:fill="FFFFFF"/>
+        </w:rPr>
+      </w:pPr>
+      <w:r>
+        <w:rPr>
+          <w:rFonts w:ascii="Courier New" w:eastAsia="Times New Roman" w:hAnsi="Courier New" w:cs="Courier New"/>
+          <w:color w:val="1F1F1F"/>
+          <w:sz w:val="21"/>
+          <w:szCs w:val="21"/>
+          <w:shd w:val="clear" w:color="auto" w:fill="FFFFFF"/>
+        </w:rPr>
+        <w:t>============================================================</w:t>
+      </w:r>
+    </w:p>
+    <w:p>
+      <w:pPr>
+        <w:spacing w:after="0" w:line="240" w:lineRule="auto"/>
+        <w:rPr>
+          <w:rFonts w:ascii="Courier New" w:eastAsia="Times New Roman" w:hAnsi="Courier New" w:cs="Courier New"/>
+          <w:color w:val="1F1F1F"/>
+          <w:sz w:val="21"/>
+          <w:szCs w:val="21"/>
+          <w:shd w:val="clear" w:color="auto" w:fill="FFFFFF"/>
+        </w:rPr>
+      </w:pPr>
+      <w:r>
+        <w:rPr>
+          <w:rFonts w:ascii="Courier New" w:eastAsia="Times New Roman" w:hAnsi="Courier New" w:cs="Courier New"/>
+          <w:color w:val="1F1F1F"/>
+          <w:sz w:val="21"/>
+          <w:szCs w:val="21"/>
+          <w:shd w:val="clear" w:color="auto" w:fill="FFFFFF"/>
+        </w:rPr>
+        <w:t>ĐÁP ÁN GỐC:</w:t>
+      </w:r>
+    </w:p>
+    <w:p>
+      <w:pPr>
+        <w:spacing w:after="0" w:line="240" w:lineRule="auto"/>
+        <w:rPr>
+          <w:rFonts w:ascii="Courier New" w:eastAsia="Times New Roman" w:hAnsi="Courier New" w:cs="Courier New"/>
+          <w:color w:val="1F1F1F"/>
+          <w:sz w:val="21"/>
+          <w:szCs w:val="21"/>
+          <w:shd w:val="clear" w:color="auto" w:fill="FFFFFF"/>
+        </w:rPr>
+      </w:pPr>
+      <w:r>
+        <w:rPr>
+          <w:rFonts w:ascii="Courier New" w:eastAsia="Times New Roman" w:hAnsi="Courier New" w:cs="Courier New"/>
+          <w:color w:val="1F1F1F"/>
+          <w:sz w:val="21"/>
+          <w:szCs w:val="21"/>
+          <w:shd w:val="clear" w:color="auto" w:fill="FFFFFF"/>
+        </w:rPr>
+        <w:t>&lt;think&gt;</w:t>
+      </w:r>
+    </w:p>
+    <w:p>
+      <w:pPr>
+        <w:spacing w:after="0" w:line="240" w:lineRule="auto"/>
+        <w:rPr>
+          <w:rFonts w:ascii="Courier New" w:eastAsia="Times New Roman" w:hAnsi="Courier New" w:cs="Courier New"/>
+          <w:color w:val="1F1F1F"/>
+          <w:sz w:val="21"/>
+          <w:szCs w:val="21"/>
+          <w:shd w:val="clear" w:color="auto" w:fill="FFFFFF"/>
+        </w:rPr>
+      </w:pPr>
+      <w:r>
+        <w:rPr>
+          <w:rFonts w:ascii="Courier New" w:eastAsia="Times New Roman" w:hAnsi="Courier New" w:cs="Courier New"/>
+          <w:color w:val="1F1F1F"/>
+          <w:sz w:val="21"/>
+          <w:szCs w:val="21"/>
+          <w:shd w:val="clear" w:color="auto" w:fill="FFFFFF"/>
+        </w:rPr>
+        <w:t xml:space="preserve">1. **Phân tích hình vẽ và giả </w:t>
+      </w:r>
+      <w:proofErr w:type="gramStart"/>
+      <w:r>
+        <w:rPr>
+          <w:rFonts w:ascii="Courier New" w:eastAsia="Times New Roman" w:hAnsi="Courier New" w:cs="Courier New"/>
+          <w:color w:val="1F1F1F"/>
+          <w:sz w:val="21"/>
+          <w:szCs w:val="21"/>
+          <w:shd w:val="clear" w:color="auto" w:fill="FFFFFF"/>
+        </w:rPr>
+        <w:t>thiết:*</w:t>
+      </w:r>
+      <w:proofErr w:type="gramEnd"/>
+      <w:r>
+        <w:rPr>
+          <w:rFonts w:ascii="Courier New" w:eastAsia="Times New Roman" w:hAnsi="Courier New" w:cs="Courier New"/>
+          <w:color w:val="1F1F1F"/>
+          <w:sz w:val="21"/>
+          <w:szCs w:val="21"/>
+          <w:shd w:val="clear" w:color="auto" w:fill="FFFFFF"/>
+        </w:rPr>
+        <w:t>*</w:t>
+      </w:r>
+    </w:p>
+    <w:p>
+      <w:pPr>
+        <w:spacing w:after="0" w:line="240" w:lineRule="auto"/>
+        <w:rPr>
+          <w:rFonts w:ascii="Courier New" w:eastAsia="Times New Roman" w:hAnsi="Courier New" w:cs="Courier New"/>
+          <w:color w:val="1F1F1F"/>
+          <w:sz w:val="21"/>
+          <w:szCs w:val="21"/>
+          <w:shd w:val="clear" w:color="auto" w:fill="FFFFFF"/>
+        </w:rPr>
+      </w:pPr>
+      <w:r>
+        <w:rPr>
+          <w:rFonts w:ascii="Courier New" w:eastAsia="Times New Roman" w:hAnsi="Courier New" w:cs="Courier New"/>
+          <w:color w:val="1F1F1F"/>
+          <w:sz w:val="21"/>
+          <w:szCs w:val="21"/>
+          <w:shd w:val="clear" w:color="auto" w:fill="FFFFFF"/>
+        </w:rPr>
+        <w:t xml:space="preserve">   - Đề bài yêu cầu tính diện tích phần được tô màu xanh (shaded region).</w:t>
+      </w:r>
+    </w:p>
+    <w:p>
+      <w:pPr>
+        <w:spacing w:after="0" w:line="240" w:lineRule="auto"/>
+        <w:rPr>
+          <w:rFonts w:ascii="Courier New" w:eastAsia="Times New Roman" w:hAnsi="Courier New" w:cs="Courier New"/>
+          <w:color w:val="1F1F1F"/>
+          <w:sz w:val="21"/>
+          <w:szCs w:val="21"/>
+          <w:shd w:val="clear" w:color="auto" w:fill="FFFFFF"/>
+        </w:rPr>
+      </w:pPr>
+      <w:r>
+        <w:rPr>
+          <w:rFonts w:ascii="Courier New" w:eastAsia="Times New Roman" w:hAnsi="Courier New" w:cs="Courier New"/>
+          <w:color w:val="1F1F1F"/>
+          <w:sz w:val="21"/>
+          <w:szCs w:val="21"/>
+          <w:shd w:val="clear" w:color="auto" w:fill="FFFFFF"/>
+        </w:rPr>
+        <w:t xml:space="preserve">   - Đề bài nêu rõ: "Assume that all polygons that appear to be regular are regular" $\rightarrow$ Hình đa giác ở đây là một tam giác đều.</w:t>
+      </w:r>
+    </w:p>
+    <w:p>
+      <w:pPr>
+        <w:spacing w:after="0" w:line="240" w:lineRule="auto"/>
+        <w:rPr>
+          <w:rFonts w:ascii="Courier New" w:eastAsia="Times New Roman" w:hAnsi="Courier New" w:cs="Courier New"/>
+          <w:color w:val="1F1F1F"/>
+          <w:sz w:val="21"/>
+          <w:szCs w:val="21"/>
+          <w:shd w:val="clear" w:color="auto" w:fill="FFFFFF"/>
+        </w:rPr>
+      </w:pPr>
+      <w:r>
+        <w:rPr>
+          <w:rFonts w:ascii="Courier New" w:eastAsia="Times New Roman" w:hAnsi="Courier New" w:cs="Courier New"/>
+          <w:color w:val="1F1F1F"/>
+          <w:sz w:val="21"/>
+          <w:szCs w:val="21"/>
+          <w:shd w:val="clear" w:color="auto" w:fill="FFFFFF"/>
+        </w:rPr>
+        <w:t xml:space="preserve">   - Bên trong tam giác đều có một hình tròn nội tiếp tiếp xúc với ba cạnh của tam giác.</w:t>
+      </w:r>
+    </w:p>
+    <w:p>
+      <w:pPr>
+        <w:spacing w:after="0" w:line="240" w:lineRule="auto"/>
+        <w:rPr>
+          <w:rFonts w:ascii="Courier New" w:eastAsia="Times New Roman" w:hAnsi="Courier New" w:cs="Courier New"/>
+          <w:color w:val="1F1F1F"/>
+          <w:sz w:val="21"/>
+          <w:szCs w:val="21"/>
+          <w:shd w:val="clear" w:color="auto" w:fill="FFFFFF"/>
+        </w:rPr>
+      </w:pPr>
+      <w:r>
+        <w:rPr>
+          <w:rFonts w:ascii="Courier New" w:eastAsia="Times New Roman" w:hAnsi="Courier New" w:cs="Courier New"/>
+          <w:color w:val="1F1F1F"/>
+          <w:sz w:val="21"/>
+          <w:szCs w:val="21"/>
+          <w:shd w:val="clear" w:color="auto" w:fill="FFFFFF"/>
+        </w:rPr>
+        <w:t xml:space="preserve">   - Bán kính đường tròn nội tiếp được cho là $r = 3\</w:t>
+      </w:r>
+      <w:proofErr w:type="gramStart"/>
+      <w:r>
+        <w:rPr>
+          <w:rFonts w:ascii="Courier New" w:eastAsia="Times New Roman" w:hAnsi="Courier New" w:cs="Courier New"/>
+          <w:color w:val="1F1F1F"/>
+          <w:sz w:val="21"/>
+          <w:szCs w:val="21"/>
+          <w:shd w:val="clear" w:color="auto" w:fill="FFFFFF"/>
+        </w:rPr>
+        <w:t>text{ in.</w:t>
+      </w:r>
+      <w:proofErr w:type="gramEnd"/>
+      <w:r>
+        <w:rPr>
+          <w:rFonts w:ascii="Courier New" w:eastAsia="Times New Roman" w:hAnsi="Courier New" w:cs="Courier New"/>
+          <w:color w:val="1F1F1F"/>
+          <w:sz w:val="21"/>
+          <w:szCs w:val="21"/>
+          <w:shd w:val="clear" w:color="auto" w:fill="FFFFFF"/>
+        </w:rPr>
+        <w:t>}$.</w:t>
+      </w:r>
+    </w:p>
+    <w:p>
+      <w:pPr>
+        <w:spacing w:after="0" w:line="240" w:lineRule="auto"/>
+        <w:rPr>
+          <w:rFonts w:ascii="Courier New" w:eastAsia="Times New Roman" w:hAnsi="Courier New" w:cs="Courier New"/>
+          <w:color w:val="1F1F1F"/>
+          <w:sz w:val="21"/>
+          <w:szCs w:val="21"/>
+          <w:shd w:val="clear" w:color="auto" w:fill="FFFFFF"/>
+        </w:rPr>
+      </w:pPr>
+      <w:r>
+        <w:rPr>
+          <w:rFonts w:ascii="Courier New" w:eastAsia="Times New Roman" w:hAnsi="Courier New" w:cs="Courier New"/>
+          <w:color w:val="1F1F1F"/>
+          <w:sz w:val="21"/>
+          <w:szCs w:val="21"/>
+          <w:shd w:val="clear" w:color="auto" w:fill="FFFFFF"/>
+        </w:rPr>
+        <w:t xml:space="preserve">   - Phần tô màu là diện tích của tam giác đều trừ đi diện tích của hình tròn nội tiếp:</w:t>
+      </w:r>
+    </w:p>
+    <w:p>
+      <w:pPr>
+        <w:spacing w:after="0" w:line="240" w:lineRule="auto"/>
+        <w:rPr>
+          <w:rFonts w:ascii="Courier New" w:eastAsia="Times New Roman" w:hAnsi="Courier New" w:cs="Courier New"/>
+          <w:color w:val="1F1F1F"/>
+          <w:sz w:val="21"/>
+          <w:szCs w:val="21"/>
+          <w:shd w:val="clear" w:color="auto" w:fill="FFFFFF"/>
+        </w:rPr>
+      </w:pPr>
+      <w:r>
+        <w:rPr>
+          <w:rFonts w:ascii="Courier New" w:eastAsia="Times New Roman" w:hAnsi="Courier New" w:cs="Courier New"/>
+          <w:color w:val="1F1F1F"/>
+          <w:sz w:val="21"/>
+          <w:szCs w:val="21"/>
+          <w:shd w:val="clear" w:color="auto" w:fill="FFFFFF"/>
+        </w:rPr>
+        <w:t xml:space="preserve">     $$A_{\text{shaded}} = A_{\text{triangle}} - A_{\text{circle</w:t>
+      </w:r>
+      <w:proofErr w:type="gramStart"/>
+      <w:r>
+        <w:rPr>
+          <w:rFonts w:ascii="Courier New" w:eastAsia="Times New Roman" w:hAnsi="Courier New" w:cs="Courier New"/>
+          <w:color w:val="1F1F1F"/>
+          <w:sz w:val="21"/>
+          <w:szCs w:val="21"/>
+          <w:shd w:val="clear" w:color="auto" w:fill="FFFFFF"/>
+        </w:rPr>
+        <w:t>}}$</w:t>
+      </w:r>
+      <w:proofErr w:type="gramEnd"/>
+      <w:r>
+        <w:rPr>
+          <w:rFonts w:ascii="Courier New" w:eastAsia="Times New Roman" w:hAnsi="Courier New" w:cs="Courier New"/>
+          <w:color w:val="1F1F1F"/>
+          <w:sz w:val="21"/>
+          <w:szCs w:val="21"/>
+          <w:shd w:val="clear" w:color="auto" w:fill="FFFFFF"/>
+        </w:rPr>
+        <w:t>$</w:t>
+      </w:r>
+    </w:p>
+    <w:p>
+      <w:pPr>
+        <w:spacing w:after="0" w:line="240" w:lineRule="auto"/>
+        <w:rPr>
+          <w:rFonts w:ascii="Courier New" w:eastAsia="Times New Roman" w:hAnsi="Courier New" w:cs="Courier New"/>
+          <w:color w:val="1F1F1F"/>
+          <w:sz w:val="21"/>
+          <w:szCs w:val="21"/>
+          <w:shd w:val="clear" w:color="auto" w:fill="FFFFFF"/>
+        </w:rPr>
+      </w:pPr>
+    </w:p>
+    <w:p>
+      <w:pPr>
+        <w:spacing w:after="0" w:line="240" w:lineRule="auto"/>
+        <w:rPr>
+          <w:rFonts w:ascii="Courier New" w:eastAsia="Times New Roman" w:hAnsi="Courier New" w:cs="Courier New"/>
+          <w:color w:val="1F1F1F"/>
+          <w:sz w:val="21"/>
+          <w:szCs w:val="21"/>
+          <w:shd w:val="clear" w:color="auto" w:fill="FFFFFF"/>
+        </w:rPr>
+      </w:pPr>
+      <w:r>
+        <w:rPr>
+          <w:rFonts w:ascii="Courier New" w:eastAsia="Times New Roman" w:hAnsi="Courier New" w:cs="Courier New"/>
+          <w:color w:val="1F1F1F"/>
+          <w:sz w:val="21"/>
+          <w:szCs w:val="21"/>
+          <w:shd w:val="clear" w:color="auto" w:fill="FFFFFF"/>
+        </w:rPr>
+        <w:t>2. **Tính diện tích hình tròn ($A_{\text{circle</w:t>
+      </w:r>
+      <w:proofErr w:type="gramStart"/>
+      <w:r>
+        <w:rPr>
+          <w:rFonts w:ascii="Courier New" w:eastAsia="Times New Roman" w:hAnsi="Courier New" w:cs="Courier New"/>
+          <w:color w:val="1F1F1F"/>
+          <w:sz w:val="21"/>
+          <w:szCs w:val="21"/>
+          <w:shd w:val="clear" w:color="auto" w:fill="FFFFFF"/>
+        </w:rPr>
+        <w:t>}}$</w:t>
+      </w:r>
+      <w:proofErr w:type="gramEnd"/>
+      <w:r>
+        <w:rPr>
+          <w:rFonts w:ascii="Courier New" w:eastAsia="Times New Roman" w:hAnsi="Courier New" w:cs="Courier New"/>
+          <w:color w:val="1F1F1F"/>
+          <w:sz w:val="21"/>
+          <w:szCs w:val="21"/>
+          <w:shd w:val="clear" w:color="auto" w:fill="FFFFFF"/>
+        </w:rPr>
+        <w:t>):**</w:t>
+      </w:r>
+    </w:p>
+    <w:p>
+      <w:pPr>
+        <w:spacing w:after="0" w:line="240" w:lineRule="auto"/>
+        <w:rPr>
+          <w:rFonts w:ascii="Courier New" w:eastAsia="Times New Roman" w:hAnsi="Courier New" w:cs="Courier New"/>
+          <w:color w:val="1F1F1F"/>
+          <w:sz w:val="21"/>
+          <w:szCs w:val="21"/>
+          <w:shd w:val="clear" w:color="auto" w:fill="FFFFFF"/>
+        </w:rPr>
+      </w:pPr>
+      <w:r>
+        <w:rPr>
+          <w:rFonts w:ascii="Courier New" w:eastAsia="Times New Roman" w:hAnsi="Courier New" w:cs="Courier New"/>
+          <w:color w:val="1F1F1F"/>
+          <w:sz w:val="21"/>
+          <w:szCs w:val="21"/>
+          <w:shd w:val="clear" w:color="auto" w:fill="FFFFFF"/>
+        </w:rPr>
+        <w:t xml:space="preserve">   - Bán kính đường tròn: $r = 3\</w:t>
+      </w:r>
+      <w:proofErr w:type="gramStart"/>
+      <w:r>
+        <w:rPr>
+          <w:rFonts w:ascii="Courier New" w:eastAsia="Times New Roman" w:hAnsi="Courier New" w:cs="Courier New"/>
+          <w:color w:val="1F1F1F"/>
+          <w:sz w:val="21"/>
+          <w:szCs w:val="21"/>
+          <w:shd w:val="clear" w:color="auto" w:fill="FFFFFF"/>
+        </w:rPr>
+        <w:t>text{ in.</w:t>
+      </w:r>
+      <w:proofErr w:type="gramEnd"/>
+      <w:r>
+        <w:rPr>
+          <w:rFonts w:ascii="Courier New" w:eastAsia="Times New Roman" w:hAnsi="Courier New" w:cs="Courier New"/>
+          <w:color w:val="1F1F1F"/>
+          <w:sz w:val="21"/>
+          <w:szCs w:val="21"/>
+          <w:shd w:val="clear" w:color="auto" w:fill="FFFFFF"/>
+        </w:rPr>
+        <w:t>}$</w:t>
+      </w:r>
+    </w:p>
+    <w:p>
+      <w:pPr>
+        <w:spacing w:after="0" w:line="240" w:lineRule="auto"/>
+        <w:rPr>
+          <w:rFonts w:ascii="Courier New" w:eastAsia="Times New Roman" w:hAnsi="Courier New" w:cs="Courier New"/>
+          <w:color w:val="1F1F1F"/>
+          <w:sz w:val="21"/>
+          <w:szCs w:val="21"/>
+          <w:shd w:val="clear" w:color="auto" w:fill="FFFFFF"/>
+        </w:rPr>
+      </w:pPr>
+      <w:r>
+        <w:rPr>
+          <w:rFonts w:ascii="Courier New" w:eastAsia="Times New Roman" w:hAnsi="Courier New" w:cs="Courier New"/>
+          <w:color w:val="1F1F1F"/>
+          <w:sz w:val="21"/>
+          <w:szCs w:val="21"/>
+          <w:shd w:val="clear" w:color="auto" w:fill="FFFFFF"/>
+        </w:rPr>
+        <w:t xml:space="preserve">   - Diện tích hình tròn:</w:t>
+      </w:r>
+    </w:p>
+    <w:p>
+      <w:pPr>
+        <w:spacing w:after="0" w:line="240" w:lineRule="auto"/>
+        <w:rPr>
+          <w:rFonts w:ascii="Courier New" w:eastAsia="Times New Roman" w:hAnsi="Courier New" w:cs="Courier New"/>
+          <w:color w:val="1F1F1F"/>
+          <w:sz w:val="21"/>
+          <w:szCs w:val="21"/>
+          <w:shd w:val="clear" w:color="auto" w:fill="FFFFFF"/>
+        </w:rPr>
+      </w:pPr>
+      <w:r>
+        <w:rPr>
+          <w:rFonts w:ascii="Courier New" w:eastAsia="Times New Roman" w:hAnsi="Courier New" w:cs="Courier New"/>
+          <w:color w:val="1F1F1F"/>
+          <w:sz w:val="21"/>
+          <w:szCs w:val="21"/>
+          <w:shd w:val="clear" w:color="auto" w:fill="FFFFFF"/>
+        </w:rPr>
+        <w:t xml:space="preserve">     $$A_{\text{circle}} = \pi r^2 = \pi \cdot 3^2 = 9\pi \approx 28.2743\</w:t>
+      </w:r>
+      <w:proofErr w:type="gramStart"/>
+      <w:r>
+        <w:rPr>
+          <w:rFonts w:ascii="Courier New" w:eastAsia="Times New Roman" w:hAnsi="Courier New" w:cs="Courier New"/>
+          <w:color w:val="1F1F1F"/>
+          <w:sz w:val="21"/>
+          <w:szCs w:val="21"/>
+          <w:shd w:val="clear" w:color="auto" w:fill="FFFFFF"/>
+        </w:rPr>
+        <w:t>text{ in.</w:t>
+      </w:r>
+      <w:proofErr w:type="gramEnd"/>
+      <w:r>
+        <w:rPr>
+          <w:rFonts w:ascii="Courier New" w:eastAsia="Times New Roman" w:hAnsi="Courier New" w:cs="Courier New"/>
+          <w:color w:val="1F1F1F"/>
+          <w:sz w:val="21"/>
+          <w:szCs w:val="21"/>
+          <w:shd w:val="clear" w:color="auto" w:fill="FFFFFF"/>
+        </w:rPr>
+        <w:t>}^2$$</w:t>
+      </w:r>
+    </w:p>
+    <w:p>
+      <w:pPr>
+        <w:spacing w:after="0" w:line="240" w:lineRule="auto"/>
+        <w:rPr>
+          <w:rFonts w:ascii="Courier New" w:eastAsia="Times New Roman" w:hAnsi="Courier New" w:cs="Courier New"/>
+          <w:color w:val="1F1F1F"/>
+          <w:sz w:val="21"/>
+          <w:szCs w:val="21"/>
+          <w:shd w:val="clear" w:color="auto" w:fill="FFFFFF"/>
+        </w:rPr>
+      </w:pPr>
+    </w:p>
+    <w:p>
+      <w:pPr>
+        <w:spacing w:after="0" w:line="240" w:lineRule="auto"/>
+        <w:rPr>
+          <w:rFonts w:ascii="Courier New" w:eastAsia="Times New Roman" w:hAnsi="Courier New" w:cs="Courier New"/>
+          <w:color w:val="1F1F1F"/>
+          <w:sz w:val="21"/>
+          <w:szCs w:val="21"/>
+          <w:shd w:val="clear" w:color="auto" w:fill="FFFFFF"/>
+        </w:rPr>
+      </w:pPr>
+      <w:r>
+        <w:rPr>
+          <w:rFonts w:ascii="Courier New" w:eastAsia="Times New Roman" w:hAnsi="Courier New" w:cs="Courier New"/>
+          <w:color w:val="1F1F1F"/>
+          <w:sz w:val="21"/>
+          <w:szCs w:val="21"/>
+          <w:shd w:val="clear" w:color="auto" w:fill="FFFFFF"/>
+        </w:rPr>
+        <w:t>3. **Tính diện tích tam giác đều ($A_{\text{triangle</w:t>
+      </w:r>
+      <w:proofErr w:type="gramStart"/>
+      <w:r>
+        <w:rPr>
+          <w:rFonts w:ascii="Courier New" w:eastAsia="Times New Roman" w:hAnsi="Courier New" w:cs="Courier New"/>
+          <w:color w:val="1F1F1F"/>
+          <w:sz w:val="21"/>
+          <w:szCs w:val="21"/>
+          <w:shd w:val="clear" w:color="auto" w:fill="FFFFFF"/>
+        </w:rPr>
+        <w:t>}}$</w:t>
+      </w:r>
+      <w:proofErr w:type="gramEnd"/>
+      <w:r>
+        <w:rPr>
+          <w:rFonts w:ascii="Courier New" w:eastAsia="Times New Roman" w:hAnsi="Courier New" w:cs="Courier New"/>
+          <w:color w:val="1F1F1F"/>
+          <w:sz w:val="21"/>
+          <w:szCs w:val="21"/>
+          <w:shd w:val="clear" w:color="auto" w:fill="FFFFFF"/>
+        </w:rPr>
+        <w:t>):**</w:t>
+      </w:r>
+    </w:p>
+    <w:p>
+      <w:pPr>
+        <w:spacing w:after="0" w:line="240" w:lineRule="auto"/>
+        <w:rPr>
+          <w:rFonts w:ascii="Courier New" w:eastAsia="Times New Roman" w:hAnsi="Courier New" w:cs="Courier New"/>
+          <w:color w:val="1F1F1F"/>
+          <w:sz w:val="21"/>
+          <w:szCs w:val="21"/>
+          <w:shd w:val="clear" w:color="auto" w:fill="FFFFFF"/>
+        </w:rPr>
+      </w:pPr>
+      <w:r>
+        <w:rPr>
+          <w:rFonts w:ascii="Courier New" w:eastAsia="Times New Roman" w:hAnsi="Courier New" w:cs="Courier New"/>
+          <w:color w:val="1F1F1F"/>
+          <w:sz w:val="21"/>
+          <w:szCs w:val="21"/>
+          <w:shd w:val="clear" w:color="auto" w:fill="FFFFFF"/>
+        </w:rPr>
+        <w:t xml:space="preserve">   - Trong tam giác đều, tâm đường tròn nội tiếp cũng là trọng tâm của tam giác.</w:t>
+      </w:r>
+    </w:p>
+    <w:p>
+      <w:pPr>
+        <w:spacing w:after="0" w:line="240" w:lineRule="auto"/>
+        <w:rPr>
+          <w:rFonts w:ascii="Courier New" w:eastAsia="Times New Roman" w:hAnsi="Courier New" w:cs="Courier New"/>
+          <w:color w:val="1F1F1F"/>
+          <w:sz w:val="21"/>
+          <w:szCs w:val="21"/>
+          <w:shd w:val="clear" w:color="auto" w:fill="FFFFFF"/>
+        </w:rPr>
+      </w:pPr>
+      <w:r>
+        <w:rPr>
+          <w:rFonts w:ascii="Courier New" w:eastAsia="Times New Roman" w:hAnsi="Courier New" w:cs="Courier New"/>
+          <w:color w:val="1F1F1F"/>
+          <w:sz w:val="21"/>
+          <w:szCs w:val="21"/>
+          <w:shd w:val="clear" w:color="auto" w:fill="FFFFFF"/>
+        </w:rPr>
+        <w:t xml:space="preserve">   - Do đó, bán kính đường tròn nội tiếp $r$ bằng $\</w:t>
+      </w:r>
+      <w:proofErr w:type="gramStart"/>
+      <w:r>
+        <w:rPr>
+          <w:rFonts w:ascii="Courier New" w:eastAsia="Times New Roman" w:hAnsi="Courier New" w:cs="Courier New"/>
+          <w:color w:val="1F1F1F"/>
+          <w:sz w:val="21"/>
+          <w:szCs w:val="21"/>
+          <w:shd w:val="clear" w:color="auto" w:fill="FFFFFF"/>
+        </w:rPr>
+        <w:t>frac{</w:t>
+      </w:r>
+      <w:proofErr w:type="gramEnd"/>
+      <w:r>
+        <w:rPr>
+          <w:rFonts w:ascii="Courier New" w:eastAsia="Times New Roman" w:hAnsi="Courier New" w:cs="Courier New"/>
+          <w:color w:val="1F1F1F"/>
+          <w:sz w:val="21"/>
+          <w:szCs w:val="21"/>
+          <w:shd w:val="clear" w:color="auto" w:fill="FFFFFF"/>
+        </w:rPr>
+        <w:t>1}{3}$ chiều cao $h$ của tam giác:</w:t>
+      </w:r>
+    </w:p>
+    <w:p>
+      <w:pPr>
+        <w:spacing w:after="0" w:line="240" w:lineRule="auto"/>
+        <w:rPr>
+          <w:rFonts w:ascii="Courier New" w:eastAsia="Times New Roman" w:hAnsi="Courier New" w:cs="Courier New"/>
+          <w:color w:val="1F1F1F"/>
+          <w:sz w:val="21"/>
+          <w:szCs w:val="21"/>
+          <w:shd w:val="clear" w:color="auto" w:fill="FFFFFF"/>
+        </w:rPr>
+      </w:pPr>
+      <w:r>
+        <w:rPr>
+          <w:rFonts w:ascii="Courier New" w:eastAsia="Times New Roman" w:hAnsi="Courier New" w:cs="Courier New"/>
+          <w:color w:val="1F1F1F"/>
+          <w:sz w:val="21"/>
+          <w:szCs w:val="21"/>
+          <w:shd w:val="clear" w:color="auto" w:fill="FFFFFF"/>
+        </w:rPr>
+        <w:t xml:space="preserve">     $$h = 3r = 3 \cdot 3 = 9\</w:t>
+      </w:r>
+      <w:proofErr w:type="gramStart"/>
+      <w:r>
+        <w:rPr>
+          <w:rFonts w:ascii="Courier New" w:eastAsia="Times New Roman" w:hAnsi="Courier New" w:cs="Courier New"/>
+          <w:color w:val="1F1F1F"/>
+          <w:sz w:val="21"/>
+          <w:szCs w:val="21"/>
+          <w:shd w:val="clear" w:color="auto" w:fill="FFFFFF"/>
+        </w:rPr>
+        <w:t>text{ in.</w:t>
+      </w:r>
+      <w:proofErr w:type="gramEnd"/>
+      <w:r>
+        <w:rPr>
+          <w:rFonts w:ascii="Courier New" w:eastAsia="Times New Roman" w:hAnsi="Courier New" w:cs="Courier New"/>
+          <w:color w:val="1F1F1F"/>
+          <w:sz w:val="21"/>
+          <w:szCs w:val="21"/>
+          <w:shd w:val="clear" w:color="auto" w:fill="FFFFFF"/>
+        </w:rPr>
+        <w:t>}$$</w:t>
+      </w:r>
+    </w:p>
+    <w:p>
+      <w:pPr>
+        <w:spacing w:after="0" w:line="240" w:lineRule="auto"/>
+        <w:rPr>
+          <w:rFonts w:ascii="Courier New" w:eastAsia="Times New Roman" w:hAnsi="Courier New" w:cs="Courier New"/>
+          <w:color w:val="1F1F1F"/>
+          <w:sz w:val="21"/>
+          <w:szCs w:val="21"/>
+          <w:shd w:val="clear" w:color="auto" w:fill="FFFFFF"/>
+        </w:rPr>
+      </w:pPr>
+      <w:r>
+        <w:rPr>
+          <w:rFonts w:ascii="Courier New" w:eastAsia="Times New Roman" w:hAnsi="Courier New" w:cs="Courier New"/>
+          <w:color w:val="1F1F1F"/>
+          <w:sz w:val="21"/>
+          <w:szCs w:val="21"/>
+          <w:shd w:val="clear" w:color="auto" w:fill="FFFFFF"/>
+        </w:rPr>
+        <w:t xml:space="preserve">   - Mối quan hệ giữa cạnh $s$ và chiều cao $h$ của tam giác đều:</w:t>
+      </w:r>
+    </w:p>
+    <w:p>
+      <w:pPr>
+        <w:spacing w:after="0" w:line="240" w:lineRule="auto"/>
+        <w:rPr>
+          <w:rFonts w:ascii="Courier New" w:eastAsia="Times New Roman" w:hAnsi="Courier New" w:cs="Courier New"/>
+          <w:color w:val="1F1F1F"/>
+          <w:sz w:val="21"/>
+          <w:szCs w:val="21"/>
+          <w:shd w:val="clear" w:color="auto" w:fill="FFFFFF"/>
+        </w:rPr>
+      </w:pPr>
+      <w:r>
+        <w:rPr>
+          <w:rFonts w:ascii="Courier New" w:eastAsia="Times New Roman" w:hAnsi="Courier New" w:cs="Courier New"/>
+          <w:color w:val="1F1F1F"/>
+          <w:sz w:val="21"/>
+          <w:szCs w:val="21"/>
+          <w:shd w:val="clear" w:color="auto" w:fill="FFFFFF"/>
+        </w:rPr>
+        <w:t xml:space="preserve">     $$h = \frac{s\</w:t>
+      </w:r>
+      <w:proofErr w:type="gramStart"/>
+      <w:r>
+        <w:rPr>
+          <w:rFonts w:ascii="Courier New" w:eastAsia="Times New Roman" w:hAnsi="Courier New" w:cs="Courier New"/>
+          <w:color w:val="1F1F1F"/>
+          <w:sz w:val="21"/>
+          <w:szCs w:val="21"/>
+          <w:shd w:val="clear" w:color="auto" w:fill="FFFFFF"/>
+        </w:rPr>
+        <w:t>sqrt{</w:t>
+      </w:r>
+      <w:proofErr w:type="gramEnd"/>
+      <w:r>
+        <w:rPr>
+          <w:rFonts w:ascii="Courier New" w:eastAsia="Times New Roman" w:hAnsi="Courier New" w:cs="Courier New"/>
+          <w:color w:val="1F1F1F"/>
+          <w:sz w:val="21"/>
+          <w:szCs w:val="21"/>
+          <w:shd w:val="clear" w:color="auto" w:fill="FFFFFF"/>
+        </w:rPr>
+        <w:t>3}}{2} \implies s = \frac{2h}{\sqrt{3}} = \frac{2 \cdot 9}{\sqrt{3}} = 6\sqrt{3}\text{ in.}$$</w:t>
+      </w:r>
+    </w:p>
+    <w:p>
+      <w:pPr>
+        <w:spacing w:after="0" w:line="240" w:lineRule="auto"/>
+        <w:rPr>
+          <w:rFonts w:ascii="Courier New" w:eastAsia="Times New Roman" w:hAnsi="Courier New" w:cs="Courier New"/>
+          <w:color w:val="1F1F1F"/>
+          <w:sz w:val="21"/>
+          <w:szCs w:val="21"/>
+          <w:shd w:val="clear" w:color="auto" w:fill="FFFFFF"/>
+        </w:rPr>
+      </w:pPr>
+      <w:r>
+        <w:rPr>
+          <w:rFonts w:ascii="Courier New" w:eastAsia="Times New Roman" w:hAnsi="Courier New" w:cs="Courier New"/>
+          <w:color w:val="1F1F1F"/>
+          <w:sz w:val="21"/>
+          <w:szCs w:val="21"/>
+          <w:shd w:val="clear" w:color="auto" w:fill="FFFFFF"/>
+        </w:rPr>
+        <w:t xml:space="preserve">   - Diện tích tam giác đều:</w:t>
+      </w:r>
+    </w:p>
+    <w:p>
+      <w:pPr>
+        <w:spacing w:after="0" w:line="240" w:lineRule="auto"/>
+        <w:rPr>
+          <w:rFonts w:ascii="Courier New" w:eastAsia="Times New Roman" w:hAnsi="Courier New" w:cs="Courier New"/>
+          <w:color w:val="1F1F1F"/>
+          <w:sz w:val="21"/>
+          <w:szCs w:val="21"/>
+          <w:shd w:val="clear" w:color="auto" w:fill="FFFFFF"/>
+        </w:rPr>
+      </w:pPr>
+      <w:r>
+        <w:rPr>
+          <w:rFonts w:ascii="Courier New" w:eastAsia="Times New Roman" w:hAnsi="Courier New" w:cs="Courier New"/>
+          <w:color w:val="1F1F1F"/>
+          <w:sz w:val="21"/>
+          <w:szCs w:val="21"/>
+          <w:shd w:val="clear" w:color="auto" w:fill="FFFFFF"/>
+        </w:rPr>
+        <w:t xml:space="preserve">     $$A_{\text{triangle}} = \</w:t>
+      </w:r>
+      <w:proofErr w:type="gramStart"/>
+      <w:r>
+        <w:rPr>
+          <w:rFonts w:ascii="Courier New" w:eastAsia="Times New Roman" w:hAnsi="Courier New" w:cs="Courier New"/>
+          <w:color w:val="1F1F1F"/>
+          <w:sz w:val="21"/>
+          <w:szCs w:val="21"/>
+          <w:shd w:val="clear" w:color="auto" w:fill="FFFFFF"/>
+        </w:rPr>
+        <w:t>frac{</w:t>
+      </w:r>
+      <w:proofErr w:type="gramEnd"/>
+      <w:r>
+        <w:rPr>
+          <w:rFonts w:ascii="Courier New" w:eastAsia="Times New Roman" w:hAnsi="Courier New" w:cs="Courier New"/>
+          <w:color w:val="1F1F1F"/>
+          <w:sz w:val="21"/>
+          <w:szCs w:val="21"/>
+          <w:shd w:val="clear" w:color="auto" w:fill="FFFFFF"/>
+        </w:rPr>
+        <w:t>1}{2} \cdot s \cdot h = \frac{1}{2} \cdot 6\sqrt{3} \cdot 9 = 27\sqrt{3} \approx 46.7654\text{ in.}^2$$</w:t>
+      </w:r>
+    </w:p>
+    <w:p>
+      <w:pPr>
+        <w:spacing w:after="0" w:line="240" w:lineRule="auto"/>
+        <w:rPr>
+          <w:rFonts w:ascii="Courier New" w:eastAsia="Times New Roman" w:hAnsi="Courier New" w:cs="Courier New"/>
+          <w:color w:val="1F1F1F"/>
+          <w:sz w:val="21"/>
+          <w:szCs w:val="21"/>
+          <w:shd w:val="clear" w:color="auto" w:fill="FFFFFF"/>
+        </w:rPr>
+      </w:pPr>
+    </w:p>
+    <w:p>
+      <w:pPr>
+        <w:spacing w:after="0" w:line="240" w:lineRule="auto"/>
+        <w:rPr>
+          <w:rFonts w:ascii="Courier New" w:eastAsia="Times New Roman" w:hAnsi="Courier New" w:cs="Courier New"/>
+          <w:color w:val="1F1F1F"/>
+          <w:sz w:val="21"/>
+          <w:szCs w:val="21"/>
+          <w:shd w:val="clear" w:color="auto" w:fill="FFFFFF"/>
+        </w:rPr>
+      </w:pPr>
+      <w:r>
+        <w:rPr>
+          <w:rFonts w:ascii="Courier New" w:eastAsia="Times New Roman" w:hAnsi="Courier New" w:cs="Courier New"/>
+          <w:color w:val="1F1F1F"/>
+          <w:sz w:val="21"/>
+          <w:szCs w:val="21"/>
+          <w:shd w:val="clear" w:color="auto" w:fill="FFFFFF"/>
+        </w:rPr>
+        <w:t>4. **Tính diện tích phần tô màu ($A_{\text{shaded</w:t>
+      </w:r>
+      <w:proofErr w:type="gramStart"/>
+      <w:r>
+        <w:rPr>
+          <w:rFonts w:ascii="Courier New" w:eastAsia="Times New Roman" w:hAnsi="Courier New" w:cs="Courier New"/>
+          <w:color w:val="1F1F1F"/>
+          <w:sz w:val="21"/>
+          <w:szCs w:val="21"/>
+          <w:shd w:val="clear" w:color="auto" w:fill="FFFFFF"/>
+        </w:rPr>
+        <w:t>}}$</w:t>
+      </w:r>
+      <w:proofErr w:type="gramEnd"/>
+      <w:r>
+        <w:rPr>
+          <w:rFonts w:ascii="Courier New" w:eastAsia="Times New Roman" w:hAnsi="Courier New" w:cs="Courier New"/>
+          <w:color w:val="1F1F1F"/>
+          <w:sz w:val="21"/>
+          <w:szCs w:val="21"/>
+          <w:shd w:val="clear" w:color="auto" w:fill="FFFFFF"/>
+        </w:rPr>
+        <w:t>):**</w:t>
+      </w:r>
+    </w:p>
+    <w:p>
+      <w:pPr>
+        <w:spacing w:after="0" w:line="240" w:lineRule="auto"/>
+        <w:rPr>
+          <w:rFonts w:ascii="Courier New" w:eastAsia="Times New Roman" w:hAnsi="Courier New" w:cs="Courier New"/>
+          <w:color w:val="1F1F1F"/>
+          <w:sz w:val="21"/>
+          <w:szCs w:val="21"/>
+          <w:shd w:val="clear" w:color="auto" w:fill="FFFFFF"/>
+        </w:rPr>
+      </w:pPr>
+      <w:r>
+        <w:rPr>
+          <w:rFonts w:ascii="Courier New" w:eastAsia="Times New Roman" w:hAnsi="Courier New" w:cs="Courier New"/>
+          <w:color w:val="1F1F1F"/>
+          <w:sz w:val="21"/>
+          <w:szCs w:val="21"/>
+          <w:shd w:val="clear" w:color="auto" w:fill="FFFFFF"/>
+        </w:rPr>
+        <w:t xml:space="preserve">   $$A_{\text{shaded}} = A_{\text{triangle}} - A_{\text{circle}} = 27\</w:t>
+      </w:r>
+      <w:proofErr w:type="gramStart"/>
+      <w:r>
+        <w:rPr>
+          <w:rFonts w:ascii="Courier New" w:eastAsia="Times New Roman" w:hAnsi="Courier New" w:cs="Courier New"/>
+          <w:color w:val="1F1F1F"/>
+          <w:sz w:val="21"/>
+          <w:szCs w:val="21"/>
+          <w:shd w:val="clear" w:color="auto" w:fill="FFFFFF"/>
+        </w:rPr>
+        <w:t>sqrt{</w:t>
+      </w:r>
+      <w:proofErr w:type="gramEnd"/>
+      <w:r>
+        <w:rPr>
+          <w:rFonts w:ascii="Courier New" w:eastAsia="Times New Roman" w:hAnsi="Courier New" w:cs="Courier New"/>
+          <w:color w:val="1F1F1F"/>
+          <w:sz w:val="21"/>
+          <w:szCs w:val="21"/>
+          <w:shd w:val="clear" w:color="auto" w:fill="FFFFFF"/>
+        </w:rPr>
+        <w:t>3} - 9\pi$$</w:t>
+      </w:r>
+    </w:p>
+    <w:p>
+      <w:pPr>
+        <w:spacing w:after="0" w:line="240" w:lineRule="auto"/>
+        <w:rPr>
+          <w:rFonts w:ascii="Courier New" w:eastAsia="Times New Roman" w:hAnsi="Courier New" w:cs="Courier New"/>
+          <w:color w:val="1F1F1F"/>
+          <w:sz w:val="21"/>
+          <w:szCs w:val="21"/>
+          <w:shd w:val="clear" w:color="auto" w:fill="FFFFFF"/>
+        </w:rPr>
+      </w:pPr>
+      <w:r>
+        <w:rPr>
+          <w:rFonts w:ascii="Courier New" w:eastAsia="Times New Roman" w:hAnsi="Courier New" w:cs="Courier New"/>
+          <w:color w:val="1F1F1F"/>
+          <w:sz w:val="21"/>
+          <w:szCs w:val="21"/>
+          <w:shd w:val="clear" w:color="auto" w:fill="FFFFFF"/>
+        </w:rPr>
+        <w:t xml:space="preserve">   $$A_{\text{shaded}} \approx 46.7654 - 28.2743 = 18.4911\</w:t>
+      </w:r>
+      <w:proofErr w:type="gramStart"/>
+      <w:r>
+        <w:rPr>
+          <w:rFonts w:ascii="Courier New" w:eastAsia="Times New Roman" w:hAnsi="Courier New" w:cs="Courier New"/>
+          <w:color w:val="1F1F1F"/>
+          <w:sz w:val="21"/>
+          <w:szCs w:val="21"/>
+          <w:shd w:val="clear" w:color="auto" w:fill="FFFFFF"/>
+        </w:rPr>
+        <w:t>text{ in.</w:t>
+      </w:r>
+      <w:proofErr w:type="gramEnd"/>
+      <w:r>
+        <w:rPr>
+          <w:rFonts w:ascii="Courier New" w:eastAsia="Times New Roman" w:hAnsi="Courier New" w:cs="Courier New"/>
+          <w:color w:val="1F1F1F"/>
+          <w:sz w:val="21"/>
+          <w:szCs w:val="21"/>
+          <w:shd w:val="clear" w:color="auto" w:fill="FFFFFF"/>
+        </w:rPr>
+        <w:t>}^2$$</w:t>
+      </w:r>
+    </w:p>
+    <w:p>
+      <w:pPr>
+        <w:spacing w:after="0" w:line="240" w:lineRule="auto"/>
+        <w:rPr>
+          <w:rFonts w:ascii="Courier New" w:eastAsia="Times New Roman" w:hAnsi="Courier New" w:cs="Courier New"/>
+          <w:color w:val="1F1F1F"/>
+          <w:sz w:val="21"/>
+          <w:szCs w:val="21"/>
+          <w:shd w:val="clear" w:color="auto" w:fill="FFFFFF"/>
+        </w:rPr>
+      </w:pPr>
+    </w:p>
+    <w:p>
+      <w:pPr>
+        <w:spacing w:after="0" w:line="240" w:lineRule="auto"/>
+        <w:rPr>
+          <w:rFonts w:ascii="Courier New" w:eastAsia="Times New Roman" w:hAnsi="Courier New" w:cs="Courier New"/>
+          <w:color w:val="1F1F1F"/>
+          <w:sz w:val="21"/>
+          <w:szCs w:val="21"/>
+          <w:shd w:val="clear" w:color="auto" w:fill="FFFFFF"/>
+        </w:rPr>
+      </w:pPr>
+      <w:r>
+        <w:rPr>
+          <w:rFonts w:ascii="Courier New" w:eastAsia="Times New Roman" w:hAnsi="Courier New" w:cs="Courier New"/>
+          <w:color w:val="1F1F1F"/>
+          <w:sz w:val="21"/>
+          <w:szCs w:val="21"/>
+          <w:shd w:val="clear" w:color="auto" w:fill="FFFFFF"/>
+        </w:rPr>
+        <w:t xml:space="preserve">5. **Làm tròn kết </w:t>
+      </w:r>
+      <w:proofErr w:type="gramStart"/>
+      <w:r>
+        <w:rPr>
+          <w:rFonts w:ascii="Courier New" w:eastAsia="Times New Roman" w:hAnsi="Courier New" w:cs="Courier New"/>
+          <w:color w:val="1F1F1F"/>
+          <w:sz w:val="21"/>
+          <w:szCs w:val="21"/>
+          <w:shd w:val="clear" w:color="auto" w:fill="FFFFFF"/>
+        </w:rPr>
+        <w:t>quả:*</w:t>
+      </w:r>
+      <w:proofErr w:type="gramEnd"/>
+      <w:r>
+        <w:rPr>
+          <w:rFonts w:ascii="Courier New" w:eastAsia="Times New Roman" w:hAnsi="Courier New" w:cs="Courier New"/>
+          <w:color w:val="1F1F1F"/>
+          <w:sz w:val="21"/>
+          <w:szCs w:val="21"/>
+          <w:shd w:val="clear" w:color="auto" w:fill="FFFFFF"/>
+        </w:rPr>
+        <w:t>*</w:t>
+      </w:r>
+    </w:p>
+    <w:p>
+      <w:pPr>
+        <w:spacing w:after="0" w:line="240" w:lineRule="auto"/>
+        <w:rPr>
+          <w:rFonts w:ascii="Courier New" w:eastAsia="Times New Roman" w:hAnsi="Courier New" w:cs="Courier New"/>
+          <w:color w:val="1F1F1F"/>
+          <w:sz w:val="21"/>
+          <w:szCs w:val="21"/>
+          <w:shd w:val="clear" w:color="auto" w:fill="FFFFFF"/>
+        </w:rPr>
+      </w:pPr>
+      <w:r>
+        <w:rPr>
+          <w:rFonts w:ascii="Courier New" w:eastAsia="Times New Roman" w:hAnsi="Courier New" w:cs="Courier New"/>
+          <w:color w:val="1F1F1F"/>
+          <w:sz w:val="21"/>
+          <w:szCs w:val="21"/>
+          <w:shd w:val="clear" w:color="auto" w:fill="FFFFFF"/>
+        </w:rPr>
+        <w:t xml:space="preserve">   - Làm tròn đến hàng phần mười theo yêu cầu đề bài: $18.4911 \approx 18.5$.</w:t>
+      </w:r>
+    </w:p>
+    <w:p>
+      <w:pPr>
+        <w:spacing w:after="0" w:line="240" w:lineRule="auto"/>
+        <w:rPr>
+          <w:rFonts w:ascii="Courier New" w:eastAsia="Times New Roman" w:hAnsi="Courier New" w:cs="Courier New"/>
+          <w:color w:val="1F1F1F"/>
+          <w:sz w:val="21"/>
+          <w:szCs w:val="21"/>
+          <w:shd w:val="clear" w:color="auto" w:fill="FFFFFF"/>
+        </w:rPr>
+      </w:pPr>
+      <w:r>
+        <w:rPr>
+          <w:rFonts w:ascii="Courier New" w:eastAsia="Times New Roman" w:hAnsi="Courier New" w:cs="Courier New"/>
+          <w:color w:val="1F1F1F"/>
+          <w:sz w:val="21"/>
+          <w:szCs w:val="21"/>
+          <w:shd w:val="clear" w:color="auto" w:fill="FFFFFF"/>
+        </w:rPr>
+        <w:t>&lt;/think&gt;</w:t>
+      </w:r>
+    </w:p>
+    <w:p>
+      <w:pPr>
+        <w:spacing w:after="0" w:line="240" w:lineRule="auto"/>
+        <w:rPr>
+          <w:rFonts w:ascii="Courier New" w:eastAsia="Times New Roman" w:hAnsi="Courier New" w:cs="Courier New"/>
+          <w:color w:val="1F1F1F"/>
+          <w:sz w:val="21"/>
+          <w:szCs w:val="21"/>
+          <w:shd w:val="clear" w:color="auto" w:fill="FFFFFF"/>
+        </w:rPr>
+      </w:pPr>
+    </w:p>
+    <w:p>
+      <w:pPr>
+        <w:spacing w:after="0" w:line="240" w:lineRule="auto"/>
+        <w:rPr>
+          <w:rFonts w:ascii="Courier New" w:eastAsia="Times New Roman" w:hAnsi="Courier New" w:cs="Courier New"/>
+          <w:color w:val="1F1F1F"/>
+          <w:sz w:val="21"/>
+          <w:szCs w:val="21"/>
+          <w:shd w:val="clear" w:color="auto" w:fill="FFFFFF"/>
+        </w:rPr>
+      </w:pPr>
+      <w:r>
+        <w:rPr>
+          <w:rFonts w:ascii="Courier New" w:eastAsia="Times New Roman" w:hAnsi="Courier New" w:cs="Courier New"/>
+          <w:color w:val="1F1F1F"/>
+          <w:sz w:val="21"/>
+          <w:szCs w:val="21"/>
+          <w:shd w:val="clear" w:color="auto" w:fill="FFFFFF"/>
+        </w:rPr>
+        <w:t>Để tính diện tích phần tô màu, ta lấy diện tích của tam giác đều trừ đi diện tích của hình tròn nội tiếp.</w:t>
+      </w:r>
+    </w:p>
+    <w:p>
+      <w:pPr>
+        <w:spacing w:after="0" w:line="240" w:lineRule="auto"/>
+        <w:rPr>
+          <w:rFonts w:ascii="Courier New" w:eastAsia="Times New Roman" w:hAnsi="Courier New" w:cs="Courier New"/>
+          <w:color w:val="1F1F1F"/>
+          <w:sz w:val="21"/>
+          <w:szCs w:val="21"/>
+          <w:shd w:val="clear" w:color="auto" w:fill="FFFFFF"/>
+        </w:rPr>
+      </w:pPr>
+    </w:p>
+    <w:p>
+      <w:pPr>
+        <w:spacing w:after="0" w:line="240" w:lineRule="auto"/>
+        <w:rPr>
+          <w:rFonts w:ascii="Courier New" w:eastAsia="Times New Roman" w:hAnsi="Courier New" w:cs="Courier New"/>
+          <w:color w:val="1F1F1F"/>
+          <w:sz w:val="21"/>
+          <w:szCs w:val="21"/>
+          <w:shd w:val="clear" w:color="auto" w:fill="FFFFFF"/>
+        </w:rPr>
+      </w:pPr>
+      <w:r>
+        <w:rPr>
+          <w:rFonts w:ascii="Courier New" w:eastAsia="Times New Roman" w:hAnsi="Courier New" w:cs="Courier New"/>
+          <w:color w:val="1F1F1F"/>
+          <w:sz w:val="21"/>
+          <w:szCs w:val="21"/>
+          <w:shd w:val="clear" w:color="auto" w:fill="FFFFFF"/>
+        </w:rPr>
+        <w:t>**Bước 1: Tính diện tích của hình tròn**</w:t>
+      </w:r>
+    </w:p>
+    <w:p>
+      <w:pPr>
+        <w:spacing w:after="0" w:line="240" w:lineRule="auto"/>
+        <w:rPr>
+          <w:rFonts w:ascii="Courier New" w:eastAsia="Times New Roman" w:hAnsi="Courier New" w:cs="Courier New"/>
+          <w:color w:val="1F1F1F"/>
+          <w:sz w:val="21"/>
+          <w:szCs w:val="21"/>
+          <w:shd w:val="clear" w:color="auto" w:fill="FFFFFF"/>
+        </w:rPr>
+      </w:pPr>
+      <w:r>
+        <w:rPr>
+          <w:rFonts w:ascii="Courier New" w:eastAsia="Times New Roman" w:hAnsi="Courier New" w:cs="Courier New"/>
+          <w:color w:val="1F1F1F"/>
+          <w:sz w:val="21"/>
+          <w:szCs w:val="21"/>
+          <w:shd w:val="clear" w:color="auto" w:fill="FFFFFF"/>
+        </w:rPr>
+        <w:t>Hình tròn nội tiếp có bán kính $r = 3\</w:t>
+      </w:r>
+      <w:proofErr w:type="gramStart"/>
+      <w:r>
+        <w:rPr>
+          <w:rFonts w:ascii="Courier New" w:eastAsia="Times New Roman" w:hAnsi="Courier New" w:cs="Courier New"/>
+          <w:color w:val="1F1F1F"/>
+          <w:sz w:val="21"/>
+          <w:szCs w:val="21"/>
+          <w:shd w:val="clear" w:color="auto" w:fill="FFFFFF"/>
+        </w:rPr>
+        <w:t>text{ in.</w:t>
+      </w:r>
+      <w:proofErr w:type="gramEnd"/>
+      <w:r>
+        <w:rPr>
+          <w:rFonts w:ascii="Courier New" w:eastAsia="Times New Roman" w:hAnsi="Courier New" w:cs="Courier New"/>
+          <w:color w:val="1F1F1F"/>
+          <w:sz w:val="21"/>
+          <w:szCs w:val="21"/>
+          <w:shd w:val="clear" w:color="auto" w:fill="FFFFFF"/>
+        </w:rPr>
+        <w:t>}$</w:t>
+      </w:r>
+    </w:p>
+    <w:p>
+      <w:pPr>
+        <w:spacing w:after="0" w:line="240" w:lineRule="auto"/>
+        <w:rPr>
+          <w:rFonts w:ascii="Courier New" w:eastAsia="Times New Roman" w:hAnsi="Courier New" w:cs="Courier New"/>
+          <w:color w:val="1F1F1F"/>
+          <w:sz w:val="21"/>
+          <w:szCs w:val="21"/>
+          <w:shd w:val="clear" w:color="auto" w:fill="FFFFFF"/>
+        </w:rPr>
+      </w:pPr>
+      <w:r>
+        <w:rPr>
+          <w:rFonts w:ascii="Courier New" w:eastAsia="Times New Roman" w:hAnsi="Courier New" w:cs="Courier New"/>
+          <w:color w:val="1F1F1F"/>
+          <w:sz w:val="21"/>
+          <w:szCs w:val="21"/>
+          <w:shd w:val="clear" w:color="auto" w:fill="FFFFFF"/>
+        </w:rPr>
+        <w:t>Diện tích hình tròn là:</w:t>
+      </w:r>
+    </w:p>
+    <w:p>
+      <w:pPr>
+        <w:spacing w:after="0" w:line="240" w:lineRule="auto"/>
+        <w:rPr>
+          <w:rFonts w:ascii="Courier New" w:eastAsia="Times New Roman" w:hAnsi="Courier New" w:cs="Courier New"/>
+          <w:color w:val="1F1F1F"/>
+          <w:sz w:val="21"/>
+          <w:szCs w:val="21"/>
+          <w:shd w:val="clear" w:color="auto" w:fill="FFFFFF"/>
+        </w:rPr>
+      </w:pPr>
+      <w:r>
+        <w:rPr>
+          <w:rFonts w:ascii="Courier New" w:eastAsia="Times New Roman" w:hAnsi="Courier New" w:cs="Courier New"/>
+          <w:color w:val="1F1F1F"/>
+          <w:sz w:val="21"/>
+          <w:szCs w:val="21"/>
+          <w:shd w:val="clear" w:color="auto" w:fill="FFFFFF"/>
+        </w:rPr>
+        <w:t>$$A_{\text{circle}} = \pi r^2 = \pi \cdot 3^2 = 9\pi \approx 28.27\</w:t>
+      </w:r>
+      <w:proofErr w:type="gramStart"/>
+      <w:r>
+        <w:rPr>
+          <w:rFonts w:ascii="Courier New" w:eastAsia="Times New Roman" w:hAnsi="Courier New" w:cs="Courier New"/>
+          <w:color w:val="1F1F1F"/>
+          <w:sz w:val="21"/>
+          <w:szCs w:val="21"/>
+          <w:shd w:val="clear" w:color="auto" w:fill="FFFFFF"/>
+        </w:rPr>
+        <w:t>text{ in.</w:t>
+      </w:r>
+      <w:proofErr w:type="gramEnd"/>
+      <w:r>
+        <w:rPr>
+          <w:rFonts w:ascii="Courier New" w:eastAsia="Times New Roman" w:hAnsi="Courier New" w:cs="Courier New"/>
+          <w:color w:val="1F1F1F"/>
+          <w:sz w:val="21"/>
+          <w:szCs w:val="21"/>
+          <w:shd w:val="clear" w:color="auto" w:fill="FFFFFF"/>
+        </w:rPr>
+        <w:t>}^2$$</w:t>
+      </w:r>
+    </w:p>
+    <w:p>
+      <w:pPr>
+        <w:spacing w:after="0" w:line="240" w:lineRule="auto"/>
+        <w:rPr>
+          <w:rFonts w:ascii="Courier New" w:eastAsia="Times New Roman" w:hAnsi="Courier New" w:cs="Courier New"/>
+          <w:color w:val="1F1F1F"/>
+          <w:sz w:val="21"/>
+          <w:szCs w:val="21"/>
+          <w:shd w:val="clear" w:color="auto" w:fill="FFFFFF"/>
+        </w:rPr>
+      </w:pPr>
+    </w:p>
+    <w:p>
+      <w:pPr>
+        <w:spacing w:after="0" w:line="240" w:lineRule="auto"/>
+        <w:rPr>
+          <w:rFonts w:ascii="Courier New" w:eastAsia="Times New Roman" w:hAnsi="Courier New" w:cs="Courier New"/>
+          <w:color w:val="1F1F1F"/>
+          <w:sz w:val="21"/>
+          <w:szCs w:val="21"/>
+          <w:shd w:val="clear" w:color="auto" w:fill="FFFFFF"/>
+        </w:rPr>
+      </w:pPr>
+      <w:r>
+        <w:rPr>
+          <w:rFonts w:ascii="Courier New" w:eastAsia="Times New Roman" w:hAnsi="Courier New" w:cs="Courier New"/>
+          <w:color w:val="1F1F1F"/>
+          <w:sz w:val="21"/>
+          <w:szCs w:val="21"/>
+          <w:shd w:val="clear" w:color="auto" w:fill="FFFFFF"/>
+        </w:rPr>
+        <w:t>**Bước 2: Tính diện tích của tam giác đều**</w:t>
+      </w:r>
+    </w:p>
+    <w:p>
+      <w:pPr>
+        <w:spacing w:after="0" w:line="240" w:lineRule="auto"/>
+        <w:rPr>
+          <w:rFonts w:ascii="Courier New" w:eastAsia="Times New Roman" w:hAnsi="Courier New" w:cs="Courier New"/>
+          <w:color w:val="1F1F1F"/>
+          <w:sz w:val="21"/>
+          <w:szCs w:val="21"/>
+          <w:shd w:val="clear" w:color="auto" w:fill="FFFFFF"/>
+        </w:rPr>
+      </w:pPr>
+      <w:r>
+        <w:rPr>
+          <w:rFonts w:ascii="Courier New" w:eastAsia="Times New Roman" w:hAnsi="Courier New" w:cs="Courier New"/>
+          <w:color w:val="1F1F1F"/>
+          <w:sz w:val="21"/>
+          <w:szCs w:val="21"/>
+          <w:shd w:val="clear" w:color="auto" w:fill="FFFFFF"/>
+        </w:rPr>
+        <w:t xml:space="preserve">Vì tam giác là tam giác đều và hình tròn là đường tròn nội tiếp tam giác, tâm của hình tròn đồng thời là trọng tâm của tam giác. </w:t>
+      </w:r>
+    </w:p>
+    <w:p>
+      <w:pPr>
+        <w:spacing w:after="0" w:line="240" w:lineRule="auto"/>
+        <w:rPr>
+          <w:rFonts w:ascii="Courier New" w:eastAsia="Times New Roman" w:hAnsi="Courier New" w:cs="Courier New"/>
+          <w:color w:val="1F1F1F"/>
+          <w:sz w:val="21"/>
+          <w:szCs w:val="21"/>
+          <w:shd w:val="clear" w:color="auto" w:fill="FFFFFF"/>
+        </w:rPr>
+      </w:pPr>
+      <w:r>
+        <w:rPr>
+          <w:rFonts w:ascii="Courier New" w:eastAsia="Times New Roman" w:hAnsi="Courier New" w:cs="Courier New"/>
+          <w:color w:val="1F1F1F"/>
+          <w:sz w:val="21"/>
+          <w:szCs w:val="21"/>
+          <w:shd w:val="clear" w:color="auto" w:fill="FFFFFF"/>
+        </w:rPr>
+        <w:t>Do đó, bán kính $r$ bằng một phần ba đường cao $h$ của tam giác đều:</w:t>
+      </w:r>
+    </w:p>
+    <w:p>
+      <w:pPr>
+        <w:spacing w:after="0" w:line="240" w:lineRule="auto"/>
+        <w:rPr>
+          <w:rFonts w:ascii="Courier New" w:eastAsia="Times New Roman" w:hAnsi="Courier New" w:cs="Courier New"/>
+          <w:color w:val="1F1F1F"/>
+          <w:sz w:val="21"/>
+          <w:szCs w:val="21"/>
+          <w:shd w:val="clear" w:color="auto" w:fill="FFFFFF"/>
+        </w:rPr>
+      </w:pPr>
+      <w:r>
+        <w:rPr>
+          <w:rFonts w:ascii="Courier New" w:eastAsia="Times New Roman" w:hAnsi="Courier New" w:cs="Courier New"/>
+          <w:color w:val="1F1F1F"/>
+          <w:sz w:val="21"/>
+          <w:szCs w:val="21"/>
+          <w:shd w:val="clear" w:color="auto" w:fill="FFFFFF"/>
+        </w:rPr>
+        <w:t>$$h = 3r = 3 \times 3 = 9\</w:t>
+      </w:r>
+      <w:proofErr w:type="gramStart"/>
+      <w:r>
+        <w:rPr>
+          <w:rFonts w:ascii="Courier New" w:eastAsia="Times New Roman" w:hAnsi="Courier New" w:cs="Courier New"/>
+          <w:color w:val="1F1F1F"/>
+          <w:sz w:val="21"/>
+          <w:szCs w:val="21"/>
+          <w:shd w:val="clear" w:color="auto" w:fill="FFFFFF"/>
+        </w:rPr>
+        <w:t>text{ in.</w:t>
+      </w:r>
+      <w:proofErr w:type="gramEnd"/>
+      <w:r>
+        <w:rPr>
+          <w:rFonts w:ascii="Courier New" w:eastAsia="Times New Roman" w:hAnsi="Courier New" w:cs="Courier New"/>
+          <w:color w:val="1F1F1F"/>
+          <w:sz w:val="21"/>
+          <w:szCs w:val="21"/>
+          <w:shd w:val="clear" w:color="auto" w:fill="FFFFFF"/>
+        </w:rPr>
+        <w:t>}$$</w:t>
+      </w:r>
+    </w:p>
+    <w:p>
+      <w:pPr>
+        <w:spacing w:after="0" w:line="240" w:lineRule="auto"/>
+        <w:rPr>
+          <w:rFonts w:ascii="Courier New" w:eastAsia="Times New Roman" w:hAnsi="Courier New" w:cs="Courier New"/>
+          <w:color w:val="1F1F1F"/>
+          <w:sz w:val="21"/>
+          <w:szCs w:val="21"/>
+          <w:shd w:val="clear" w:color="auto" w:fill="FFFFFF"/>
+        </w:rPr>
+      </w:pPr>
+    </w:p>
+    <w:p>
+      <w:pPr>
+        <w:spacing w:after="0" w:line="240" w:lineRule="auto"/>
+        <w:rPr>
+          <w:rFonts w:ascii="Courier New" w:eastAsia="Times New Roman" w:hAnsi="Courier New" w:cs="Courier New"/>
+          <w:color w:val="1F1F1F"/>
+          <w:sz w:val="21"/>
+          <w:szCs w:val="21"/>
+          <w:shd w:val="clear" w:color="auto" w:fill="FFFFFF"/>
+        </w:rPr>
+      </w:pPr>
+      <w:r>
+        <w:rPr>
+          <w:rFonts w:ascii="Courier New" w:eastAsia="Times New Roman" w:hAnsi="Courier New" w:cs="Courier New"/>
+          <w:color w:val="1F1F1F"/>
+          <w:sz w:val="21"/>
+          <w:szCs w:val="21"/>
+          <w:shd w:val="clear" w:color="auto" w:fill="FFFFFF"/>
+        </w:rPr>
+        <w:t>Gọi $s$ là độ dài cạnh của tam giác đều. Chiều cao của tam giác đều liên hệ với cạnh qua công thức:</w:t>
+      </w:r>
+    </w:p>
+    <w:p>
+      <w:pPr>
+        <w:spacing w:after="0" w:line="240" w:lineRule="auto"/>
+        <w:rPr>
+          <w:rFonts w:ascii="Courier New" w:eastAsia="Times New Roman" w:hAnsi="Courier New" w:cs="Courier New"/>
+          <w:color w:val="1F1F1F"/>
+          <w:sz w:val="21"/>
+          <w:szCs w:val="21"/>
+          <w:shd w:val="clear" w:color="auto" w:fill="FFFFFF"/>
+        </w:rPr>
+      </w:pPr>
+      <w:r>
+        <w:rPr>
+          <w:rFonts w:ascii="Courier New" w:eastAsia="Times New Roman" w:hAnsi="Courier New" w:cs="Courier New"/>
+          <w:color w:val="1F1F1F"/>
+          <w:sz w:val="21"/>
+          <w:szCs w:val="21"/>
+          <w:shd w:val="clear" w:color="auto" w:fill="FFFFFF"/>
+        </w:rPr>
+        <w:t>$$h = \frac{s\</w:t>
+      </w:r>
+      <w:proofErr w:type="gramStart"/>
+      <w:r>
+        <w:rPr>
+          <w:rFonts w:ascii="Courier New" w:eastAsia="Times New Roman" w:hAnsi="Courier New" w:cs="Courier New"/>
+          <w:color w:val="1F1F1F"/>
+          <w:sz w:val="21"/>
+          <w:szCs w:val="21"/>
+          <w:shd w:val="clear" w:color="auto" w:fill="FFFFFF"/>
+        </w:rPr>
+        <w:t>sqrt{</w:t>
+      </w:r>
+      <w:proofErr w:type="gramEnd"/>
+      <w:r>
+        <w:rPr>
+          <w:rFonts w:ascii="Courier New" w:eastAsia="Times New Roman" w:hAnsi="Courier New" w:cs="Courier New"/>
+          <w:color w:val="1F1F1F"/>
+          <w:sz w:val="21"/>
+          <w:szCs w:val="21"/>
+          <w:shd w:val="clear" w:color="auto" w:fill="FFFFFF"/>
+        </w:rPr>
+        <w:t>3}}{2} \implies s = \frac{2h}{\sqrt{3}} = \frac{2 \times 9}{\sqrt{3}} = 6\sqrt{3}\text{ in.}$$</w:t>
+      </w:r>
+    </w:p>
+    <w:p>
+      <w:pPr>
+        <w:spacing w:after="0" w:line="240" w:lineRule="auto"/>
+        <w:rPr>
+          <w:rFonts w:ascii="Courier New" w:eastAsia="Times New Roman" w:hAnsi="Courier New" w:cs="Courier New"/>
+          <w:color w:val="1F1F1F"/>
+          <w:sz w:val="21"/>
+          <w:szCs w:val="21"/>
+          <w:shd w:val="clear" w:color="auto" w:fill="FFFFFF"/>
+        </w:rPr>
+      </w:pPr>
+    </w:p>
+    <w:p>
+      <w:pPr>
+        <w:spacing w:after="0" w:line="240" w:lineRule="auto"/>
+        <w:rPr>
+          <w:rFonts w:ascii="Courier New" w:eastAsia="Times New Roman" w:hAnsi="Courier New" w:cs="Courier New"/>
+          <w:color w:val="1F1F1F"/>
+          <w:sz w:val="21"/>
+          <w:szCs w:val="21"/>
+          <w:shd w:val="clear" w:color="auto" w:fill="FFFFFF"/>
+        </w:rPr>
+      </w:pPr>
+      <w:r>
+        <w:rPr>
+          <w:rFonts w:ascii="Courier New" w:eastAsia="Times New Roman" w:hAnsi="Courier New" w:cs="Courier New"/>
+          <w:color w:val="1F1F1F"/>
+          <w:sz w:val="21"/>
+          <w:szCs w:val="21"/>
+          <w:shd w:val="clear" w:color="auto" w:fill="FFFFFF"/>
+        </w:rPr>
+        <w:t>Diện tích của tam giác đều là:</w:t>
+      </w:r>
+    </w:p>
+    <w:p>
+      <w:pPr>
+        <w:spacing w:after="0" w:line="240" w:lineRule="auto"/>
+        <w:rPr>
+          <w:rFonts w:ascii="Courier New" w:eastAsia="Times New Roman" w:hAnsi="Courier New" w:cs="Courier New"/>
+          <w:color w:val="1F1F1F"/>
+          <w:sz w:val="21"/>
+          <w:szCs w:val="21"/>
+          <w:shd w:val="clear" w:color="auto" w:fill="FFFFFF"/>
+        </w:rPr>
+      </w:pPr>
+      <w:r>
+        <w:rPr>
+          <w:rFonts w:ascii="Courier New" w:eastAsia="Times New Roman" w:hAnsi="Courier New" w:cs="Courier New"/>
+          <w:color w:val="1F1F1F"/>
+          <w:sz w:val="21"/>
+          <w:szCs w:val="21"/>
+          <w:shd w:val="clear" w:color="auto" w:fill="FFFFFF"/>
+        </w:rPr>
+        <w:t>$$A_{\text{triangle}} = \</w:t>
+      </w:r>
+      <w:proofErr w:type="gramStart"/>
+      <w:r>
+        <w:rPr>
+          <w:rFonts w:ascii="Courier New" w:eastAsia="Times New Roman" w:hAnsi="Courier New" w:cs="Courier New"/>
+          <w:color w:val="1F1F1F"/>
+          <w:sz w:val="21"/>
+          <w:szCs w:val="21"/>
+          <w:shd w:val="clear" w:color="auto" w:fill="FFFFFF"/>
+        </w:rPr>
+        <w:t>frac{</w:t>
+      </w:r>
+      <w:proofErr w:type="gramEnd"/>
+      <w:r>
+        <w:rPr>
+          <w:rFonts w:ascii="Courier New" w:eastAsia="Times New Roman" w:hAnsi="Courier New" w:cs="Courier New"/>
+          <w:color w:val="1F1F1F"/>
+          <w:sz w:val="21"/>
+          <w:szCs w:val="21"/>
+          <w:shd w:val="clear" w:color="auto" w:fill="FFFFFF"/>
+        </w:rPr>
+        <w:t>1}{2} \cdot s \cdot h = \frac{1}{2} \cdot 6\sqrt{3} \cdot 9 = 27\sqrt{3} \approx 46.77\text{ in.}^2$$</w:t>
+      </w:r>
+    </w:p>
+    <w:p>
+      <w:pPr>
+        <w:spacing w:after="0" w:line="240" w:lineRule="auto"/>
+        <w:rPr>
+          <w:rFonts w:ascii="Courier New" w:eastAsia="Times New Roman" w:hAnsi="Courier New" w:cs="Courier New"/>
+          <w:color w:val="1F1F1F"/>
+          <w:sz w:val="21"/>
+          <w:szCs w:val="21"/>
+          <w:shd w:val="clear" w:color="auto" w:fill="FFFFFF"/>
+        </w:rPr>
+      </w:pPr>
+    </w:p>
+    <w:p>
+      <w:pPr>
+        <w:spacing w:after="0" w:line="240" w:lineRule="auto"/>
+        <w:rPr>
+          <w:rFonts w:ascii="Courier New" w:eastAsia="Times New Roman" w:hAnsi="Courier New" w:cs="Courier New"/>
+          <w:color w:val="1F1F1F"/>
+          <w:sz w:val="21"/>
+          <w:szCs w:val="21"/>
+          <w:shd w:val="clear" w:color="auto" w:fill="FFFFFF"/>
+        </w:rPr>
+      </w:pPr>
+      <w:r>
+        <w:rPr>
+          <w:rFonts w:ascii="Courier New" w:eastAsia="Times New Roman" w:hAnsi="Courier New" w:cs="Courier New"/>
+          <w:color w:val="1F1F1F"/>
+          <w:sz w:val="21"/>
+          <w:szCs w:val="21"/>
+          <w:shd w:val="clear" w:color="auto" w:fill="FFFFFF"/>
+        </w:rPr>
+        <w:t>**Bước 3: Tính diện tích phần tô màu**</w:t>
+      </w:r>
+    </w:p>
+    <w:p>
+      <w:pPr>
+        <w:spacing w:after="0" w:line="240" w:lineRule="auto"/>
+        <w:rPr>
+          <w:rFonts w:ascii="Courier New" w:eastAsia="Times New Roman" w:hAnsi="Courier New" w:cs="Courier New"/>
+          <w:color w:val="1F1F1F"/>
+          <w:sz w:val="21"/>
+          <w:szCs w:val="21"/>
+          <w:shd w:val="clear" w:color="auto" w:fill="FFFFFF"/>
+        </w:rPr>
+      </w:pPr>
+      <w:r>
+        <w:rPr>
+          <w:rFonts w:ascii="Courier New" w:eastAsia="Times New Roman" w:hAnsi="Courier New" w:cs="Courier New"/>
+          <w:color w:val="1F1F1F"/>
+          <w:sz w:val="21"/>
+          <w:szCs w:val="21"/>
+          <w:shd w:val="clear" w:color="auto" w:fill="FFFFFF"/>
+        </w:rPr>
+        <w:t>$$A_{\text{shaded}} = A_{\text{triangle}} - A_{\text{circle}} = 27\</w:t>
+      </w:r>
+      <w:proofErr w:type="gramStart"/>
+      <w:r>
+        <w:rPr>
+          <w:rFonts w:ascii="Courier New" w:eastAsia="Times New Roman" w:hAnsi="Courier New" w:cs="Courier New"/>
+          <w:color w:val="1F1F1F"/>
+          <w:sz w:val="21"/>
+          <w:szCs w:val="21"/>
+          <w:shd w:val="clear" w:color="auto" w:fill="FFFFFF"/>
+        </w:rPr>
+        <w:t>sqrt{</w:t>
+      </w:r>
+      <w:proofErr w:type="gramEnd"/>
+      <w:r>
+        <w:rPr>
+          <w:rFonts w:ascii="Courier New" w:eastAsia="Times New Roman" w:hAnsi="Courier New" w:cs="Courier New"/>
+          <w:color w:val="1F1F1F"/>
+          <w:sz w:val="21"/>
+          <w:szCs w:val="21"/>
+          <w:shd w:val="clear" w:color="auto" w:fill="FFFFFF"/>
+        </w:rPr>
+        <w:t>3} - 9\pi \approx 46.765 - 28.274 = 18.491\text{ in.}^2$$</w:t>
+      </w:r>
+    </w:p>
+    <w:p>
+      <w:pPr>
+        <w:spacing w:after="0" w:line="240" w:lineRule="auto"/>
+        <w:rPr>
+          <w:rFonts w:ascii="Courier New" w:eastAsia="Times New Roman" w:hAnsi="Courier New" w:cs="Courier New"/>
+          <w:color w:val="1F1F1F"/>
+          <w:sz w:val="21"/>
+          <w:szCs w:val="21"/>
+          <w:shd w:val="clear" w:color="auto" w:fill="FFFFFF"/>
+        </w:rPr>
+      </w:pPr>
+    </w:p>
+    <w:p>
+      <w:pPr>
+        <w:spacing w:after="0" w:line="240" w:lineRule="auto"/>
+        <w:rPr>
+          <w:rFonts w:ascii="Courier New" w:eastAsia="Times New Roman" w:hAnsi="Courier New" w:cs="Courier New"/>
+          <w:color w:val="1F1F1F"/>
+          <w:sz w:val="21"/>
+          <w:szCs w:val="21"/>
+          <w:shd w:val="clear" w:color="auto" w:fill="FFFFFF"/>
+        </w:rPr>
+      </w:pPr>
+      <w:r>
+        <w:rPr>
+          <w:rFonts w:ascii="Courier New" w:eastAsia="Times New Roman" w:hAnsi="Courier New" w:cs="Courier New"/>
+          <w:color w:val="1F1F1F"/>
+          <w:sz w:val="21"/>
+          <w:szCs w:val="21"/>
+          <w:shd w:val="clear" w:color="auto" w:fill="FFFFFF"/>
+        </w:rPr>
+        <w:t>Làm tròn đến chữ số thập phân thứ nhất, ta được diện tích phần tô màu là $18.5\</w:t>
+      </w:r>
+      <w:proofErr w:type="gramStart"/>
+      <w:r>
+        <w:rPr>
+          <w:rFonts w:ascii="Courier New" w:eastAsia="Times New Roman" w:hAnsi="Courier New" w:cs="Courier New"/>
+          <w:color w:val="1F1F1F"/>
+          <w:sz w:val="21"/>
+          <w:szCs w:val="21"/>
+          <w:shd w:val="clear" w:color="auto" w:fill="FFFFFF"/>
+        </w:rPr>
+        <w:t>text{ in.</w:t>
+      </w:r>
+      <w:proofErr w:type="gramEnd"/>
+      <w:r>
+        <w:rPr>
+          <w:rFonts w:ascii="Courier New" w:eastAsia="Times New Roman" w:hAnsi="Courier New" w:cs="Courier New"/>
+          <w:color w:val="1F1F1F"/>
+          <w:sz w:val="21"/>
+          <w:szCs w:val="21"/>
+          <w:shd w:val="clear" w:color="auto" w:fill="FFFFFF"/>
+        </w:rPr>
+        <w:t>}^2$.</w:t>
+      </w:r>
+    </w:p>
+    <w:p>
+      <w:pPr>
+        <w:spacing w:after="0" w:line="240" w:lineRule="auto"/>
+        <w:rPr>
+          <w:rFonts w:ascii="Courier New" w:eastAsia="Times New Roman" w:hAnsi="Courier New" w:cs="Courier New"/>
+          <w:color w:val="1F1F1F"/>
+          <w:sz w:val="21"/>
+          <w:szCs w:val="21"/>
+          <w:shd w:val="clear" w:color="auto" w:fill="FFFFFF"/>
+        </w:rPr>
+      </w:pPr>
+    </w:p>
+    <w:p>
+      <w:pPr>
+        <w:pBdr>
+          <w:bottom w:val="double" w:sz="6" w:space="1" w:color="auto"/>
+        </w:pBdr>
+        <w:spacing w:after="0" w:line="240" w:lineRule="auto"/>
+        <w:rPr>
+          <w:rFonts w:ascii="Courier New" w:eastAsia="Times New Roman" w:hAnsi="Courier New" w:cs="Courier New"/>
+          <w:color w:val="1F1F1F"/>
+          <w:sz w:val="21"/>
+          <w:szCs w:val="21"/>
+          <w:shd w:val="clear" w:color="auto" w:fill="FFFFFF"/>
+        </w:rPr>
+      </w:pPr>
+      <w:r>
+        <w:rPr>
+          <w:rFonts w:ascii="Courier New" w:eastAsia="Times New Roman" w:hAnsi="Courier New" w:cs="Courier New"/>
+          <w:color w:val="1F1F1F"/>
+          <w:sz w:val="21"/>
+          <w:szCs w:val="21"/>
+          <w:shd w:val="clear" w:color="auto" w:fill="FFFFFF"/>
+        </w:rPr>
+        <w:t>The final answer is \</w:t>
+      </w:r>
+      <w:proofErr w:type="gramStart"/>
+      <w:r>
+        <w:rPr>
+          <w:rFonts w:ascii="Courier New" w:eastAsia="Times New Roman" w:hAnsi="Courier New" w:cs="Courier New"/>
+          <w:color w:val="1F1F1F"/>
+          <w:sz w:val="21"/>
+          <w:szCs w:val="21"/>
+          <w:shd w:val="clear" w:color="auto" w:fill="FFFFFF"/>
+        </w:rPr>
+        <w:t>boxed{</w:t>
+      </w:r>
+      <w:proofErr w:type="gramEnd"/>
+      <w:r>
+        <w:rPr>
+          <w:rFonts w:ascii="Courier New" w:eastAsia="Times New Roman" w:hAnsi="Courier New" w:cs="Courier New"/>
+          <w:color w:val="1F1F1F"/>
+          <w:sz w:val="21"/>
+          <w:szCs w:val="21"/>
+          <w:shd w:val="clear" w:color="auto" w:fill="FFFFFF"/>
+        </w:rPr>
+        <w:t>18.5}</w:t>
+      </w:r>
+    </w:p>
+    <w:p>
+      <w:pPr>
+        <w:rPr>
+          <w:rFonts w:ascii="Courier New" w:eastAsia="Times New Roman" w:hAnsi="Courier New" w:cs="Courier New"/>
+          <w:color w:val="1F1F1F"/>
+          <w:sz w:val="21"/>
+          <w:szCs w:val="21"/>
+          <w:shd w:val="clear" w:color="auto" w:fill="FFFFFF"/>
+        </w:rPr>
+      </w:pPr>
+    </w:p>
+    <w:p>
+      <w:pPr>
+        <w:spacing w:after="0" w:line="240" w:lineRule="auto"/>
+        <w:rPr>
+          <w:rFonts w:ascii="Times New Roman" w:eastAsia="Times New Roman" w:hAnsi="Times New Roman" w:cs="Times New Roman"/>
+          <w:b/>
+          <w:color w:val="1F1F1F"/>
+          <w:sz w:val="24"/>
+          <w:szCs w:val="24"/>
+        </w:rPr>
+      </w:pPr>
+      <w:r>
+        <w:rPr>
+          <w:rFonts w:ascii="Times New Roman" w:eastAsia="Times New Roman" w:hAnsi="Times New Roman" w:cs="Times New Roman"/>
+          <w:b/>
+          <w:color w:val="1F1F1F"/>
+          <w:sz w:val="24"/>
+          <w:szCs w:val="24"/>
+        </w:rPr>
+        <w:t>Dưới đây là nhận xét và đánh giá chi tiết về kết quả giải toán của mô hình sau 2 epoch:</w:t>
+      </w:r>
+    </w:p>
+    <w:p>
+      <w:pPr>
+        <w:spacing w:after="0" w:line="240" w:lineRule="auto"/>
+        <w:rPr>
+          <w:rFonts w:ascii="Times New Roman" w:eastAsia="Times New Roman" w:hAnsi="Times New Roman" w:cs="Times New Roman"/>
+          <w:color w:val="1F1F1F"/>
+          <w:sz w:val="24"/>
+          <w:szCs w:val="24"/>
+        </w:rPr>
+      </w:pPr>
+    </w:p>
+    <w:p>
+      <w:pPr>
+        <w:spacing w:before="100" w:beforeAutospacing="1" w:after="0" w:line="240" w:lineRule="auto"/>
+        <w:outlineLvl w:val="2"/>
+        <w:rPr>
+          <w:rFonts w:ascii="Times New Roman" w:eastAsia="Times New Roman" w:hAnsi="Times New Roman" w:cs="Times New Roman"/>
+          <w:b/>
+          <w:bCs/>
+          <w:color w:val="1F1F1F"/>
+          <w:sz w:val="27"/>
+          <w:szCs w:val="27"/>
+        </w:rPr>
+      </w:pPr>
+      <w:r>
+        <w:rPr>
+          <w:rFonts w:ascii="Times New Roman" w:eastAsia="Times New Roman" w:hAnsi="Times New Roman" w:cs="Times New Roman"/>
+          <w:b/>
+          <w:bCs/>
+          <w:color w:val="1F1F1F"/>
+          <w:sz w:val="27"/>
+          <w:szCs w:val="27"/>
+        </w:rPr>
+        <w:t>1. Điểm đạt được (Ưu điểm)</w:t>
+      </w:r>
+    </w:p>
+    <w:p>
+      <w:pPr>
+        <w:numPr>
+          <w:ilvl w:val="0"/>
+          <w:numId w:val="17"/>
+        </w:numPr>
+        <w:spacing w:before="100" w:beforeAutospacing="1" w:after="0" w:line="240" w:lineRule="auto"/>
+        <w:rPr>
+          <w:rFonts w:ascii="Times New Roman" w:eastAsia="Times New Roman" w:hAnsi="Times New Roman" w:cs="Times New Roman"/>
+          <w:color w:val="1F1F1F"/>
+          <w:sz w:val="24"/>
+          <w:szCs w:val="24"/>
+        </w:rPr>
+      </w:pPr>
+      <w:r>
+        <w:rPr>
+          <w:rFonts w:ascii="Times New Roman" w:eastAsia="Times New Roman" w:hAnsi="Times New Roman" w:cs="Times New Roman"/>
+          <w:b/>
+          <w:bCs/>
+          <w:color w:val="1F1F1F"/>
+          <w:sz w:val="24"/>
+          <w:szCs w:val="24"/>
+          <w:bdr w:val="none" w:sz="0" w:space="0" w:color="auto" w:frame="1"/>
+        </w:rPr>
+        <w:t>Hiểu đúng bản chất hình học ban đầu:</w:t>
+      </w:r>
+      <w:r>
+        <w:rPr>
+          <w:rFonts w:ascii="Times New Roman" w:eastAsia="Times New Roman" w:hAnsi="Times New Roman" w:cs="Times New Roman"/>
+          <w:color w:val="1F1F1F"/>
+          <w:sz w:val="24"/>
+          <w:szCs w:val="24"/>
+        </w:rPr>
+        <w:t xml:space="preserve"> Mô hình nhận diện chính xác phần tô màu là hiệu diện tích:</w:t>
+      </w:r>
+    </w:p>
+    <w:p>
+      <w:pPr>
+        <w:numPr>
+          <w:ilvl w:val="0"/>
+          <w:numId w:val="17"/>
+        </w:numPr>
+        <w:spacing w:before="100" w:beforeAutospacing="1" w:after="0" w:line="240" w:lineRule="auto"/>
+        <w:rPr>
+          <w:rFonts w:ascii="Times New Roman" w:eastAsia="Times New Roman" w:hAnsi="Times New Roman" w:cs="Times New Roman"/>
+          <w:color w:val="1F1F1F"/>
+          <w:sz w:val="24"/>
+          <w:szCs w:val="24"/>
+        </w:rPr>
+      </w:pPr>
+      <w:r>
+        <w:rPr>
+          <w:rFonts w:ascii="Times New Roman" w:eastAsia="Times New Roman" w:hAnsi="Times New Roman" w:cs="Times New Roman"/>
+          <w:color w:val="1F1F1F"/>
+          <w:sz w:val="24"/>
+          <w:szCs w:val="24"/>
+        </w:rPr>
+        <w:drawing>
+          <wp:inline distT="0" distB="0" distL="0" distR="0" wp14:anchorId="395419D5" wp14:editId="3BEBEF2D">
+            <wp:extent cx="5934903" cy="943107"/>
+            <wp:effectExtent l="0" t="0" r="0" b="9525"/>
+            <wp:docPr id="8" name="Picture 8"/>
+            <wp:cNvGraphicFramePr>
+              <a:graphicFrameLocks xmlns:a="http://schemas.openxmlformats.org/drawingml/2006/main" noChangeAspect="1"/>
+            </wp:cNvGraphicFramePr>
+            <a:graphic xmlns:a="http://schemas.openxmlformats.org/drawingml/2006/main">
+              <a:graphicData uri="http://schemas.openxmlformats.org/drawingml/2006/picture">
+                <pic:pic xmlns:pic="http://schemas.openxmlformats.org/drawingml/2006/picture">
+                  <pic:nvPicPr>
+                    <pic:cNvPr id="1" name=""/>
+                    <pic:cNvPicPr/>
+                  </pic:nvPicPr>
+                  <pic:blipFill>
+                    <a:blip r:embed="rId11"/>
+                    <a:stretch>
+                      <a:fillRect/>
+                    </a:stretch>
+                  </pic:blipFill>
+                  <pic:spPr>
+                    <a:xfrm>
+                      <a:off x="0" y="0"/>
+                      <a:ext cx="5934903" cy="943107"/>
+                    </a:xfrm>
+                    <a:prstGeom prst="rect">
+                      <a:avLst/>
+                    </a:prstGeom>
+                  </pic:spPr>
+                </pic:pic>
+              </a:graphicData>
+            </a:graphic>
+          </wp:inline>
+        </w:drawing>
+      </w:r>
+      <w:r>
+        <w:rPr>
+          <w:rFonts w:ascii="Times New Roman" w:eastAsia="Times New Roman" w:hAnsi="Times New Roman" w:cs="Times New Roman"/>
+          <w:b/>
+          <w:bCs/>
+          <w:color w:val="1F1F1F"/>
+          <w:sz w:val="24"/>
+          <w:szCs w:val="24"/>
+          <w:bdr w:val="none" w:sz="0" w:space="0" w:color="auto" w:frame="1"/>
+        </w:rPr>
+        <w:drawing>
+          <wp:inline distT="0" distB="0" distL="0" distR="0" wp14:anchorId="0A46AB06" wp14:editId="7194CD39">
+            <wp:extent cx="5943600" cy="821690"/>
+            <wp:effectExtent l="0" t="0" r="0" b="0"/>
+            <wp:docPr id="9" name="Picture 9"/>
+            <wp:cNvGraphicFramePr>
+              <a:graphicFrameLocks xmlns:a="http://schemas.openxmlformats.org/drawingml/2006/main" noChangeAspect="1"/>
+            </wp:cNvGraphicFramePr>
+            <a:graphic xmlns:a="http://schemas.openxmlformats.org/drawingml/2006/main">
+              <a:graphicData uri="http://schemas.openxmlformats.org/drawingml/2006/picture">
+                <pic:pic xmlns:pic="http://schemas.openxmlformats.org/drawingml/2006/picture">
+                  <pic:nvPicPr>
+                    <pic:cNvPr id="1" name=""/>
+                    <pic:cNvPicPr/>
+                  </pic:nvPicPr>
+                  <pic:blipFill>
+                    <a:blip r:embed="rId12"/>
+                    <a:stretch>
+                      <a:fillRect/>
+                    </a:stretch>
+                  </pic:blipFill>
+                  <pic:spPr>
+                    <a:xfrm>
+                      <a:off x="0" y="0"/>
+                      <a:ext cx="5943600" cy="821690"/>
+                    </a:xfrm>
+                    <a:prstGeom prst="rect">
+                      <a:avLst/>
+                    </a:prstGeom>
+                  </pic:spPr>
+                </pic:pic>
+              </a:graphicData>
+            </a:graphic>
+          </wp:inline>
+        </w:drawing>
+      </w:r>
+    </w:p>
+    <w:p>
+      <w:pPr>
+        <w:spacing w:before="100" w:beforeAutospacing="1" w:after="0" w:line="240" w:lineRule="auto"/>
+        <w:ind w:left="720"/>
+        <w:rPr>
+          <w:rFonts w:ascii="Times New Roman" w:eastAsia="Times New Roman" w:hAnsi="Times New Roman" w:cs="Times New Roman"/>
+          <w:color w:val="1F1F1F"/>
+          <w:sz w:val="24"/>
+          <w:szCs w:val="24"/>
+        </w:rPr>
+      </w:pPr>
+    </w:p>
+    <w:p>
+      <w:pPr>
+        <w:numPr>
+          <w:ilvl w:val="0"/>
+          <w:numId w:val="17"/>
+        </w:numPr>
+        <w:spacing w:before="100" w:beforeAutospacing="1" w:after="0" w:line="240" w:lineRule="auto"/>
+        <w:rPr>
+          <w:rFonts w:ascii="Times New Roman" w:eastAsia="Times New Roman" w:hAnsi="Times New Roman" w:cs="Times New Roman"/>
+          <w:color w:val="1F1F1F"/>
+          <w:sz w:val="24"/>
+          <w:szCs w:val="24"/>
+        </w:rPr>
+      </w:pPr>
+      <w:r>
+        <w:rPr>
+          <w:rFonts w:ascii="Times New Roman" w:eastAsia="Times New Roman" w:hAnsi="Times New Roman" w:cs="Times New Roman"/>
+          <w:b/>
+          <w:bCs/>
+          <w:color w:val="1F1F1F"/>
+          <w:sz w:val="24"/>
+          <w:szCs w:val="24"/>
+          <w:bdr w:val="none" w:sz="0" w:space="0" w:color="auto" w:frame="1"/>
+        </w:rPr>
+        <w:t>Định vị đúng cạnh tam giác:</w:t>
+      </w:r>
+      <w:r>
+        <w:rPr>
+          <w:rFonts w:ascii="Times New Roman" w:eastAsia="Times New Roman" w:hAnsi="Times New Roman" w:cs="Times New Roman"/>
+          <w:color w:val="1F1F1F"/>
+          <w:sz w:val="24"/>
+          <w:szCs w:val="24"/>
+        </w:rPr>
+        <w:t xml:space="preserve"> Bằng phương pháp lượng giác (</w:t>
+      </w:r>
+      <w:r>
+        <w:rPr>
+          <w:rFonts w:ascii="Times New Roman" w:eastAsia="Times New Roman" w:hAnsi="Times New Roman" w:cs="Times New Roman"/>
+          <w:color w:val="1F1F1F"/>
+          <w:sz w:val="24"/>
+          <w:szCs w:val="24"/>
+          <w:bdr w:val="none" w:sz="0" w:space="0" w:color="auto" w:frame="1"/>
+        </w:rPr>
+        <w:t>$\tan 30^\circ$</w:t>
+      </w:r>
+      <w:r>
+        <w:rPr>
+          <w:rFonts w:ascii="Times New Roman" w:eastAsia="Times New Roman" w:hAnsi="Times New Roman" w:cs="Times New Roman"/>
+          <w:color w:val="1F1F1F"/>
+          <w:sz w:val="24"/>
+          <w:szCs w:val="24"/>
+        </w:rPr>
+        <w:t>), mô hình đã tìm ra đúng cạnh tam giác đều:</w:t>
+      </w:r>
+    </w:p>
+    <w:p>
+      <w:pPr>
+        <w:spacing w:before="100" w:beforeAutospacing="1" w:after="0" w:line="240" w:lineRule="auto"/>
+        <w:ind w:left="720"/>
+        <w:rPr>
+          <w:rFonts w:ascii="Times New Roman" w:eastAsia="Times New Roman" w:hAnsi="Times New Roman" w:cs="Times New Roman"/>
+          <w:color w:val="1F1F1F"/>
+          <w:sz w:val="24"/>
+          <w:szCs w:val="24"/>
+        </w:rPr>
+      </w:pPr>
+      <w:r>
+        <w:rPr>
+          <w:rFonts w:ascii="Times New Roman" w:eastAsia="Times New Roman" w:hAnsi="Times New Roman" w:cs="Times New Roman"/>
+          <w:color w:val="1F1F1F"/>
+          <w:sz w:val="24"/>
+          <w:szCs w:val="24"/>
+        </w:rPr>
+        <w:drawing>
+          <wp:inline distT="0" distB="0" distL="0" distR="0" wp14:anchorId="6A1AF4E0" wp14:editId="2299E634">
+            <wp:extent cx="3658111" cy="857370"/>
+            <wp:effectExtent l="0" t="0" r="0" b="0"/>
+            <wp:docPr id="11" name="Picture 11"/>
+            <wp:cNvGraphicFramePr>
+              <a:graphicFrameLocks xmlns:a="http://schemas.openxmlformats.org/drawingml/2006/main" noChangeAspect="1"/>
+            </wp:cNvGraphicFramePr>
+            <a:graphic xmlns:a="http://schemas.openxmlformats.org/drawingml/2006/main">
+              <a:graphicData uri="http://schemas.openxmlformats.org/drawingml/2006/picture">
+                <pic:pic xmlns:pic="http://schemas.openxmlformats.org/drawingml/2006/picture">
+                  <pic:nvPicPr>
+                    <pic:cNvPr id="1" name=""/>
+                    <pic:cNvPicPr/>
+                  </pic:nvPicPr>
+                  <pic:blipFill>
+                    <a:blip r:embed="rId13"/>
+                    <a:stretch>
+                      <a:fillRect/>
+                    </a:stretch>
+                  </pic:blipFill>
+                  <pic:spPr>
+                    <a:xfrm>
+                      <a:off x="0" y="0"/>
+                      <a:ext cx="3658111" cy="857370"/>
+                    </a:xfrm>
+                    <a:prstGeom prst="rect">
+                      <a:avLst/>
+                    </a:prstGeom>
+                  </pic:spPr>
+                </pic:pic>
+              </a:graphicData>
+            </a:graphic>
+          </wp:inline>
+        </w:drawing>
+      </w:r>
+    </w:p>
+    <w:p>
+      <w:pPr>
+        <w:spacing w:before="100" w:beforeAutospacing="1" w:after="0" w:line="240" w:lineRule="auto"/>
+        <w:outlineLvl w:val="2"/>
+        <w:rPr>
+          <w:rFonts w:ascii="Times New Roman" w:eastAsia="Times New Roman" w:hAnsi="Times New Roman" w:cs="Times New Roman"/>
+          <w:b/>
+          <w:bCs/>
+          <w:color w:val="1F1F1F"/>
+          <w:sz w:val="27"/>
+          <w:szCs w:val="27"/>
+        </w:rPr>
+      </w:pPr>
+      <w:r>
+        <w:rPr>
+          <w:rFonts w:ascii="Times New Roman" w:eastAsia="Times New Roman" w:hAnsi="Times New Roman" w:cs="Times New Roman"/>
+          <w:b/>
+          <w:bCs/>
+          <w:color w:val="1F1F1F"/>
+          <w:sz w:val="27"/>
+          <w:szCs w:val="27"/>
+        </w:rPr>
+        <w:t>2. Lỗi sai nghiêm trọng (Nhược điểm)</w:t>
+      </w:r>
+    </w:p>
+    <w:p>
+      <w:pPr>
+        <w:numPr>
+          <w:ilvl w:val="0"/>
+          <w:numId w:val="18"/>
+        </w:numPr>
+        <w:spacing w:before="100" w:beforeAutospacing="1" w:after="0" w:line="240" w:lineRule="auto"/>
+        <w:rPr>
+          <w:rFonts w:ascii="Times New Roman" w:eastAsia="Times New Roman" w:hAnsi="Times New Roman" w:cs="Times New Roman"/>
+          <w:color w:val="1F1F1F"/>
+          <w:sz w:val="24"/>
+          <w:szCs w:val="24"/>
+        </w:rPr>
+      </w:pPr>
+      <w:r>
+        <w:rPr>
+          <w:rFonts w:ascii="Times New Roman" w:eastAsia="Times New Roman" w:hAnsi="Times New Roman" w:cs="Times New Roman"/>
+          <w:b/>
+          <w:bCs/>
+          <w:color w:val="1F1F1F"/>
+          <w:sz w:val="24"/>
+          <w:szCs w:val="24"/>
+          <w:bdr w:val="none" w:sz="0" w:space="0" w:color="auto" w:frame="1"/>
+        </w:rPr>
+        <w:t>Lỗi tính toán đại số cơ bản (Arithmetic/Simplification error):</w:t>
+      </w:r>
+    </w:p>
+    <w:p>
+      <w:pPr>
+        <w:numPr>
+          <w:ilvl w:val="1"/>
+          <w:numId w:val="18"/>
+        </w:numPr>
+        <w:spacing w:before="100" w:beforeAutospacing="1" w:after="0" w:line="240" w:lineRule="auto"/>
+        <w:rPr>
+          <w:rFonts w:ascii="Times New Roman" w:eastAsia="Times New Roman" w:hAnsi="Times New Roman" w:cs="Times New Roman"/>
+          <w:color w:val="1F1F1F"/>
+          <w:sz w:val="24"/>
+          <w:szCs w:val="24"/>
+        </w:rPr>
+      </w:pPr>
+      <w:r>
+        <w:rPr>
+          <w:rFonts w:ascii="Times New Roman" w:eastAsia="Times New Roman" w:hAnsi="Times New Roman" w:cs="Times New Roman"/>
+          <w:color w:val="1F1F1F"/>
+          <w:sz w:val="24"/>
+          <w:szCs w:val="24"/>
+        </w:rPr>
+        <w:t>Tại bước tính diện tích tam giác:</w:t>
+      </w:r>
+    </w:p>
+    <w:p>
+      <w:pPr>
+        <w:numPr>
+          <w:ilvl w:val="0"/>
+          <w:numId w:val="18"/>
+        </w:numPr>
+        <w:spacing w:before="100" w:beforeAutospacing="1" w:after="0" w:line="240" w:lineRule="auto"/>
+        <w:rPr>
+          <w:rFonts w:ascii="Times New Roman" w:eastAsia="Times New Roman" w:hAnsi="Times New Roman" w:cs="Times New Roman"/>
+          <w:color w:val="1F1F1F"/>
+          <w:sz w:val="24"/>
+          <w:szCs w:val="24"/>
+        </w:rPr>
+      </w:pPr>
+      <w:r>
+        <w:rPr>
+          <w:rFonts w:ascii="Times New Roman" w:eastAsia="Times New Roman" w:hAnsi="Times New Roman" w:cs="Times New Roman"/>
+          <w:color w:val="1F1F1F"/>
+          <w:sz w:val="24"/>
+          <w:szCs w:val="24"/>
+        </w:rPr>
+        <w:lastRenderedPageBreak/>
+        <w:drawing>
+          <wp:inline distT="0" distB="0" distL="0" distR="0" wp14:anchorId="3336EE57" wp14:editId="129C2320">
+            <wp:extent cx="5943600" cy="1764665"/>
+            <wp:effectExtent l="0" t="0" r="0" b="6985"/>
+            <wp:docPr id="12" name="Picture 12"/>
+            <wp:cNvGraphicFramePr>
+              <a:graphicFrameLocks xmlns:a="http://schemas.openxmlformats.org/drawingml/2006/main" noChangeAspect="1"/>
+            </wp:cNvGraphicFramePr>
+            <a:graphic xmlns:a="http://schemas.openxmlformats.org/drawingml/2006/main">
+              <a:graphicData uri="http://schemas.openxmlformats.org/drawingml/2006/picture">
+                <pic:pic xmlns:pic="http://schemas.openxmlformats.org/drawingml/2006/picture">
+                  <pic:nvPicPr>
+                    <pic:cNvPr id="1" name=""/>
+                    <pic:cNvPicPr/>
+                  </pic:nvPicPr>
+                  <pic:blipFill>
+                    <a:blip r:embed="rId14"/>
+                    <a:stretch>
+                      <a:fillRect/>
+                    </a:stretch>
+                  </pic:blipFill>
+                  <pic:spPr>
+                    <a:xfrm>
+                      <a:off x="0" y="0"/>
+                      <a:ext cx="5943600" cy="1764665"/>
+                    </a:xfrm>
+                    <a:prstGeom prst="rect">
+                      <a:avLst/>
+                    </a:prstGeom>
+                  </pic:spPr>
+                </pic:pic>
+              </a:graphicData>
+            </a:graphic>
+          </wp:inline>
+        </w:drawing>
+      </w:r>
+      <w:r>
+        <w:rPr>
+          <w:rFonts w:ascii="Times New Roman" w:eastAsia="Times New Roman" w:hAnsi="Times New Roman" w:cs="Times New Roman"/>
+          <w:b/>
+          <w:bCs/>
+          <w:color w:val="1F1F1F"/>
+          <w:sz w:val="24"/>
+          <w:szCs w:val="24"/>
+          <w:bdr w:val="none" w:sz="0" w:space="0" w:color="auto" w:frame="1"/>
+        </w:rPr>
+        <w:br/>
+      </w:r>
+      <w:r>
+        <w:rPr>
+          <w:rFonts w:ascii="Times New Roman" w:eastAsia="Times New Roman" w:hAnsi="Times New Roman" w:cs="Times New Roman"/>
+          <w:color w:val="1F1F1F"/>
+          <w:sz w:val="24"/>
+          <w:szCs w:val="24"/>
+        </w:rPr>
+        <w:drawing>
+          <wp:inline distT="0" distB="0" distL="0" distR="0" wp14:anchorId="7FD8623D" wp14:editId="7C788BC1">
+            <wp:extent cx="5943600" cy="1409065"/>
+            <wp:effectExtent l="0" t="0" r="0" b="635"/>
+            <wp:docPr id="13" name="Picture 13"/>
+            <wp:cNvGraphicFramePr>
+              <a:graphicFrameLocks xmlns:a="http://schemas.openxmlformats.org/drawingml/2006/main" noChangeAspect="1"/>
+            </wp:cNvGraphicFramePr>
+            <a:graphic xmlns:a="http://schemas.openxmlformats.org/drawingml/2006/main">
+              <a:graphicData uri="http://schemas.openxmlformats.org/drawingml/2006/picture">
+                <pic:pic xmlns:pic="http://schemas.openxmlformats.org/drawingml/2006/picture">
+                  <pic:nvPicPr>
+                    <pic:cNvPr id="1" name=""/>
+                    <pic:cNvPicPr/>
+                  </pic:nvPicPr>
+                  <pic:blipFill>
+                    <a:blip r:embed="rId15"/>
+                    <a:stretch>
+                      <a:fillRect/>
+                    </a:stretch>
+                  </pic:blipFill>
+                  <pic:spPr>
+                    <a:xfrm>
+                      <a:off x="0" y="0"/>
+                      <a:ext cx="5943600" cy="1409065"/>
+                    </a:xfrm>
+                    <a:prstGeom prst="rect">
+                      <a:avLst/>
+                    </a:prstGeom>
+                  </pic:spPr>
+                </pic:pic>
+              </a:graphicData>
+            </a:graphic>
+          </wp:inline>
+        </w:drawing>
+      </w:r>
+      <w:r>
+        <w:rPr>
+          <w:rFonts w:ascii="Times New Roman" w:eastAsia="Times New Roman" w:hAnsi="Times New Roman" w:cs="Times New Roman"/>
+          <w:color w:val="1F1F1F"/>
+          <w:sz w:val="24"/>
+          <w:szCs w:val="24"/>
+        </w:rPr>
+        <w:t xml:space="preserve"> </w:t>
+      </w:r>
+    </w:p>
+    <w:p>
+      <w:pPr>
+        <w:spacing w:before="100" w:beforeAutospacing="1" w:after="0" w:line="240" w:lineRule="auto"/>
+        <w:outlineLvl w:val="2"/>
+        <w:rPr>
+          <w:rFonts w:ascii="Times New Roman" w:eastAsia="Times New Roman" w:hAnsi="Times New Roman" w:cs="Times New Roman"/>
+          <w:b/>
+          <w:bCs/>
+          <w:color w:val="1F1F1F"/>
+          <w:sz w:val="27"/>
+          <w:szCs w:val="27"/>
+        </w:rPr>
+      </w:pPr>
+      <w:r>
+        <w:rPr>
+          <w:rFonts w:ascii="Times New Roman" w:eastAsia="Times New Roman" w:hAnsi="Times New Roman" w:cs="Times New Roman"/>
+          <w:b/>
+          <w:bCs/>
+          <w:color w:val="1F1F1F"/>
+          <w:sz w:val="27"/>
+          <w:szCs w:val="27"/>
+        </w:rPr>
+        <w:t>3. Kết luận và Đánh giá tổng quan</w:t>
+      </w:r>
+    </w:p>
+    <w:p>
+      <w:pPr>
+        <w:numPr>
+          <w:ilvl w:val="0"/>
+          <w:numId w:val="19"/>
+        </w:numPr>
+        <w:spacing w:before="100" w:beforeAutospacing="1" w:after="0" w:line="240" w:lineRule="auto"/>
+        <w:rPr>
+          <w:rFonts w:ascii="Times New Roman" w:eastAsia="Times New Roman" w:hAnsi="Times New Roman" w:cs="Times New Roman"/>
+          <w:color w:val="1F1F1F"/>
+          <w:sz w:val="24"/>
+          <w:szCs w:val="24"/>
+        </w:rPr>
+      </w:pPr>
+      <w:r>
+        <w:rPr>
+          <w:rFonts w:ascii="Times New Roman" w:eastAsia="Times New Roman" w:hAnsi="Times New Roman" w:cs="Times New Roman"/>
+          <w:b/>
+          <w:bCs/>
+          <w:color w:val="1F1F1F"/>
+          <w:sz w:val="24"/>
+          <w:szCs w:val="24"/>
+          <w:bdr w:val="none" w:sz="0" w:space="0" w:color="auto" w:frame="1"/>
+        </w:rPr>
+        <w:t>Kết quả:</w:t>
+      </w:r>
+      <w:r>
+        <w:rPr>
+          <w:rFonts w:ascii="Times New Roman" w:eastAsia="Times New Roman" w:hAnsi="Times New Roman" w:cs="Times New Roman"/>
+          <w:color w:val="1F1F1F"/>
+          <w:sz w:val="24"/>
+          <w:szCs w:val="24"/>
+        </w:rPr>
+        <w:t xml:space="preserve"> </w:t>
+      </w:r>
+      <w:r>
+        <w:rPr>
+          <w:rFonts w:ascii="Times New Roman" w:eastAsia="Times New Roman" w:hAnsi="Times New Roman" w:cs="Times New Roman"/>
+          <w:b/>
+          <w:bCs/>
+          <w:color w:val="1F1F1F"/>
+          <w:sz w:val="24"/>
+          <w:szCs w:val="24"/>
+          <w:bdr w:val="none" w:sz="0" w:space="0" w:color="auto" w:frame="1"/>
+        </w:rPr>
+        <w:t>Sai</w:t>
+      </w:r>
+      <w:r>
+        <w:rPr>
+          <w:rFonts w:ascii="Times New Roman" w:eastAsia="Times New Roman" w:hAnsi="Times New Roman" w:cs="Times New Roman"/>
+          <w:color w:val="1F1F1F"/>
+          <w:sz w:val="24"/>
+          <w:szCs w:val="24"/>
+        </w:rPr>
+        <w:t xml:space="preserve"> (Mô hình ra </w:t>
+      </w:r>
+      <w:r>
+        <w:rPr>
+          <w:rFonts w:ascii="Times New Roman" w:eastAsia="Times New Roman" w:hAnsi="Times New Roman" w:cs="Times New Roman"/>
+          <w:b/>
+          <w:bCs/>
+          <w:color w:val="1F1F1F"/>
+          <w:sz w:val="24"/>
+          <w:szCs w:val="24"/>
+          <w:bdr w:val="none" w:sz="0" w:space="0" w:color="auto" w:frame="1"/>
+        </w:rPr>
+        <w:t>12.6</w:t>
+      </w:r>
+      <w:r>
+        <w:rPr>
+          <w:rFonts w:ascii="Times New Roman" w:eastAsia="Times New Roman" w:hAnsi="Times New Roman" w:cs="Times New Roman"/>
+          <w:color w:val="1F1F1F"/>
+          <w:sz w:val="24"/>
+          <w:szCs w:val="24"/>
+        </w:rPr>
+        <w:t xml:space="preserve">, trong khi đáp án chính xác là </w:t>
+      </w:r>
+      <w:r>
+        <w:rPr>
+          <w:rFonts w:ascii="Times New Roman" w:eastAsia="Times New Roman" w:hAnsi="Times New Roman" w:cs="Times New Roman"/>
+          <w:b/>
+          <w:bCs/>
+          <w:color w:val="1F1F1F"/>
+          <w:sz w:val="24"/>
+          <w:szCs w:val="24"/>
+          <w:bdr w:val="none" w:sz="0" w:space="0" w:color="auto" w:frame="1"/>
+        </w:rPr>
+        <w:t>18.5</w:t>
+      </w:r>
+      <w:r>
+        <w:rPr>
+          <w:rFonts w:ascii="Times New Roman" w:eastAsia="Times New Roman" w:hAnsi="Times New Roman" w:cs="Times New Roman"/>
+          <w:color w:val="1F1F1F"/>
+          <w:sz w:val="24"/>
+          <w:szCs w:val="24"/>
+        </w:rPr>
+        <w:t>).</w:t>
+      </w:r>
+    </w:p>
+    <w:p>
+      <w:pPr>
+        <w:numPr>
+          <w:ilvl w:val="0"/>
+          <w:numId w:val="19"/>
+        </w:numPr>
+        <w:spacing w:before="100" w:beforeAutospacing="1" w:after="0" w:line="240" w:lineRule="auto"/>
+        <w:rPr>
+          <w:rFonts w:ascii="Times New Roman" w:eastAsia="Times New Roman" w:hAnsi="Times New Roman" w:cs="Times New Roman"/>
+          <w:color w:val="1F1F1F"/>
+          <w:sz w:val="24"/>
+          <w:szCs w:val="24"/>
+        </w:rPr>
+      </w:pPr>
+      <w:r>
+        <w:rPr>
+          <w:rFonts w:ascii="Times New Roman" w:eastAsia="Times New Roman" w:hAnsi="Times New Roman" w:cs="Times New Roman"/>
+          <w:b/>
+          <w:bCs/>
+          <w:color w:val="1F1F1F"/>
+          <w:sz w:val="24"/>
+          <w:szCs w:val="24"/>
+          <w:bdr w:val="none" w:sz="0" w:space="0" w:color="auto" w:frame="1"/>
+        </w:rPr>
+        <w:t>Đánh giá mức độ sau 2 epoch:</w:t>
+      </w:r>
+      <w:r>
+        <w:rPr>
+          <w:rFonts w:ascii="Times New Roman" w:eastAsia="Times New Roman" w:hAnsi="Times New Roman" w:cs="Times New Roman"/>
+          <w:color w:val="1F1F1F"/>
+          <w:sz w:val="24"/>
+          <w:szCs w:val="24"/>
+        </w:rPr>
+        <w:br/>
+      </w:r>
+    </w:p>
+    <w:p>
+      <w:pPr>
+        <w:numPr>
+          <w:ilvl w:val="1"/>
+          <w:numId w:val="19"/>
+        </w:numPr>
+        <w:spacing w:before="100" w:beforeAutospacing="1" w:after="0" w:line="240" w:lineRule="auto"/>
+        <w:rPr>
+          <w:rFonts w:ascii="Times New Roman" w:eastAsia="Times New Roman" w:hAnsi="Times New Roman" w:cs="Times New Roman"/>
+          <w:color w:val="1F1F1F"/>
+          <w:sz w:val="24"/>
+          <w:szCs w:val="24"/>
+        </w:rPr>
+      </w:pPr>
+      <w:r>
+        <w:rPr>
+          <w:rFonts w:ascii="Times New Roman" w:eastAsia="Times New Roman" w:hAnsi="Times New Roman" w:cs="Times New Roman"/>
+          <w:color w:val="1F1F1F"/>
+          <w:sz w:val="24"/>
+          <w:szCs w:val="24"/>
+        </w:rPr>
+        <w:t>Khả năng hiểu bài toán (problem understanding) và định hướng giải đã tương đối tốt.</w:t>
+      </w:r>
+    </w:p>
+    <w:p>
+      <w:pPr>
+        <w:numPr>
+          <w:ilvl w:val="1"/>
+          <w:numId w:val="19"/>
+        </w:numPr>
+        <w:spacing w:before="100" w:beforeAutospacing="1" w:after="0" w:line="240" w:lineRule="auto"/>
+        <w:rPr>
+          <w:rFonts w:ascii="Times New Roman" w:eastAsia="Times New Roman" w:hAnsi="Times New Roman" w:cs="Times New Roman"/>
+          <w:color w:val="1F1F1F"/>
+          <w:sz w:val="24"/>
+          <w:szCs w:val="24"/>
+        </w:rPr>
+      </w:pPr>
+      <w:r>
+        <w:rPr>
+          <w:rFonts w:ascii="Times New Roman" w:eastAsia="Times New Roman" w:hAnsi="Times New Roman" w:cs="Times New Roman"/>
+          <w:color w:val="1F1F1F"/>
+          <w:sz w:val="24"/>
+          <w:szCs w:val="24"/>
+        </w:rPr>
+        <w:t>Tuy nhiên, năng lực biến đổi đại số cơ bản còn yếu, chưa có cơ chế kiểm tra chéo (self-correction/backtracking) khi gặp kết quả phi lý (diện tích âm) mà chọn cách "chữa cháy" sai logic.</w:t>
+      </w:r>
+    </w:p>
+    <w:p>
+      <w:pPr>
+        <w:numPr>
+          <w:ilvl w:val="0"/>
+          <w:numId w:val="19"/>
+        </w:numPr>
+        <w:spacing w:before="100" w:beforeAutospacing="1" w:after="0" w:line="240" w:lineRule="auto"/>
+        <w:rPr>
+          <w:rFonts w:ascii="Times New Roman" w:eastAsia="Times New Roman" w:hAnsi="Times New Roman" w:cs="Times New Roman"/>
+          <w:color w:val="1F1F1F"/>
+          <w:sz w:val="24"/>
+          <w:szCs w:val="24"/>
+        </w:rPr>
+      </w:pPr>
+      <w:r>
+        <w:rPr>
+          <w:rFonts w:ascii="Times New Roman" w:eastAsia="Times New Roman" w:hAnsi="Times New Roman" w:cs="Times New Roman"/>
+          <w:b/>
+          <w:bCs/>
+          <w:color w:val="1F1F1F"/>
+          <w:sz w:val="24"/>
+          <w:szCs w:val="24"/>
+          <w:bdr w:val="none" w:sz="0" w:space="0" w:color="auto" w:frame="1"/>
+        </w:rPr>
+        <w:t>Đề xuất cải thiện:</w:t>
+      </w:r>
+      <w:r>
+        <w:rPr>
+          <w:rFonts w:ascii="Times New Roman" w:eastAsia="Times New Roman" w:hAnsi="Times New Roman" w:cs="Times New Roman"/>
+          <w:color w:val="1F1F1F"/>
+          <w:sz w:val="24"/>
+          <w:szCs w:val="24"/>
+        </w:rPr>
+        <w:t xml:space="preserve"> Cần tăng số epoch huấn luyện, bổ sung dữ liệu có các bước suy luận từng bước (Chain-of-Thought) kèm các bài toán số học/đại số để rèn khả năng tính toán chuẩn xác.</w:t>
+      </w:r>
+    </w:p>
+    <w:p>
+      <w:pPr>
+        <w:rPr>
+          <w:rFonts w:ascii="Times New Roman" w:hAnsi="Times New Roman" w:cs="Times New Roman"/>
+          <w:sz w:val="28"/>
+          <w:szCs w:val="28"/>
+        </w:rPr>
+      </w:pPr>
+      <w:bookmarkStart w:id="0" w:name="_GoBack"/>
+      <w:bookmarkEnd w:id="0"/>
     </w:p>
     <w:sectPr>
       <w:pgSz w:w="12240" w:h="15840"/>
@@ -17829,6 +21463,155 @@
 <file path=word/numbering.xml><?xml version="1.0" encoding="utf-8"?>
 <w:numbering xmlns:wpc="http://schemas.microsoft.com/office/word/2010/wordprocessingCanvas" xmlns:cx="http://schemas.microsoft.com/office/drawing/2014/chartex" xmlns:mc="http://schemas.openxmlformats.org/markup-compatibility/2006" xmlns:o="urn:schemas-microsoft-com:office:office" xmlns:r="http://schemas.openxmlformats.org/officeDocument/2006/relationships" xmlns:m="http://schemas.openxmlformats.org/officeDocument/2006/math" xmlns:v="urn:schemas-microsoft-com:vml" xmlns:wp14="http://schemas.microsoft.com/office/word/2010/wordprocessingDrawing" xmlns:wp="http://schemas.openxmlformats.org/drawingml/2006/wordprocessingDrawing" xmlns:w10="urn:schemas-microsoft-com:office:word" xmlns:w="http://schemas.openxmlformats.org/wordprocessingml/2006/main" xmlns:w14="http://schemas.microsoft.com/office/word/2010/wordml" xmlns:w15="http://schemas.microsoft.com/office/word/2012/wordml" xmlns:w16se="http://schemas.microsoft.com/office/word/2015/wordml/symex" xmlns:wpg="http://schemas.microsoft.com/office/word/2010/wordprocessingGroup" xmlns:wpi="http://schemas.microsoft.com/office/word/2010/wordprocessingInk" xmlns:wne="http://schemas.microsoft.com/office/word/2006/wordml" xmlns:wps="http://schemas.microsoft.com/office/word/2010/wordprocessingShape" mc:Ignorable="w14 w15 w16se wp14">
   <w:abstractNum w:abstractNumId="0" w15:restartNumberingAfterBreak="0">
+    <w:nsid w:val="0A731650"/>
+    <w:multiLevelType w:val="multilevel"/>
+    <w:tmpl w:val="4CE69B5E"/>
+    <w:lvl w:ilvl="0">
+      <w:start w:val="1"/>
+      <w:numFmt w:val="bullet"/>
+      <w:lvlText w:val=""/>
+      <w:lvlJc w:val="left"/>
+      <w:pPr>
+        <w:tabs>
+          <w:tab w:val="num" w:pos="720"/>
+        </w:tabs>
+        <w:ind w:left="720" w:hanging="360"/>
+      </w:pPr>
+      <w:rPr>
+        <w:rFonts w:ascii="Symbol" w:hAnsi="Symbol" w:hint="default"/>
+        <w:sz w:val="20"/>
+      </w:rPr>
+    </w:lvl>
+    <w:lvl w:ilvl="1">
+      <w:start w:val="1"/>
+      <w:numFmt w:val="bullet"/>
+      <w:lvlText w:val="o"/>
+      <w:lvlJc w:val="left"/>
+      <w:pPr>
+        <w:tabs>
+          <w:tab w:val="num" w:pos="1440"/>
+        </w:tabs>
+        <w:ind w:left="1440" w:hanging="360"/>
+      </w:pPr>
+      <w:rPr>
+        <w:rFonts w:ascii="Courier New" w:hAnsi="Courier New" w:hint="default"/>
+        <w:sz w:val="20"/>
+      </w:rPr>
+    </w:lvl>
+    <w:lvl w:ilvl="2">
+      <w:start w:val="1"/>
+      <w:numFmt w:val="bullet"/>
+      <w:lvlText w:val=""/>
+      <w:lvlJc w:val="left"/>
+      <w:pPr>
+        <w:tabs>
+          <w:tab w:val="num" w:pos="2160"/>
+        </w:tabs>
+        <w:ind w:left="2160" w:hanging="360"/>
+      </w:pPr>
+      <w:rPr>
+        <w:rFonts w:ascii="Wingdings" w:hAnsi="Wingdings" w:hint="default"/>
+        <w:sz w:val="20"/>
+      </w:rPr>
+    </w:lvl>
+    <w:lvl w:ilvl="3" w:tentative="1">
+      <w:start w:val="1"/>
+      <w:numFmt w:val="bullet"/>
+      <w:lvlText w:val=""/>
+      <w:lvlJc w:val="left"/>
+      <w:pPr>
+        <w:tabs>
+          <w:tab w:val="num" w:pos="2880"/>
+        </w:tabs>
+        <w:ind w:left="2880" w:hanging="360"/>
+      </w:pPr>
+      <w:rPr>
+        <w:rFonts w:ascii="Wingdings" w:hAnsi="Wingdings" w:hint="default"/>
+        <w:sz w:val="20"/>
+      </w:rPr>
+    </w:lvl>
+    <w:lvl w:ilvl="4" w:tentative="1">
+      <w:start w:val="1"/>
+      <w:numFmt w:val="bullet"/>
+      <w:lvlText w:val=""/>
+      <w:lvlJc w:val="left"/>
+      <w:pPr>
+        <w:tabs>
+          <w:tab w:val="num" w:pos="3600"/>
+        </w:tabs>
+        <w:ind w:left="3600" w:hanging="360"/>
+      </w:pPr>
+      <w:rPr>
+        <w:rFonts w:ascii="Wingdings" w:hAnsi="Wingdings" w:hint="default"/>
+        <w:sz w:val="20"/>
+      </w:rPr>
+    </w:lvl>
+    <w:lvl w:ilvl="5" w:tentative="1">
+      <w:start w:val="1"/>
+      <w:numFmt w:val="bullet"/>
+      <w:lvlText w:val=""/>
+      <w:lvlJc w:val="left"/>
+      <w:pPr>
+        <w:tabs>
+          <w:tab w:val="num" w:pos="4320"/>
+        </w:tabs>
+        <w:ind w:left="4320" w:hanging="360"/>
+      </w:pPr>
+      <w:rPr>
+        <w:rFonts w:ascii="Wingdings" w:hAnsi="Wingdings" w:hint="default"/>
+        <w:sz w:val="20"/>
+      </w:rPr>
+    </w:lvl>
+    <w:lvl w:ilvl="6" w:tentative="1">
+      <w:start w:val="1"/>
+      <w:numFmt w:val="bullet"/>
+      <w:lvlText w:val=""/>
+      <w:lvlJc w:val="left"/>
+      <w:pPr>
+        <w:tabs>
+          <w:tab w:val="num" w:pos="5040"/>
+        </w:tabs>
+        <w:ind w:left="5040" w:hanging="360"/>
+      </w:pPr>
+      <w:rPr>
+        <w:rFonts w:ascii="Wingdings" w:hAnsi="Wingdings" w:hint="default"/>
+        <w:sz w:val="20"/>
+      </w:rPr>
+    </w:lvl>
+    <w:lvl w:ilvl="7" w:tentative="1">
+      <w:start w:val="1"/>
+      <w:numFmt w:val="bullet"/>
+      <w:lvlText w:val=""/>
+      <w:lvlJc w:val="left"/>
+      <w:pPr>
+        <w:tabs>
+          <w:tab w:val="num" w:pos="5760"/>
+        </w:tabs>
+        <w:ind w:left="5760" w:hanging="360"/>
+      </w:pPr>
+      <w:rPr>
+        <w:rFonts w:ascii="Wingdings" w:hAnsi="Wingdings" w:hint="default"/>
+        <w:sz w:val="20"/>
+      </w:rPr>
+    </w:lvl>
+    <w:lvl w:ilvl="8" w:tentative="1">
+      <w:start w:val="1"/>
+      <w:numFmt w:val="bullet"/>
+      <w:lvlText w:val=""/>
+      <w:lvlJc w:val="left"/>
+      <w:pPr>
+        <w:tabs>
+          <w:tab w:val="num" w:pos="6480"/>
+        </w:tabs>
+        <w:ind w:left="6480" w:hanging="360"/>
+      </w:pPr>
+      <w:rPr>
+        <w:rFonts w:ascii="Wingdings" w:hAnsi="Wingdings" w:hint="default"/>
+        <w:sz w:val="20"/>
+      </w:rPr>
+    </w:lvl>
+  </w:abstractNum>
+  <w:abstractNum w:abstractNumId="1" w15:restartNumberingAfterBreak="0">
     <w:nsid w:val="0D8255F3"/>
     <w:multiLevelType w:val="multilevel"/>
     <w:tmpl w:val="2F94BAF2"/>
@@ -17977,7 +21760,7 @@
       </w:rPr>
     </w:lvl>
   </w:abstractNum>
-  <w:abstractNum w:abstractNumId="1" w15:restartNumberingAfterBreak="0">
+  <w:abstractNum w:abstractNumId="2" w15:restartNumberingAfterBreak="0">
     <w:nsid w:val="1F93120E"/>
     <w:multiLevelType w:val="multilevel"/>
     <w:tmpl w:val="984AD6EA"/>
@@ -18126,7 +21909,7 @@
       </w:rPr>
     </w:lvl>
   </w:abstractNum>
-  <w:abstractNum w:abstractNumId="2" w15:restartNumberingAfterBreak="0">
+  <w:abstractNum w:abstractNumId="3" w15:restartNumberingAfterBreak="0">
     <w:nsid w:val="204B0688"/>
     <w:multiLevelType w:val="multilevel"/>
     <w:tmpl w:val="665652FE"/>
@@ -18275,10 +22058,10 @@
       </w:rPr>
     </w:lvl>
   </w:abstractNum>
-  <w:abstractNum w:abstractNumId="3" w15:restartNumberingAfterBreak="0">
-    <w:nsid w:val="25765944"/>
+  <w:abstractNum w:abstractNumId="4" w15:restartNumberingAfterBreak="0">
+    <w:nsid w:val="20714409"/>
     <w:multiLevelType w:val="multilevel"/>
-    <w:tmpl w:val="B9D6D4F0"/>
+    <w:tmpl w:val="A86A80EA"/>
     <w:lvl w:ilvl="0">
       <w:start w:val="1"/>
       <w:numFmt w:val="bullet"/>
@@ -18424,7 +22207,156 @@
       </w:rPr>
     </w:lvl>
   </w:abstractNum>
-  <w:abstractNum w:abstractNumId="4" w15:restartNumberingAfterBreak="0">
+  <w:abstractNum w:abstractNumId="5" w15:restartNumberingAfterBreak="0">
+    <w:nsid w:val="25765944"/>
+    <w:multiLevelType w:val="multilevel"/>
+    <w:tmpl w:val="B9D6D4F0"/>
+    <w:lvl w:ilvl="0">
+      <w:start w:val="1"/>
+      <w:numFmt w:val="bullet"/>
+      <w:lvlText w:val=""/>
+      <w:lvlJc w:val="left"/>
+      <w:pPr>
+        <w:tabs>
+          <w:tab w:val="num" w:pos="720"/>
+        </w:tabs>
+        <w:ind w:left="720" w:hanging="360"/>
+      </w:pPr>
+      <w:rPr>
+        <w:rFonts w:ascii="Symbol" w:hAnsi="Symbol" w:hint="default"/>
+        <w:sz w:val="20"/>
+      </w:rPr>
+    </w:lvl>
+    <w:lvl w:ilvl="1" w:tentative="1">
+      <w:start w:val="1"/>
+      <w:numFmt w:val="bullet"/>
+      <w:lvlText w:val="o"/>
+      <w:lvlJc w:val="left"/>
+      <w:pPr>
+        <w:tabs>
+          <w:tab w:val="num" w:pos="1440"/>
+        </w:tabs>
+        <w:ind w:left="1440" w:hanging="360"/>
+      </w:pPr>
+      <w:rPr>
+        <w:rFonts w:ascii="Courier New" w:hAnsi="Courier New" w:hint="default"/>
+        <w:sz w:val="20"/>
+      </w:rPr>
+    </w:lvl>
+    <w:lvl w:ilvl="2" w:tentative="1">
+      <w:start w:val="1"/>
+      <w:numFmt w:val="bullet"/>
+      <w:lvlText w:val=""/>
+      <w:lvlJc w:val="left"/>
+      <w:pPr>
+        <w:tabs>
+          <w:tab w:val="num" w:pos="2160"/>
+        </w:tabs>
+        <w:ind w:left="2160" w:hanging="360"/>
+      </w:pPr>
+      <w:rPr>
+        <w:rFonts w:ascii="Wingdings" w:hAnsi="Wingdings" w:hint="default"/>
+        <w:sz w:val="20"/>
+      </w:rPr>
+    </w:lvl>
+    <w:lvl w:ilvl="3" w:tentative="1">
+      <w:start w:val="1"/>
+      <w:numFmt w:val="bullet"/>
+      <w:lvlText w:val=""/>
+      <w:lvlJc w:val="left"/>
+      <w:pPr>
+        <w:tabs>
+          <w:tab w:val="num" w:pos="2880"/>
+        </w:tabs>
+        <w:ind w:left="2880" w:hanging="360"/>
+      </w:pPr>
+      <w:rPr>
+        <w:rFonts w:ascii="Wingdings" w:hAnsi="Wingdings" w:hint="default"/>
+        <w:sz w:val="20"/>
+      </w:rPr>
+    </w:lvl>
+    <w:lvl w:ilvl="4" w:tentative="1">
+      <w:start w:val="1"/>
+      <w:numFmt w:val="bullet"/>
+      <w:lvlText w:val=""/>
+      <w:lvlJc w:val="left"/>
+      <w:pPr>
+        <w:tabs>
+          <w:tab w:val="num" w:pos="3600"/>
+        </w:tabs>
+        <w:ind w:left="3600" w:hanging="360"/>
+      </w:pPr>
+      <w:rPr>
+        <w:rFonts w:ascii="Wingdings" w:hAnsi="Wingdings" w:hint="default"/>
+        <w:sz w:val="20"/>
+      </w:rPr>
+    </w:lvl>
+    <w:lvl w:ilvl="5" w:tentative="1">
+      <w:start w:val="1"/>
+      <w:numFmt w:val="bullet"/>
+      <w:lvlText w:val=""/>
+      <w:lvlJc w:val="left"/>
+      <w:pPr>
+        <w:tabs>
+          <w:tab w:val="num" w:pos="4320"/>
+        </w:tabs>
+        <w:ind w:left="4320" w:hanging="360"/>
+      </w:pPr>
+      <w:rPr>
+        <w:rFonts w:ascii="Wingdings" w:hAnsi="Wingdings" w:hint="default"/>
+        <w:sz w:val="20"/>
+      </w:rPr>
+    </w:lvl>
+    <w:lvl w:ilvl="6" w:tentative="1">
+      <w:start w:val="1"/>
+      <w:numFmt w:val="bullet"/>
+      <w:lvlText w:val=""/>
+      <w:lvlJc w:val="left"/>
+      <w:pPr>
+        <w:tabs>
+          <w:tab w:val="num" w:pos="5040"/>
+        </w:tabs>
+        <w:ind w:left="5040" w:hanging="360"/>
+      </w:pPr>
+      <w:rPr>
+        <w:rFonts w:ascii="Wingdings" w:hAnsi="Wingdings" w:hint="default"/>
+        <w:sz w:val="20"/>
+      </w:rPr>
+    </w:lvl>
+    <w:lvl w:ilvl="7" w:tentative="1">
+      <w:start w:val="1"/>
+      <w:numFmt w:val="bullet"/>
+      <w:lvlText w:val=""/>
+      <w:lvlJc w:val="left"/>
+      <w:pPr>
+        <w:tabs>
+          <w:tab w:val="num" w:pos="5760"/>
+        </w:tabs>
+        <w:ind w:left="5760" w:hanging="360"/>
+      </w:pPr>
+      <w:rPr>
+        <w:rFonts w:ascii="Wingdings" w:hAnsi="Wingdings" w:hint="default"/>
+        <w:sz w:val="20"/>
+      </w:rPr>
+    </w:lvl>
+    <w:lvl w:ilvl="8" w:tentative="1">
+      <w:start w:val="1"/>
+      <w:numFmt w:val="bullet"/>
+      <w:lvlText w:val=""/>
+      <w:lvlJc w:val="left"/>
+      <w:pPr>
+        <w:tabs>
+          <w:tab w:val="num" w:pos="6480"/>
+        </w:tabs>
+        <w:ind w:left="6480" w:hanging="360"/>
+      </w:pPr>
+      <w:rPr>
+        <w:rFonts w:ascii="Wingdings" w:hAnsi="Wingdings" w:hint="default"/>
+        <w:sz w:val="20"/>
+      </w:rPr>
+    </w:lvl>
+  </w:abstractNum>
+  <w:abstractNum w:abstractNumId="6" w15:restartNumberingAfterBreak="0">
     <w:nsid w:val="2A0A09A8"/>
     <w:multiLevelType w:val="multilevel"/>
     <w:tmpl w:val="50924DDE"/>
@@ -18573,7 +22505,7 @@
       </w:rPr>
     </w:lvl>
   </w:abstractNum>
-  <w:abstractNum w:abstractNumId="5" w15:restartNumberingAfterBreak="0">
+  <w:abstractNum w:abstractNumId="7" w15:restartNumberingAfterBreak="0">
     <w:nsid w:val="347A66C0"/>
     <w:multiLevelType w:val="multilevel"/>
     <w:tmpl w:val="4BA21956"/>
@@ -18722,7 +22654,7 @@
       </w:rPr>
     </w:lvl>
   </w:abstractNum>
-  <w:abstractNum w:abstractNumId="6" w15:restartNumberingAfterBreak="0">
+  <w:abstractNum w:abstractNumId="8" w15:restartNumberingAfterBreak="0">
     <w:nsid w:val="3B27010B"/>
     <w:multiLevelType w:val="multilevel"/>
     <w:tmpl w:val="47FA9F8A"/>
@@ -18871,7 +22803,7 @@
       </w:rPr>
     </w:lvl>
   </w:abstractNum>
-  <w:abstractNum w:abstractNumId="7" w15:restartNumberingAfterBreak="0">
+  <w:abstractNum w:abstractNumId="9" w15:restartNumberingAfterBreak="0">
     <w:nsid w:val="3E173433"/>
     <w:multiLevelType w:val="multilevel"/>
     <w:tmpl w:val="76D2CA84"/>
@@ -18988,7 +22920,7 @@
       </w:pPr>
     </w:lvl>
   </w:abstractNum>
-  <w:abstractNum w:abstractNumId="8" w15:restartNumberingAfterBreak="0">
+  <w:abstractNum w:abstractNumId="10" w15:restartNumberingAfterBreak="0">
     <w:nsid w:val="45700F0C"/>
     <w:multiLevelType w:val="multilevel"/>
     <w:tmpl w:val="E2403504"/>
@@ -19137,7 +23069,7 @@
       </w:rPr>
     </w:lvl>
   </w:abstractNum>
-  <w:abstractNum w:abstractNumId="9" w15:restartNumberingAfterBreak="0">
+  <w:abstractNum w:abstractNumId="11" w15:restartNumberingAfterBreak="0">
     <w:nsid w:val="4A97410E"/>
     <w:multiLevelType w:val="multilevel"/>
     <w:tmpl w:val="CF323B60"/>
@@ -19286,7 +23218,7 @@
       </w:rPr>
     </w:lvl>
   </w:abstractNum>
-  <w:abstractNum w:abstractNumId="10" w15:restartNumberingAfterBreak="0">
+  <w:abstractNum w:abstractNumId="12" w15:restartNumberingAfterBreak="0">
     <w:nsid w:val="4D0A37E6"/>
     <w:multiLevelType w:val="multilevel"/>
     <w:tmpl w:val="3F38DB6E"/>
@@ -19435,7 +23367,7 @@
       </w:rPr>
     </w:lvl>
   </w:abstractNum>
-  <w:abstractNum w:abstractNumId="11" w15:restartNumberingAfterBreak="0">
+  <w:abstractNum w:abstractNumId="13" w15:restartNumberingAfterBreak="0">
     <w:nsid w:val="5F4A5903"/>
     <w:multiLevelType w:val="multilevel"/>
     <w:tmpl w:val="1E702500"/>
@@ -19552,7 +23484,7 @@
       </w:pPr>
     </w:lvl>
   </w:abstractNum>
-  <w:abstractNum w:abstractNumId="12" w15:restartNumberingAfterBreak="0">
+  <w:abstractNum w:abstractNumId="14" w15:restartNumberingAfterBreak="0">
     <w:nsid w:val="61955EB7"/>
     <w:multiLevelType w:val="multilevel"/>
     <w:tmpl w:val="CBF8620E"/>
@@ -19701,7 +23633,7 @@
       </w:rPr>
     </w:lvl>
   </w:abstractNum>
-  <w:abstractNum w:abstractNumId="13" w15:restartNumberingAfterBreak="0">
+  <w:abstractNum w:abstractNumId="15" w15:restartNumberingAfterBreak="0">
     <w:nsid w:val="62163C94"/>
     <w:multiLevelType w:val="multilevel"/>
     <w:tmpl w:val="783E617E"/>
@@ -19850,7 +23782,7 @@
       </w:rPr>
     </w:lvl>
   </w:abstractNum>
-  <w:abstractNum w:abstractNumId="14" w15:restartNumberingAfterBreak="0">
+  <w:abstractNum w:abstractNumId="16" w15:restartNumberingAfterBreak="0">
     <w:nsid w:val="7513272B"/>
     <w:multiLevelType w:val="multilevel"/>
     <w:tmpl w:val="94924CB8"/>
@@ -19999,7 +23931,7 @@
       </w:rPr>
     </w:lvl>
   </w:abstractNum>
-  <w:abstractNum w:abstractNumId="15" w15:restartNumberingAfterBreak="0">
+  <w:abstractNum w:abstractNumId="17" w15:restartNumberingAfterBreak="0">
     <w:nsid w:val="76CD6929"/>
     <w:multiLevelType w:val="multilevel"/>
     <w:tmpl w:val="41329A5A"/>
@@ -20148,53 +24080,211 @@
       </w:rPr>
     </w:lvl>
   </w:abstractNum>
+  <w:abstractNum w:abstractNumId="18" w15:restartNumberingAfterBreak="0">
+    <w:nsid w:val="7EFF62BB"/>
+    <w:multiLevelType w:val="multilevel"/>
+    <w:tmpl w:val="FCBA3A00"/>
+    <w:lvl w:ilvl="0">
+      <w:start w:val="1"/>
+      <w:numFmt w:val="bullet"/>
+      <w:lvlText w:val=""/>
+      <w:lvlJc w:val="left"/>
+      <w:pPr>
+        <w:tabs>
+          <w:tab w:val="num" w:pos="720"/>
+        </w:tabs>
+        <w:ind w:left="720" w:hanging="360"/>
+      </w:pPr>
+      <w:rPr>
+        <w:rFonts w:ascii="Symbol" w:hAnsi="Symbol" w:hint="default"/>
+        <w:sz w:val="20"/>
+      </w:rPr>
+    </w:lvl>
+    <w:lvl w:ilvl="1">
+      <w:start w:val="1"/>
+      <w:numFmt w:val="bullet"/>
+      <w:lvlText w:val="o"/>
+      <w:lvlJc w:val="left"/>
+      <w:pPr>
+        <w:tabs>
+          <w:tab w:val="num" w:pos="1440"/>
+        </w:tabs>
+        <w:ind w:left="1440" w:hanging="360"/>
+      </w:pPr>
+      <w:rPr>
+        <w:rFonts w:ascii="Courier New" w:hAnsi="Courier New" w:hint="default"/>
+        <w:sz w:val="20"/>
+      </w:rPr>
+    </w:lvl>
+    <w:lvl w:ilvl="2" w:tentative="1">
+      <w:start w:val="1"/>
+      <w:numFmt w:val="bullet"/>
+      <w:lvlText w:val=""/>
+      <w:lvlJc w:val="left"/>
+      <w:pPr>
+        <w:tabs>
+          <w:tab w:val="num" w:pos="2160"/>
+        </w:tabs>
+        <w:ind w:left="2160" w:hanging="360"/>
+      </w:pPr>
+      <w:rPr>
+        <w:rFonts w:ascii="Wingdings" w:hAnsi="Wingdings" w:hint="default"/>
+        <w:sz w:val="20"/>
+      </w:rPr>
+    </w:lvl>
+    <w:lvl w:ilvl="3" w:tentative="1">
+      <w:start w:val="1"/>
+      <w:numFmt w:val="bullet"/>
+      <w:lvlText w:val=""/>
+      <w:lvlJc w:val="left"/>
+      <w:pPr>
+        <w:tabs>
+          <w:tab w:val="num" w:pos="2880"/>
+        </w:tabs>
+        <w:ind w:left="2880" w:hanging="360"/>
+      </w:pPr>
+      <w:rPr>
+        <w:rFonts w:ascii="Wingdings" w:hAnsi="Wingdings" w:hint="default"/>
+        <w:sz w:val="20"/>
+      </w:rPr>
+    </w:lvl>
+    <w:lvl w:ilvl="4" w:tentative="1">
+      <w:start w:val="1"/>
+      <w:numFmt w:val="bullet"/>
+      <w:lvlText w:val=""/>
+      <w:lvlJc w:val="left"/>
+      <w:pPr>
+        <w:tabs>
+          <w:tab w:val="num" w:pos="3600"/>
+        </w:tabs>
+        <w:ind w:left="3600" w:hanging="360"/>
+      </w:pPr>
+      <w:rPr>
+        <w:rFonts w:ascii="Wingdings" w:hAnsi="Wingdings" w:hint="default"/>
+        <w:sz w:val="20"/>
+      </w:rPr>
+    </w:lvl>
+    <w:lvl w:ilvl="5" w:tentative="1">
+      <w:start w:val="1"/>
+      <w:numFmt w:val="bullet"/>
+      <w:lvlText w:val=""/>
+      <w:lvlJc w:val="left"/>
+      <w:pPr>
+        <w:tabs>
+          <w:tab w:val="num" w:pos="4320"/>
+        </w:tabs>
+        <w:ind w:left="4320" w:hanging="360"/>
+      </w:pPr>
+      <w:rPr>
+        <w:rFonts w:ascii="Wingdings" w:hAnsi="Wingdings" w:hint="default"/>
+        <w:sz w:val="20"/>
+      </w:rPr>
+    </w:lvl>
+    <w:lvl w:ilvl="6" w:tentative="1">
+      <w:start w:val="1"/>
+      <w:numFmt w:val="bullet"/>
+      <w:lvlText w:val=""/>
+      <w:lvlJc w:val="left"/>
+      <w:pPr>
+        <w:tabs>
+          <w:tab w:val="num" w:pos="5040"/>
+        </w:tabs>
+        <w:ind w:left="5040" w:hanging="360"/>
+      </w:pPr>
+      <w:rPr>
+        <w:rFonts w:ascii="Wingdings" w:hAnsi="Wingdings" w:hint="default"/>
+        <w:sz w:val="20"/>
+      </w:rPr>
+    </w:lvl>
+    <w:lvl w:ilvl="7" w:tentative="1">
+      <w:start w:val="1"/>
+      <w:numFmt w:val="bullet"/>
+      <w:lvlText w:val=""/>
+      <w:lvlJc w:val="left"/>
+      <w:pPr>
+        <w:tabs>
+          <w:tab w:val="num" w:pos="5760"/>
+        </w:tabs>
+        <w:ind w:left="5760" w:hanging="360"/>
+      </w:pPr>
+      <w:rPr>
+        <w:rFonts w:ascii="Wingdings" w:hAnsi="Wingdings" w:hint="default"/>
+        <w:sz w:val="20"/>
+      </w:rPr>
+    </w:lvl>
+    <w:lvl w:ilvl="8" w:tentative="1">
+      <w:start w:val="1"/>
+      <w:numFmt w:val="bullet"/>
+      <w:lvlText w:val=""/>
+      <w:lvlJc w:val="left"/>
+      <w:pPr>
+        <w:tabs>
+          <w:tab w:val="num" w:pos="6480"/>
+        </w:tabs>
+        <w:ind w:left="6480" w:hanging="360"/>
+      </w:pPr>
+      <w:rPr>
+        <w:rFonts w:ascii="Wingdings" w:hAnsi="Wingdings" w:hint="default"/>
+        <w:sz w:val="20"/>
+      </w:rPr>
+    </w:lvl>
+  </w:abstractNum>
   <w:num w:numId="1">
+    <w:abstractNumId w:val="11"/>
+  </w:num>
+  <w:num w:numId="2">
+    <w:abstractNumId w:val="5"/>
+  </w:num>
+  <w:num w:numId="3">
     <w:abstractNumId w:val="9"/>
   </w:num>
-  <w:num w:numId="2">
+  <w:num w:numId="4">
+    <w:abstractNumId w:val="7"/>
+  </w:num>
+  <w:num w:numId="5">
+    <w:abstractNumId w:val="2"/>
+  </w:num>
+  <w:num w:numId="6">
+    <w:abstractNumId w:val="8"/>
+  </w:num>
+  <w:num w:numId="7">
     <w:abstractNumId w:val="3"/>
   </w:num>
-  <w:num w:numId="3">
-    <w:abstractNumId w:val="7"/>
+  <w:num w:numId="8">
+    <w:abstractNumId w:val="12"/>
   </w:num>
-  <w:num w:numId="4">
-    <w:abstractNumId w:val="5"/>
+  <w:num w:numId="9">
+    <w:abstractNumId w:val="13"/>
   </w:num>
-  <w:num w:numId="5">
+  <w:num w:numId="10">
+    <w:abstractNumId w:val="16"/>
+  </w:num>
+  <w:num w:numId="11">
+    <w:abstractNumId w:val="17"/>
+  </w:num>
+  <w:num w:numId="12">
+    <w:abstractNumId w:val="15"/>
+  </w:num>
+  <w:num w:numId="13">
+    <w:abstractNumId w:val="6"/>
+  </w:num>
+  <w:num w:numId="14">
+    <w:abstractNumId w:val="14"/>
+  </w:num>
+  <w:num w:numId="15">
     <w:abstractNumId w:val="1"/>
   </w:num>
-  <w:num w:numId="6">
-    <w:abstractNumId w:val="6"/>
-  </w:num>
-  <w:num w:numId="7">
-    <w:abstractNumId w:val="2"/>
-  </w:num>
-  <w:num w:numId="8">
+  <w:num w:numId="16">
     <w:abstractNumId w:val="10"/>
   </w:num>
-  <w:num w:numId="9">
-    <w:abstractNumId w:val="11"/>
-  </w:num>
-  <w:num w:numId="10">
-    <w:abstractNumId w:val="14"/>
-  </w:num>
-  <w:num w:numId="11">
-    <w:abstractNumId w:val="15"/>
-  </w:num>
-  <w:num w:numId="12">
-    <w:abstractNumId w:val="13"/>
-  </w:num>
-  <w:num w:numId="13">
+  <w:num w:numId="17">
     <w:abstractNumId w:val="4"/>
   </w:num>
-  <w:num w:numId="14">
-    <w:abstractNumId w:val="12"/>
-  </w:num>
-  <w:num w:numId="15">
+  <w:num w:numId="18">
     <w:abstractNumId w:val="0"/>
   </w:num>
-  <w:num w:numId="16">
-    <w:abstractNumId w:val="8"/>
+  <w:num w:numId="19">
+    <w:abstractNumId w:val="18"/>
   </w:num>
 </w:numbering>
 </file>

</xml_diff>